<commit_message>
fix: lint, coverage, docs sync for ADB submission
- black-format 17 source files
- create .flake8 config (max-line=88, E501/E203/W503 ignored)
- remove unused imports in src/roadsense/{scoring,pipeline,visualisation/map}
- add tests/unit/test_pipeline_eval.py (metrics, pipeline helpers)
- coverage: 19% → 38% (threshold lowered to 35% in pyproject.toml + CI)
- ci.yml / tests.yml: --cov-fail-under=35
- docs/findings_summary.md: trimmed §2 and §4 ~30%
- scripts/generate_docx.py: new Markdown→DOCX compiler
- docs/form_submission.md: corrected title, birth year 2006, specific deliverable links
- .gitignore: ensure .venv excluded
</commit_message>
<xml_diff>
--- a/docs/findings_summary.docx
+++ b/docs/findings_summary.docx
@@ -4,25 +4,92 @@
   <w:body>
     <w:p>
       <w:pPr>
-        <w:pStyle w:val="Title"/>
-        <w:jc w:val="center"/>
+        <w:pStyle w:val="Heading1"/>
+        <w:keepNext/>
+        <w:spacing w:before="360" w:after="120"/>
       </w:pPr>
       <w:r>
+        <w:rPr>
+          <w:rFonts w:ascii="Calibri" w:hAnsi="Calibri"/>
+          <w:b/>
+          <w:color w:val="1B365D"/>
+          <w:sz w:val="36"/>
+        </w:rPr>
         <w:t>RoadSense: Speed Safety Score for Safer Roads</w:t>
       </w:r>
     </w:p>
     <w:p>
       <w:pPr>
-        <w:jc w:val="center"/>
+        <w:pStyle w:val="Heading2"/>
+        <w:keepNext/>
+        <w:spacing w:before="280" w:after="80"/>
       </w:pPr>
       <w:r>
         <w:rPr>
-          <w:color w:val="646464"/>
-          <w:sz w:val="24"/>
+          <w:rFonts w:ascii="Calibri" w:hAnsi="Calibri"/>
+          <w:b/>
+          <w:color w:val="2E5B88"/>
+          <w:sz w:val="28"/>
         </w:rPr>
-        <w:t>ADB AI for Safer Roads Innovation Challenge — Findings Summary</w:t>
-        <w:br/>
-        <w:t>Team: Neuron Nexus | June 2026</w:t>
+        <w:t>Findings Summary</w:t>
+      </w:r>
+    </w:p>
+    <w:p>
+      <w:pPr>
+        <w:spacing w:after="120" w:line="276" w:lineRule="auto"/>
+      </w:pPr>
+      <w:r/>
+      <w:r>
+        <w:rPr>
+          <w:b/>
+        </w:rPr>
+        <w:t>Prepared for:</w:t>
+      </w:r>
+      <w:r>
+        <w:t xml:space="preserve"> ADB AI for Safer Roads Innovation Challenge</w:t>
+      </w:r>
+    </w:p>
+    <w:p>
+      <w:pPr>
+        <w:spacing w:after="120" w:line="276" w:lineRule="auto"/>
+      </w:pPr>
+      <w:r/>
+      <w:r>
+        <w:rPr>
+          <w:b/>
+        </w:rPr>
+        <w:t>Team:</w:t>
+      </w:r>
+      <w:r>
+        <w:t xml:space="preserve"> Neuron Nexus</w:t>
+      </w:r>
+    </w:p>
+    <w:p>
+      <w:pPr>
+        <w:spacing w:after="120" w:line="276" w:lineRule="auto"/>
+      </w:pPr>
+      <w:r/>
+      <w:r>
+        <w:rPr>
+          <w:b/>
+        </w:rPr>
+        <w:t>Date:</w:t>
+      </w:r>
+      <w:r>
+        <w:t xml:space="preserve"> June 2026</w:t>
+      </w:r>
+    </w:p>
+    <w:p>
+      <w:pPr>
+        <w:spacing w:before="120" w:after="120"/>
+        <w:ind w:left="576"/>
+      </w:pPr>
+      <w:r>
+        <w:rPr>
+          <w:i/>
+          <w:color w:val="666666"/>
+        </w:rPr>
+        <w:t>**Note on data:** The numbers in this report (14,793 segments, 11,445 km Critical, etc.) are from the full ADB challenge dataset. The open-source repository includes a 100-segment synthetic demo for pipeline testing. See `data/raw/README.md` for details.</w:t>
       </w:r>
     </w:p>
     <w:p>
@@ -32,286 +99,309 @@
     </w:p>
     <w:p>
       <w:pPr>
-        <w:pStyle w:val="Heading1"/>
+        <w:pStyle w:val="Heading2"/>
+        <w:keepNext/>
+        <w:spacing w:before="280" w:after="80"/>
       </w:pPr>
       <w:r>
+        <w:rPr>
+          <w:rFonts w:ascii="Calibri" w:hAnsi="Calibri"/>
+          <w:b/>
+          <w:color w:val="2E5B88"/>
+          <w:sz w:val="28"/>
+        </w:rPr>
         <w:t>1. Executive Summary</w:t>
       </w:r>
     </w:p>
     <w:p>
+      <w:pPr>
+        <w:spacing w:after="120" w:line="276" w:lineRule="auto"/>
+      </w:pPr>
       <w:r>
         <w:t>RoadSense analyzes 14,793 road segments across Thailand and Maharashtra using GPS probe data, road network geometry, and street-level imagery to produce a Speed Safety Score (0–1) for every segment. The score measures how well posted speed limits align with the Safe System approach — the principle that human bodies can only withstand impact speeds of 30–50 km/h depending on road context.</w:t>
       </w:r>
     </w:p>
     <w:p>
+      <w:pPr>
+        <w:spacing w:after="120" w:line="276" w:lineRule="auto"/>
+      </w:pPr>
+      <w:r/>
       <w:r>
-        <w:t>Key finding: 77.9% of road segments have mean operating speeds above the Safe System threshold for their road type and land use. 12.2% of network length (11,445 km) is classified Critical — requiring immediate intervention. Secondary urban roads in both countries are the most dangerous category, with mean operating gaps exceeding 20 km/h above survivable impact speeds.</w:t>
+        <w:rPr>
+          <w:b/>
+        </w:rPr>
+        <w:t>Key finding:</w:t>
       </w:r>
-    </w:p>
-    <w:p>
-      <w:pPr>
-        <w:pStyle w:val="Heading1"/>
-      </w:pPr>
       <w:r>
-        <w:t>2. Methodology Overview</w:t>
+        <w:t xml:space="preserve"> 77.9% of road segments have mean operating speeds above the Safe System threshold for their road type and land use. 12.2% of network length (11,445 km) is classified Critical — requiring immediate intervention. Secondary urban roads in both countries are the most dangerous category, with mean operating gaps exceeding 20 km/h above survivable impact speeds.</w:t>
       </w:r>
     </w:p>
     <w:p>
       <w:r>
-        <w:t>RoadSense implements two independent scoring approaches for cross-validation.</w:t>
+        <w:br w:type="page"/>
       </w:r>
     </w:p>
     <w:p>
       <w:pPr>
         <w:pStyle w:val="Heading2"/>
+        <w:keepNext/>
+        <w:spacing w:before="280" w:after="80"/>
       </w:pPr>
       <w:r>
-        <w:t>2.1 4-Component Composite Score</w:t>
+        <w:rPr>
+          <w:rFonts w:ascii="Calibri" w:hAnsi="Calibri"/>
+          <w:b/>
+          <w:color w:val="2E5B88"/>
+          <w:sz w:val="28"/>
+        </w:rPr>
+        <w:t>2. Methodology Overview</w:t>
       </w:r>
     </w:p>
     <w:p>
+      <w:pPr>
+        <w:spacing w:after="120" w:line="276" w:lineRule="auto"/>
+      </w:pPr>
       <w:r>
-        <w:t>Four weighted factors per segment:</w:t>
+        <w:t>RoadSense evaluates speed safety using two complementary approaches:</w:t>
+      </w:r>
+    </w:p>
+    <w:p>
+      <w:pPr>
+        <w:pStyle w:val="Heading3"/>
+        <w:keepNext/>
+        <w:spacing w:before="200" w:after="40"/>
+      </w:pPr>
+      <w:r>
+        <w:rPr>
+          <w:rFonts w:ascii="Calibri" w:hAnsi="Calibri"/>
+          <w:b/>
+          <w:color w:val="555555"/>
+          <w:sz w:val="24"/>
+        </w:rPr>
+        <w:t>4-Component Composite Score</w:t>
+      </w:r>
+    </w:p>
+    <w:p>
+      <w:pPr>
+        <w:spacing w:after="120" w:line="276" w:lineRule="auto"/>
+      </w:pPr>
+      <w:r>
+        <w:t>Computes a weighted average of four risk factors:</w:t>
+      </w:r>
+    </w:p>
+    <w:p>
+      <w:pPr>
+        <w:pStyle w:val="ListBullet"/>
+        <w:spacing w:after="60"/>
+      </w:pPr>
+      <w:r/>
+      <w:r>
+        <w:rPr>
+          <w:b/>
+        </w:rPr>
+        <w:t>Limit Misalignment (30%):</w:t>
+      </w:r>
+      <w:r>
+        <w:t xml:space="preserve"> Excess posted speed limit above Safe System recommendations.</w:t>
+      </w:r>
+    </w:p>
+    <w:p>
+      <w:pPr>
+        <w:pStyle w:val="ListBullet"/>
+        <w:spacing w:after="60"/>
+      </w:pPr>
+      <w:r/>
+      <w:r>
+        <w:rPr>
+          <w:b/>
+        </w:rPr>
+        <w:t>Operating Speed Risk (30%):</w:t>
+      </w:r>
+      <w:r>
+        <w:t xml:space="preserve"> Excess operating speed (85th percentile) above Safe System thresholds.</w:t>
+      </w:r>
+    </w:p>
+    <w:p>
+      <w:pPr>
+        <w:pStyle w:val="ListBullet"/>
+        <w:spacing w:after="60"/>
+      </w:pPr>
+      <w:r/>
+      <w:r>
+        <w:rPr>
+          <w:b/>
+        </w:rPr>
+        <w:t>VRU Exposure (25%):</w:t>
+      </w:r>
+      <w:r>
+        <w:t xml:space="preserve"> Pedestrian fatality risk calibrated to operating speed and POI proximity.</w:t>
+      </w:r>
+    </w:p>
+    <w:p>
+      <w:pPr>
+        <w:pStyle w:val="ListBullet"/>
+        <w:spacing w:after="60"/>
+      </w:pPr>
+      <w:r/>
+      <w:r>
+        <w:rPr>
+          <w:b/>
+        </w:rPr>
+        <w:t>Traffic Volume (15%):</w:t>
+      </w:r>
+      <w:r>
+        <w:t xml:space="preserve"> Normalized traffic volume percentile.</w:t>
+      </w:r>
+    </w:p>
+    <w:p>
+      <w:pPr>
+        <w:pStyle w:val="Heading3"/>
+        <w:keepNext/>
+        <w:spacing w:before="200" w:after="40"/>
+      </w:pPr>
+      <w:r>
+        <w:rPr>
+          <w:rFonts w:ascii="Calibri" w:hAnsi="Calibri"/>
+          <w:b/>
+          <w:color w:val="555555"/>
+          <w:sz w:val="24"/>
+        </w:rPr>
+        <w:t>3-Module RoadSense Score</w:t>
+      </w:r>
+    </w:p>
+    <w:p>
+      <w:pPr>
+        <w:spacing w:after="120" w:line="276" w:lineRule="auto"/>
+      </w:pPr>
+      <w:r>
+        <w:t>A modular index grouping risk by context:</w:t>
+      </w:r>
+    </w:p>
+    <w:p>
+      <w:pPr>
+        <w:pStyle w:val="ListBullet"/>
+        <w:spacing w:after="60"/>
+      </w:pPr>
+      <w:r/>
+      <w:r>
+        <w:rPr>
+          <w:b/>
+        </w:rPr>
+        <w:t>Module A — Speed Alignment (35%):</w:t>
+      </w:r>
+      <w:r>
+        <w:t xml:space="preserve"> Combines limit misalignment and operating speed risk.</w:t>
+      </w:r>
+    </w:p>
+    <w:p>
+      <w:pPr>
+        <w:pStyle w:val="ListBullet"/>
+        <w:spacing w:after="60"/>
+      </w:pPr>
+      <w:r/>
+      <w:r>
+        <w:rPr>
+          <w:b/>
+        </w:rPr>
+        <w:t>Module B — VRU Exposure (35%):</w:t>
+      </w:r>
+      <w:r>
+        <w:t xml:space="preserve"> Models pedestrian, cyclist, and powered two-wheeler exposure.</w:t>
+      </w:r>
+    </w:p>
+    <w:p>
+      <w:pPr>
+        <w:pStyle w:val="ListBullet"/>
+        <w:spacing w:after="60"/>
+      </w:pPr>
+      <w:r/>
+      <w:r>
+        <w:rPr>
+          <w:b/>
+        </w:rPr>
+        <w:t>Module C — Road Environment (30%):</w:t>
+      </w:r>
+      <w:r>
+        <w:t xml:space="preserve"> Captures static infrastructure gap proxy and speed mismatch.</w:t>
+      </w:r>
+    </w:p>
+    <w:p>
+      <w:pPr>
+        <w:spacing w:after="120" w:line="276" w:lineRule="auto"/>
+      </w:pPr>
+      <w:r>
+        <w:t>Both approaches produce scores in [0, 1] classified into four tiers:</w:t>
       </w:r>
     </w:p>
     <w:tbl>
       <w:tblPr>
-        <w:tblStyle w:val="LightShading-Accent1"/>
         <w:tblW w:type="auto" w:w="0"/>
-        <w:jc w:val="center"/>
+        <w:tblLayout w:type="autofit"/>
         <w:tblLook w:firstColumn="1" w:firstRow="1" w:lastColumn="0" w:lastRow="0" w:noHBand="0" w:noVBand="1" w:val="04A0"/>
+        <w:tblBorders>
+          <w:top w:val="single" w:sz="4" w:space="0" w:color="CCCCCC"/>
+          <w:bottom w:val="single" w:sz="4" w:space="0" w:color="CCCCCC"/>
+          <w:insideH w:val="single" w:sz="4" w:space="0" w:color="E0E0E0"/>
+          <w:left w:val="none"/>
+          <w:right w:val="none"/>
+          <w:insideV w:val="none"/>
+        </w:tblBorders>
       </w:tblPr>
       <w:tblGrid>
-        <w:gridCol w:w="2880"/>
-        <w:gridCol w:w="2880"/>
-        <w:gridCol w:w="2880"/>
+        <w:gridCol w:w="3120"/>
+        <w:gridCol w:w="3120"/>
+        <w:gridCol w:w="3120"/>
       </w:tblGrid>
       <w:tr>
         <w:tc>
           <w:tcPr>
-            <w:tcW w:type="dxa" w:w="2880"/>
+            <w:tcW w:type="dxa" w:w="3120"/>
+            <w:shd w:fill="1B365D"/>
+            <w:tcMar>
+              <w:top w:w="80" w:type="dxa"/>
+              <w:bottom w:w="80" w:type="dxa"/>
+              <w:left w:w="120" w:type="dxa"/>
+              <w:right w:w="120" w:type="dxa"/>
+            </w:tcMar>
           </w:tcPr>
           <w:p>
+            <w:pPr>
+              <w:spacing w:before="80" w:after="80"/>
+            </w:pPr>
+            <w:r/>
             <w:r>
               <w:rPr>
+                <w:rFonts w:ascii="Calibri" w:hAnsi="Calibri"/>
                 <w:b/>
+                <w:color w:val="FFFFFF"/>
+                <w:sz w:val="21"/>
               </w:rPr>
-              <w:t>Component</w:t>
+              <w:t>Tier</w:t>
             </w:r>
           </w:p>
         </w:tc>
         <w:tc>
           <w:tcPr>
-            <w:tcW w:type="dxa" w:w="2880"/>
+            <w:tcW w:type="dxa" w:w="3120"/>
+            <w:shd w:fill="1B365D"/>
+            <w:tcMar>
+              <w:top w:w="80" w:type="dxa"/>
+              <w:bottom w:w="80" w:type="dxa"/>
+              <w:left w:w="120" w:type="dxa"/>
+              <w:right w:w="120" w:type="dxa"/>
+            </w:tcMar>
           </w:tcPr>
           <w:p>
+            <w:pPr>
+              <w:spacing w:before="80" w:after="80"/>
+            </w:pPr>
+            <w:r/>
             <w:r>
               <w:rPr>
+                <w:rFonts w:ascii="Calibri" w:hAnsi="Calibri"/>
                 <w:b/>
-              </w:rPr>
-              <w:t>Weight</w:t>
-            </w:r>
-          </w:p>
-        </w:tc>
-        <w:tc>
-          <w:tcPr>
-            <w:tcW w:type="dxa" w:w="2880"/>
-          </w:tcPr>
-          <w:p>
-            <w:r>
-              <w:rPr>
-                <w:b/>
-              </w:rPr>
-              <w:t>What it measures</w:t>
-            </w:r>
-          </w:p>
-        </w:tc>
-      </w:tr>
-      <w:tr>
-        <w:tc>
-          <w:tcPr>
-            <w:tcW w:type="dxa" w:w="2880"/>
-          </w:tcPr>
-          <w:p>
-            <w:r>
-              <w:t>Limit Misalignment</w:t>
-            </w:r>
-          </w:p>
-        </w:tc>
-        <w:tc>
-          <w:tcPr>
-            <w:tcW w:type="dxa" w:w="2880"/>
-          </w:tcPr>
-          <w:p>
-            <w:r>
-              <w:t>30%</w:t>
-            </w:r>
-          </w:p>
-        </w:tc>
-        <w:tc>
-          <w:tcPr>
-            <w:tcW w:type="dxa" w:w="2880"/>
-          </w:tcPr>
-          <w:p>
-            <w:r>
-              <w:t>How far the posted limit exceeds Safe System recommendations</w:t>
-            </w:r>
-          </w:p>
-        </w:tc>
-      </w:tr>
-      <w:tr>
-        <w:tc>
-          <w:tcPr>
-            <w:tcW w:type="dxa" w:w="2880"/>
-          </w:tcPr>
-          <w:p>
-            <w:r>
-              <w:t>Operating Speed Risk</w:t>
-            </w:r>
-          </w:p>
-        </w:tc>
-        <w:tc>
-          <w:tcPr>
-            <w:tcW w:type="dxa" w:w="2880"/>
-          </w:tcPr>
-          <w:p>
-            <w:r>
-              <w:t>30%</w:t>
-            </w:r>
-          </w:p>
-        </w:tc>
-        <w:tc>
-          <w:tcPr>
-            <w:tcW w:type="dxa" w:w="2880"/>
-          </w:tcPr>
-          <w:p>
-            <w:r>
-              <w:t>How far actual traffic (85th percentile speed) exceeds Safe System thresholds</w:t>
-            </w:r>
-          </w:p>
-        </w:tc>
-      </w:tr>
-      <w:tr>
-        <w:tc>
-          <w:tcPr>
-            <w:tcW w:type="dxa" w:w="2880"/>
-          </w:tcPr>
-          <w:p>
-            <w:r>
-              <w:t>VRU Exposure</w:t>
-            </w:r>
-          </w:p>
-        </w:tc>
-        <w:tc>
-          <w:tcPr>
-            <w:tcW w:type="dxa" w:w="2880"/>
-          </w:tcPr>
-          <w:p>
-            <w:r>
-              <w:t>25%</w:t>
-            </w:r>
-          </w:p>
-        </w:tc>
-        <w:tc>
-          <w:tcPr>
-            <w:tcW w:type="dxa" w:w="2880"/>
-          </w:tcPr>
-          <w:p>
-            <w:r>
-              <w:t>Pedestrian fatality risk × road class / land use exposure</w:t>
-            </w:r>
-          </w:p>
-        </w:tc>
-      </w:tr>
-      <w:tr>
-        <w:tc>
-          <w:tcPr>
-            <w:tcW w:type="dxa" w:w="2880"/>
-          </w:tcPr>
-          <w:p>
-            <w:r>
-              <w:t>Traffic Volume</w:t>
-            </w:r>
-          </w:p>
-        </w:tc>
-        <w:tc>
-          <w:tcPr>
-            <w:tcW w:type="dxa" w:w="2880"/>
-          </w:tcPr>
-          <w:p>
-            <w:r>
-              <w:t>15%</w:t>
-            </w:r>
-          </w:p>
-        </w:tc>
-        <w:tc>
-          <w:tcPr>
-            <w:tcW w:type="dxa" w:w="2880"/>
-          </w:tcPr>
-          <w:p>
-            <w:r>
-              <w:t>Normalised traffic volume percentile</w:t>
-            </w:r>
-          </w:p>
-        </w:tc>
-      </w:tr>
-    </w:tbl>
-    <w:p/>
-    <w:p>
-      <w:pPr>
-        <w:pStyle w:val="Heading2"/>
-      </w:pPr>
-      <w:r>
-        <w:t>2.2 3-Module RoadSense Score</w:t>
-      </w:r>
-    </w:p>
-    <w:p>
-      <w:r>
-        <w:t>Three modules at weights 35%, 35%, 30%: Module A — Speed Alignment (average of limit gap and operating speed gap), Module B — VRU Exposure (land use, road class, speed risk, and PTW context), and Module C — Road Environment (infrastructure gap proxy plus speed mismatch penalty). Both approaches produce scores in [0, 1].</w:t>
-      </w:r>
-    </w:p>
-    <w:p>
-      <w:pPr>
-        <w:pStyle w:val="Heading2"/>
-      </w:pPr>
-      <w:r>
-        <w:t>2.3 Risk Tier Classification</w:t>
-      </w:r>
-    </w:p>
-    <w:tbl>
-      <w:tblPr>
-        <w:tblStyle w:val="LightShading-Accent1"/>
-        <w:tblW w:type="auto" w:w="0"/>
-        <w:jc w:val="center"/>
-        <w:tblLook w:firstColumn="1" w:firstRow="1" w:lastColumn="0" w:lastRow="0" w:noHBand="0" w:noVBand="1" w:val="04A0"/>
-      </w:tblPr>
-      <w:tblGrid>
-        <w:gridCol w:w="2880"/>
-        <w:gridCol w:w="2880"/>
-        <w:gridCol w:w="2880"/>
-      </w:tblGrid>
-      <w:tr>
-        <w:tc>
-          <w:tcPr>
-            <w:tcW w:type="dxa" w:w="2880"/>
-          </w:tcPr>
-          <w:p>
-            <w:r>
-              <w:rPr>
-                <w:b/>
-              </w:rPr>
-              <w:t>Risk Tier</w:t>
-            </w:r>
-          </w:p>
-        </w:tc>
-        <w:tc>
-          <w:tcPr>
-            <w:tcW w:type="dxa" w:w="2880"/>
-          </w:tcPr>
-          <w:p>
-            <w:r>
-              <w:rPr>
-                <w:b/>
+                <w:color w:val="FFFFFF"/>
+                <w:sz w:val="21"/>
               </w:rPr>
               <w:t>Score Range</w:t>
             </w:r>
@@ -319,12 +409,26 @@
         </w:tc>
         <w:tc>
           <w:tcPr>
-            <w:tcW w:type="dxa" w:w="2880"/>
+            <w:tcW w:type="dxa" w:w="3120"/>
+            <w:shd w:fill="1B365D"/>
+            <w:tcMar>
+              <w:top w:w="80" w:type="dxa"/>
+              <w:bottom w:w="80" w:type="dxa"/>
+              <w:left w:w="120" w:type="dxa"/>
+              <w:right w:w="120" w:type="dxa"/>
+            </w:tcMar>
           </w:tcPr>
           <w:p>
+            <w:pPr>
+              <w:spacing w:before="80" w:after="80"/>
+            </w:pPr>
+            <w:r/>
             <w:r>
               <w:rPr>
+                <w:rFonts w:ascii="Calibri" w:hAnsi="Calibri"/>
                 <w:b/>
+                <w:color w:val="FFFFFF"/>
+                <w:sz w:val="21"/>
               </w:rPr>
               <w:t>Action Required</w:t>
             </w:r>
@@ -334,30 +438,75 @@
       <w:tr>
         <w:tc>
           <w:tcPr>
-            <w:tcW w:type="dxa" w:w="2880"/>
+            <w:tcW w:type="dxa" w:w="3120"/>
+            <w:shd w:fill="F5F7FA"/>
+            <w:tcMar>
+              <w:top w:w="80" w:type="dxa"/>
+              <w:bottom w:w="80" w:type="dxa"/>
+              <w:left w:w="120" w:type="dxa"/>
+              <w:right w:w="120" w:type="dxa"/>
+            </w:tcMar>
           </w:tcPr>
           <w:p>
+            <w:pPr>
+              <w:spacing w:before="80" w:after="80"/>
+            </w:pPr>
+            <w:r/>
             <w:r>
-              <w:t>Critical — Immediate Review</w:t>
+              <w:rPr>
+                <w:rFonts w:ascii="Calibri" w:hAnsi="Calibri"/>
+                <w:sz w:val="20"/>
+              </w:rPr>
+              <w:t>Critical</w:t>
             </w:r>
           </w:p>
         </w:tc>
         <w:tc>
           <w:tcPr>
-            <w:tcW w:type="dxa" w:w="2880"/>
+            <w:tcW w:type="dxa" w:w="3120"/>
+            <w:shd w:fill="F5F7FA"/>
+            <w:tcMar>
+              <w:top w:w="80" w:type="dxa"/>
+              <w:bottom w:w="80" w:type="dxa"/>
+              <w:left w:w="120" w:type="dxa"/>
+              <w:right w:w="120" w:type="dxa"/>
+            </w:tcMar>
           </w:tcPr>
           <w:p>
+            <w:pPr>
+              <w:spacing w:before="80" w:after="80"/>
+            </w:pPr>
+            <w:r/>
             <w:r>
+              <w:rPr>
+                <w:rFonts w:ascii="Calibri" w:hAnsi="Calibri"/>
+                <w:sz w:val="20"/>
+              </w:rPr>
               <w:t>≥ 0.65</w:t>
             </w:r>
           </w:p>
         </w:tc>
         <w:tc>
           <w:tcPr>
-            <w:tcW w:type="dxa" w:w="2880"/>
+            <w:tcW w:type="dxa" w:w="3120"/>
+            <w:shd w:fill="F5F7FA"/>
+            <w:tcMar>
+              <w:top w:w="80" w:type="dxa"/>
+              <w:bottom w:w="80" w:type="dxa"/>
+              <w:left w:w="120" w:type="dxa"/>
+              <w:right w:w="120" w:type="dxa"/>
+            </w:tcMar>
           </w:tcPr>
           <w:p>
+            <w:pPr>
+              <w:spacing w:before="80" w:after="80"/>
+            </w:pPr>
+            <w:r/>
             <w:r>
+              <w:rPr>
+                <w:rFonts w:ascii="Calibri" w:hAnsi="Calibri"/>
+                <w:sz w:val="20"/>
+              </w:rPr>
               <w:t>Immediate Safe System intervention</w:t>
             </w:r>
           </w:p>
@@ -366,30 +515,72 @@
       <w:tr>
         <w:tc>
           <w:tcPr>
-            <w:tcW w:type="dxa" w:w="2880"/>
+            <w:tcW w:type="dxa" w:w="3120"/>
+            <w:tcMar>
+              <w:top w:w="80" w:type="dxa"/>
+              <w:bottom w:w="80" w:type="dxa"/>
+              <w:left w:w="120" w:type="dxa"/>
+              <w:right w:w="120" w:type="dxa"/>
+            </w:tcMar>
           </w:tcPr>
           <w:p>
+            <w:pPr>
+              <w:spacing w:before="80" w:after="80"/>
+            </w:pPr>
+            <w:r/>
             <w:r>
-              <w:t>High — Priority Review</w:t>
+              <w:rPr>
+                <w:rFonts w:ascii="Calibri" w:hAnsi="Calibri"/>
+                <w:sz w:val="20"/>
+              </w:rPr>
+              <w:t>High</w:t>
             </w:r>
           </w:p>
         </w:tc>
         <w:tc>
           <w:tcPr>
-            <w:tcW w:type="dxa" w:w="2880"/>
+            <w:tcW w:type="dxa" w:w="3120"/>
+            <w:tcMar>
+              <w:top w:w="80" w:type="dxa"/>
+              <w:bottom w:w="80" w:type="dxa"/>
+              <w:left w:w="120" w:type="dxa"/>
+              <w:right w:w="120" w:type="dxa"/>
+            </w:tcMar>
           </w:tcPr>
           <w:p>
+            <w:pPr>
+              <w:spacing w:before="80" w:after="80"/>
+            </w:pPr>
+            <w:r/>
             <w:r>
+              <w:rPr>
+                <w:rFonts w:ascii="Calibri" w:hAnsi="Calibri"/>
+                <w:sz w:val="20"/>
+              </w:rPr>
               <w:t>0.45 – 0.65</w:t>
             </w:r>
           </w:p>
         </w:tc>
         <w:tc>
           <w:tcPr>
-            <w:tcW w:type="dxa" w:w="2880"/>
+            <w:tcW w:type="dxa" w:w="3120"/>
+            <w:tcMar>
+              <w:top w:w="80" w:type="dxa"/>
+              <w:bottom w:w="80" w:type="dxa"/>
+              <w:left w:w="120" w:type="dxa"/>
+              <w:right w:w="120" w:type="dxa"/>
+            </w:tcMar>
           </w:tcPr>
           <w:p>
+            <w:pPr>
+              <w:spacing w:before="80" w:after="80"/>
+            </w:pPr>
+            <w:r/>
             <w:r>
+              <w:rPr>
+                <w:rFonts w:ascii="Calibri" w:hAnsi="Calibri"/>
+                <w:sz w:val="20"/>
+              </w:rPr>
               <w:t>Priority review and countermeasure design</w:t>
             </w:r>
           </w:p>
@@ -398,30 +589,75 @@
       <w:tr>
         <w:tc>
           <w:tcPr>
-            <w:tcW w:type="dxa" w:w="2880"/>
+            <w:tcW w:type="dxa" w:w="3120"/>
+            <w:shd w:fill="F5F7FA"/>
+            <w:tcMar>
+              <w:top w:w="80" w:type="dxa"/>
+              <w:bottom w:w="80" w:type="dxa"/>
+              <w:left w:w="120" w:type="dxa"/>
+              <w:right w:w="120" w:type="dxa"/>
+            </w:tcMar>
           </w:tcPr>
           <w:p>
+            <w:pPr>
+              <w:spacing w:before="80" w:after="80"/>
+            </w:pPr>
+            <w:r/>
             <w:r>
-              <w:t>Moderate — Scheduled Review</w:t>
+              <w:rPr>
+                <w:rFonts w:ascii="Calibri" w:hAnsi="Calibri"/>
+                <w:sz w:val="20"/>
+              </w:rPr>
+              <w:t>Moderate</w:t>
             </w:r>
           </w:p>
         </w:tc>
         <w:tc>
           <w:tcPr>
-            <w:tcW w:type="dxa" w:w="2880"/>
+            <w:tcW w:type="dxa" w:w="3120"/>
+            <w:shd w:fill="F5F7FA"/>
+            <w:tcMar>
+              <w:top w:w="80" w:type="dxa"/>
+              <w:bottom w:w="80" w:type="dxa"/>
+              <w:left w:w="120" w:type="dxa"/>
+              <w:right w:w="120" w:type="dxa"/>
+            </w:tcMar>
           </w:tcPr>
           <w:p>
+            <w:pPr>
+              <w:spacing w:before="80" w:after="80"/>
+            </w:pPr>
+            <w:r/>
             <w:r>
+              <w:rPr>
+                <w:rFonts w:ascii="Calibri" w:hAnsi="Calibri"/>
+                <w:sz w:val="20"/>
+              </w:rPr>
               <w:t>0.25 – 0.45</w:t>
             </w:r>
           </w:p>
         </w:tc>
         <w:tc>
           <w:tcPr>
-            <w:tcW w:type="dxa" w:w="2880"/>
+            <w:tcW w:type="dxa" w:w="3120"/>
+            <w:shd w:fill="F5F7FA"/>
+            <w:tcMar>
+              <w:top w:w="80" w:type="dxa"/>
+              <w:bottom w:w="80" w:type="dxa"/>
+              <w:left w:w="120" w:type="dxa"/>
+              <w:right w:w="120" w:type="dxa"/>
+            </w:tcMar>
           </w:tcPr>
           <w:p>
+            <w:pPr>
+              <w:spacing w:before="80" w:after="80"/>
+            </w:pPr>
+            <w:r/>
             <w:r>
+              <w:rPr>
+                <w:rFonts w:ascii="Calibri" w:hAnsi="Calibri"/>
+                <w:sz w:val="20"/>
+              </w:rPr>
               <w:t>Scheduled review and monitoring</w:t>
             </w:r>
           </w:p>
@@ -430,30 +666,72 @@
       <w:tr>
         <w:tc>
           <w:tcPr>
-            <w:tcW w:type="dxa" w:w="2880"/>
+            <w:tcW w:type="dxa" w:w="3120"/>
+            <w:tcMar>
+              <w:top w:w="80" w:type="dxa"/>
+              <w:bottom w:w="80" w:type="dxa"/>
+              <w:left w:w="120" w:type="dxa"/>
+              <w:right w:w="120" w:type="dxa"/>
+            </w:tcMar>
           </w:tcPr>
           <w:p>
+            <w:pPr>
+              <w:spacing w:before="80" w:after="80"/>
+            </w:pPr>
+            <w:r/>
             <w:r>
-              <w:t>Low — Monitor</w:t>
+              <w:rPr>
+                <w:rFonts w:ascii="Calibri" w:hAnsi="Calibri"/>
+                <w:sz w:val="20"/>
+              </w:rPr>
+              <w:t>Low</w:t>
             </w:r>
           </w:p>
         </w:tc>
         <w:tc>
           <w:tcPr>
-            <w:tcW w:type="dxa" w:w="2880"/>
+            <w:tcW w:type="dxa" w:w="3120"/>
+            <w:tcMar>
+              <w:top w:w="80" w:type="dxa"/>
+              <w:bottom w:w="80" w:type="dxa"/>
+              <w:left w:w="120" w:type="dxa"/>
+              <w:right w:w="120" w:type="dxa"/>
+            </w:tcMar>
           </w:tcPr>
           <w:p>
+            <w:pPr>
+              <w:spacing w:before="80" w:after="80"/>
+            </w:pPr>
+            <w:r/>
             <w:r>
+              <w:rPr>
+                <w:rFonts w:ascii="Calibri" w:hAnsi="Calibri"/>
+                <w:sz w:val="20"/>
+              </w:rPr>
               <w:t>&lt; 0.25</w:t>
             </w:r>
           </w:p>
         </w:tc>
         <w:tc>
           <w:tcPr>
-            <w:tcW w:type="dxa" w:w="2880"/>
+            <w:tcW w:type="dxa" w:w="3120"/>
+            <w:tcMar>
+              <w:top w:w="80" w:type="dxa"/>
+              <w:bottom w:w="80" w:type="dxa"/>
+              <w:left w:w="120" w:type="dxa"/>
+              <w:right w:w="120" w:type="dxa"/>
+            </w:tcMar>
           </w:tcPr>
           <w:p>
+            <w:pPr>
+              <w:spacing w:before="80" w:after="80"/>
+            </w:pPr>
+            <w:r/>
             <w:r>
+              <w:rPr>
+                <w:rFonts w:ascii="Calibri" w:hAnsi="Calibri"/>
+                <w:sz w:val="20"/>
+              </w:rPr>
               <w:t>Maintain current approach</w:t>
             </w:r>
           </w:p>
@@ -467,40 +745,78 @@
     </w:p>
     <w:p>
       <w:pPr>
-        <w:pStyle w:val="Heading1"/>
+        <w:pStyle w:val="Heading2"/>
+        <w:keepNext/>
+        <w:spacing w:before="280" w:after="80"/>
       </w:pPr>
       <w:r>
+        <w:rPr>
+          <w:rFonts w:ascii="Calibri" w:hAnsi="Calibri"/>
+          <w:b/>
+          <w:color w:val="2E5B88"/>
+          <w:sz w:val="28"/>
+        </w:rPr>
         <w:t>3. Key Findings</w:t>
       </w:r>
     </w:p>
     <w:p>
       <w:pPr>
-        <w:pStyle w:val="Heading2"/>
+        <w:pStyle w:val="Heading3"/>
+        <w:keepNext/>
+        <w:spacing w:before="200" w:after="40"/>
       </w:pPr>
       <w:r>
-        <w:t>3.1 Network-Level Risk Distribution</w:t>
+        <w:rPr>
+          <w:rFonts w:ascii="Calibri" w:hAnsi="Calibri"/>
+          <w:b/>
+          <w:color w:val="555555"/>
+          <w:sz w:val="24"/>
+        </w:rPr>
+        <w:t>3.1 Network-Level Risk Distribution (4-Component)</w:t>
       </w:r>
     </w:p>
     <w:tbl>
       <w:tblPr>
-        <w:tblStyle w:val="LightShading-Accent1"/>
         <w:tblW w:type="auto" w:w="0"/>
+        <w:tblLayout w:type="autofit"/>
         <w:tblLook w:firstColumn="1" w:firstRow="1" w:lastColumn="0" w:lastRow="0" w:noHBand="0" w:noVBand="1" w:val="04A0"/>
+        <w:tblBorders>
+          <w:top w:val="single" w:sz="4" w:space="0" w:color="CCCCCC"/>
+          <w:bottom w:val="single" w:sz="4" w:space="0" w:color="CCCCCC"/>
+          <w:insideH w:val="single" w:sz="4" w:space="0" w:color="E0E0E0"/>
+          <w:left w:val="none"/>
+          <w:right w:val="none"/>
+          <w:insideV w:val="none"/>
+        </w:tblBorders>
       </w:tblPr>
       <w:tblGrid>
-        <w:gridCol w:w="2880"/>
-        <w:gridCol w:w="2880"/>
-        <w:gridCol w:w="2880"/>
+        <w:gridCol w:w="3120"/>
+        <w:gridCol w:w="3120"/>
+        <w:gridCol w:w="3120"/>
       </w:tblGrid>
       <w:tr>
         <w:tc>
           <w:tcPr>
-            <w:tcW w:type="dxa" w:w="2880"/>
+            <w:tcW w:type="dxa" w:w="3120"/>
+            <w:shd w:fill="1B365D"/>
+            <w:tcMar>
+              <w:top w:w="80" w:type="dxa"/>
+              <w:bottom w:w="80" w:type="dxa"/>
+              <w:left w:w="120" w:type="dxa"/>
+              <w:right w:w="120" w:type="dxa"/>
+            </w:tcMar>
           </w:tcPr>
           <w:p>
+            <w:pPr>
+              <w:spacing w:before="80" w:after="80"/>
+            </w:pPr>
+            <w:r/>
             <w:r>
               <w:rPr>
+                <w:rFonts w:ascii="Calibri" w:hAnsi="Calibri"/>
                 <w:b/>
+                <w:color w:val="FFFFFF"/>
+                <w:sz w:val="21"/>
               </w:rPr>
               <w:t>Risk Tier</w:t>
             </w:r>
@@ -508,12 +824,26 @@
         </w:tc>
         <w:tc>
           <w:tcPr>
-            <w:tcW w:type="dxa" w:w="2880"/>
+            <w:tcW w:type="dxa" w:w="3120"/>
+            <w:shd w:fill="1B365D"/>
+            <w:tcMar>
+              <w:top w:w="80" w:type="dxa"/>
+              <w:bottom w:w="80" w:type="dxa"/>
+              <w:left w:w="120" w:type="dxa"/>
+              <w:right w:w="120" w:type="dxa"/>
+            </w:tcMar>
           </w:tcPr>
           <w:p>
+            <w:pPr>
+              <w:spacing w:before="80" w:after="80"/>
+            </w:pPr>
+            <w:r/>
             <w:r>
               <w:rPr>
+                <w:rFonts w:ascii="Calibri" w:hAnsi="Calibri"/>
                 <w:b/>
+                <w:color w:val="FFFFFF"/>
+                <w:sz w:val="21"/>
               </w:rPr>
               <w:t>Length (km)</w:t>
             </w:r>
@@ -521,12 +851,26 @@
         </w:tc>
         <w:tc>
           <w:tcPr>
-            <w:tcW w:type="dxa" w:w="2880"/>
+            <w:tcW w:type="dxa" w:w="3120"/>
+            <w:shd w:fill="1B365D"/>
+            <w:tcMar>
+              <w:top w:w="80" w:type="dxa"/>
+              <w:bottom w:w="80" w:type="dxa"/>
+              <w:left w:w="120" w:type="dxa"/>
+              <w:right w:w="120" w:type="dxa"/>
+            </w:tcMar>
           </w:tcPr>
           <w:p>
+            <w:pPr>
+              <w:spacing w:before="80" w:after="80"/>
+            </w:pPr>
+            <w:r/>
             <w:r>
               <w:rPr>
+                <w:rFonts w:ascii="Calibri" w:hAnsi="Calibri"/>
                 <w:b/>
+                <w:color w:val="FFFFFF"/>
+                <w:sz w:val="21"/>
               </w:rPr>
               <w:t>% of Network</w:t>
             </w:r>
@@ -536,30 +880,75 @@
       <w:tr>
         <w:tc>
           <w:tcPr>
-            <w:tcW w:type="dxa" w:w="2880"/>
+            <w:tcW w:type="dxa" w:w="3120"/>
+            <w:shd w:fill="F5F7FA"/>
+            <w:tcMar>
+              <w:top w:w="80" w:type="dxa"/>
+              <w:bottom w:w="80" w:type="dxa"/>
+              <w:left w:w="120" w:type="dxa"/>
+              <w:right w:w="120" w:type="dxa"/>
+            </w:tcMar>
           </w:tcPr>
           <w:p>
+            <w:pPr>
+              <w:spacing w:before="80" w:after="80"/>
+            </w:pPr>
+            <w:r/>
             <w:r>
+              <w:rPr>
+                <w:rFonts w:ascii="Calibri" w:hAnsi="Calibri"/>
+                <w:sz w:val="20"/>
+              </w:rPr>
               <w:t>Critical — Immediate Review</w:t>
             </w:r>
           </w:p>
         </w:tc>
         <w:tc>
           <w:tcPr>
-            <w:tcW w:type="dxa" w:w="2880"/>
+            <w:tcW w:type="dxa" w:w="3120"/>
+            <w:shd w:fill="F5F7FA"/>
+            <w:tcMar>
+              <w:top w:w="80" w:type="dxa"/>
+              <w:bottom w:w="80" w:type="dxa"/>
+              <w:left w:w="120" w:type="dxa"/>
+              <w:right w:w="120" w:type="dxa"/>
+            </w:tcMar>
           </w:tcPr>
           <w:p>
+            <w:pPr>
+              <w:spacing w:before="80" w:after="80"/>
+            </w:pPr>
+            <w:r/>
             <w:r>
+              <w:rPr>
+                <w:rFonts w:ascii="Calibri" w:hAnsi="Calibri"/>
+                <w:sz w:val="20"/>
+              </w:rPr>
               <w:t>11,445</w:t>
             </w:r>
           </w:p>
         </w:tc>
         <w:tc>
           <w:tcPr>
-            <w:tcW w:type="dxa" w:w="2880"/>
+            <w:tcW w:type="dxa" w:w="3120"/>
+            <w:shd w:fill="F5F7FA"/>
+            <w:tcMar>
+              <w:top w:w="80" w:type="dxa"/>
+              <w:bottom w:w="80" w:type="dxa"/>
+              <w:left w:w="120" w:type="dxa"/>
+              <w:right w:w="120" w:type="dxa"/>
+            </w:tcMar>
           </w:tcPr>
           <w:p>
+            <w:pPr>
+              <w:spacing w:before="80" w:after="80"/>
+            </w:pPr>
+            <w:r/>
             <w:r>
+              <w:rPr>
+                <w:rFonts w:ascii="Calibri" w:hAnsi="Calibri"/>
+                <w:sz w:val="20"/>
+              </w:rPr>
               <w:t>12.2%</w:t>
             </w:r>
           </w:p>
@@ -568,30 +957,72 @@
       <w:tr>
         <w:tc>
           <w:tcPr>
-            <w:tcW w:type="dxa" w:w="2880"/>
+            <w:tcW w:type="dxa" w:w="3120"/>
+            <w:tcMar>
+              <w:top w:w="80" w:type="dxa"/>
+              <w:bottom w:w="80" w:type="dxa"/>
+              <w:left w:w="120" w:type="dxa"/>
+              <w:right w:w="120" w:type="dxa"/>
+            </w:tcMar>
           </w:tcPr>
           <w:p>
+            <w:pPr>
+              <w:spacing w:before="80" w:after="80"/>
+            </w:pPr>
+            <w:r/>
             <w:r>
+              <w:rPr>
+                <w:rFonts w:ascii="Calibri" w:hAnsi="Calibri"/>
+                <w:sz w:val="20"/>
+              </w:rPr>
               <w:t>High — Priority Review</w:t>
             </w:r>
           </w:p>
         </w:tc>
         <w:tc>
           <w:tcPr>
-            <w:tcW w:type="dxa" w:w="2880"/>
+            <w:tcW w:type="dxa" w:w="3120"/>
+            <w:tcMar>
+              <w:top w:w="80" w:type="dxa"/>
+              <w:bottom w:w="80" w:type="dxa"/>
+              <w:left w:w="120" w:type="dxa"/>
+              <w:right w:w="120" w:type="dxa"/>
+            </w:tcMar>
           </w:tcPr>
           <w:p>
+            <w:pPr>
+              <w:spacing w:before="80" w:after="80"/>
+            </w:pPr>
+            <w:r/>
             <w:r>
+              <w:rPr>
+                <w:rFonts w:ascii="Calibri" w:hAnsi="Calibri"/>
+                <w:sz w:val="20"/>
+              </w:rPr>
               <w:t>19,313</w:t>
             </w:r>
           </w:p>
         </w:tc>
         <w:tc>
           <w:tcPr>
-            <w:tcW w:type="dxa" w:w="2880"/>
+            <w:tcW w:type="dxa" w:w="3120"/>
+            <w:tcMar>
+              <w:top w:w="80" w:type="dxa"/>
+              <w:bottom w:w="80" w:type="dxa"/>
+              <w:left w:w="120" w:type="dxa"/>
+              <w:right w:w="120" w:type="dxa"/>
+            </w:tcMar>
           </w:tcPr>
           <w:p>
+            <w:pPr>
+              <w:spacing w:before="80" w:after="80"/>
+            </w:pPr>
+            <w:r/>
             <w:r>
+              <w:rPr>
+                <w:rFonts w:ascii="Calibri" w:hAnsi="Calibri"/>
+                <w:sz w:val="20"/>
+              </w:rPr>
               <w:t>20.7%</w:t>
             </w:r>
           </w:p>
@@ -600,30 +1031,75 @@
       <w:tr>
         <w:tc>
           <w:tcPr>
-            <w:tcW w:type="dxa" w:w="2880"/>
+            <w:tcW w:type="dxa" w:w="3120"/>
+            <w:shd w:fill="F5F7FA"/>
+            <w:tcMar>
+              <w:top w:w="80" w:type="dxa"/>
+              <w:bottom w:w="80" w:type="dxa"/>
+              <w:left w:w="120" w:type="dxa"/>
+              <w:right w:w="120" w:type="dxa"/>
+            </w:tcMar>
           </w:tcPr>
           <w:p>
+            <w:pPr>
+              <w:spacing w:before="80" w:after="80"/>
+            </w:pPr>
+            <w:r/>
             <w:r>
+              <w:rPr>
+                <w:rFonts w:ascii="Calibri" w:hAnsi="Calibri"/>
+                <w:sz w:val="20"/>
+              </w:rPr>
               <w:t>Moderate — Scheduled Review</w:t>
             </w:r>
           </w:p>
         </w:tc>
         <w:tc>
           <w:tcPr>
-            <w:tcW w:type="dxa" w:w="2880"/>
+            <w:tcW w:type="dxa" w:w="3120"/>
+            <w:shd w:fill="F5F7FA"/>
+            <w:tcMar>
+              <w:top w:w="80" w:type="dxa"/>
+              <w:bottom w:w="80" w:type="dxa"/>
+              <w:left w:w="120" w:type="dxa"/>
+              <w:right w:w="120" w:type="dxa"/>
+            </w:tcMar>
           </w:tcPr>
           <w:p>
+            <w:pPr>
+              <w:spacing w:before="80" w:after="80"/>
+            </w:pPr>
+            <w:r/>
             <w:r>
+              <w:rPr>
+                <w:rFonts w:ascii="Calibri" w:hAnsi="Calibri"/>
+                <w:sz w:val="20"/>
+              </w:rPr>
               <w:t>25,499</w:t>
             </w:r>
           </w:p>
         </w:tc>
         <w:tc>
           <w:tcPr>
-            <w:tcW w:type="dxa" w:w="2880"/>
+            <w:tcW w:type="dxa" w:w="3120"/>
+            <w:shd w:fill="F5F7FA"/>
+            <w:tcMar>
+              <w:top w:w="80" w:type="dxa"/>
+              <w:bottom w:w="80" w:type="dxa"/>
+              <w:left w:w="120" w:type="dxa"/>
+              <w:right w:w="120" w:type="dxa"/>
+            </w:tcMar>
           </w:tcPr>
           <w:p>
+            <w:pPr>
+              <w:spacing w:before="80" w:after="80"/>
+            </w:pPr>
+            <w:r/>
             <w:r>
+              <w:rPr>
+                <w:rFonts w:ascii="Calibri" w:hAnsi="Calibri"/>
+                <w:sz w:val="20"/>
+              </w:rPr>
               <w:t>27.3%</w:t>
             </w:r>
           </w:p>
@@ -632,30 +1108,72 @@
       <w:tr>
         <w:tc>
           <w:tcPr>
-            <w:tcW w:type="dxa" w:w="2880"/>
+            <w:tcW w:type="dxa" w:w="3120"/>
+            <w:tcMar>
+              <w:top w:w="80" w:type="dxa"/>
+              <w:bottom w:w="80" w:type="dxa"/>
+              <w:left w:w="120" w:type="dxa"/>
+              <w:right w:w="120" w:type="dxa"/>
+            </w:tcMar>
           </w:tcPr>
           <w:p>
+            <w:pPr>
+              <w:spacing w:before="80" w:after="80"/>
+            </w:pPr>
+            <w:r/>
             <w:r>
+              <w:rPr>
+                <w:rFonts w:ascii="Calibri" w:hAnsi="Calibri"/>
+                <w:sz w:val="20"/>
+              </w:rPr>
               <w:t>Low — Monitor</w:t>
             </w:r>
           </w:p>
         </w:tc>
         <w:tc>
           <w:tcPr>
-            <w:tcW w:type="dxa" w:w="2880"/>
+            <w:tcW w:type="dxa" w:w="3120"/>
+            <w:tcMar>
+              <w:top w:w="80" w:type="dxa"/>
+              <w:bottom w:w="80" w:type="dxa"/>
+              <w:left w:w="120" w:type="dxa"/>
+              <w:right w:w="120" w:type="dxa"/>
+            </w:tcMar>
           </w:tcPr>
           <w:p>
+            <w:pPr>
+              <w:spacing w:before="80" w:after="80"/>
+            </w:pPr>
+            <w:r/>
             <w:r>
+              <w:rPr>
+                <w:rFonts w:ascii="Calibri" w:hAnsi="Calibri"/>
+                <w:sz w:val="20"/>
+              </w:rPr>
               <w:t>37,253</w:t>
             </w:r>
           </w:p>
         </w:tc>
         <w:tc>
           <w:tcPr>
-            <w:tcW w:type="dxa" w:w="2880"/>
+            <w:tcW w:type="dxa" w:w="3120"/>
+            <w:tcMar>
+              <w:top w:w="80" w:type="dxa"/>
+              <w:bottom w:w="80" w:type="dxa"/>
+              <w:left w:w="120" w:type="dxa"/>
+              <w:right w:w="120" w:type="dxa"/>
+            </w:tcMar>
           </w:tcPr>
           <w:p>
+            <w:pPr>
+              <w:spacing w:before="80" w:after="80"/>
+            </w:pPr>
+            <w:r/>
             <w:r>
+              <w:rPr>
+                <w:rFonts w:ascii="Calibri" w:hAnsi="Calibri"/>
+                <w:sz w:val="20"/>
+              </w:rPr>
               <w:t>39.8%</w:t>
             </w:r>
           </w:p>
@@ -663,78 +1181,166 @@
       </w:tr>
     </w:tbl>
     <w:p>
+      <w:pPr>
+        <w:spacing w:after="120" w:line="276" w:lineRule="auto"/>
+      </w:pPr>
+      <w:r/>
       <w:r>
-        <w:t>Mean network score: 0.415 (moderate risk)</w:t>
+        <w:rPr>
+          <w:b/>
+        </w:rPr>
+        <w:t>Mean network score: 0.415</w:t>
+      </w:r>
+      <w:r>
+        <w:t xml:space="preserve"> (moderate risk)</w:t>
       </w:r>
     </w:p>
     <w:p>
       <w:pPr>
-        <w:pStyle w:val="Heading2"/>
+        <w:pStyle w:val="Heading3"/>
+        <w:keepNext/>
+        <w:spacing w:before="200" w:after="40"/>
       </w:pPr>
       <w:r>
+        <w:rPr>
+          <w:rFonts w:ascii="Calibri" w:hAnsi="Calibri"/>
+          <w:b/>
+          <w:color w:val="555555"/>
+          <w:sz w:val="24"/>
+        </w:rPr>
         <w:t>3.2 Critical Findings</w:t>
       </w:r>
     </w:p>
     <w:p>
       <w:pPr>
-        <w:pStyle w:val="ListBullet"/>
+        <w:spacing w:after="60"/>
+        <w:ind w:left="360"/>
       </w:pPr>
       <w:r>
-        <w:t>Speed limits are systematically too high. 77.9% of segments have posted limits exceeding Safe System recommendations. Average limit misalignment: 13 km/h on urban primary roads.</w:t>
+        <w:t xml:space="preserve">1. </w:t>
+      </w:r>
+      <w:r>
+        <w:rPr>
+          <w:b/>
+        </w:rPr>
+        <w:t>Speed limits are systematically too high.</w:t>
+      </w:r>
+      <w:r>
+        <w:t xml:space="preserve"> 77.9% of segments have posted speed limits exceeding Safe System recommendations. The average limit misalignment is 13 km/h above Safe System thresholds on urban primary roads.</w:t>
       </w:r>
     </w:p>
     <w:p>
       <w:pPr>
-        <w:pStyle w:val="ListBullet"/>
+        <w:spacing w:after="60"/>
+        <w:ind w:left="360"/>
       </w:pPr>
       <w:r>
-        <w:t>Traffic routinely exceeds survivable speeds. On 76.6% of segments, 85th percentile operating speeds exceed Safe System thresholds. The average operating gap on Critical segments is 38 km/h — a pedestrian struck at this speed faces near-certain fatality.</w:t>
+        <w:t xml:space="preserve">2. </w:t>
+      </w:r>
+      <w:r>
+        <w:rPr>
+          <w:b/>
+        </w:rPr>
+        <w:t>Traffic routinely exceeds survivable speeds.</w:t>
+      </w:r>
+      <w:r>
+        <w:t xml:space="preserve"> On 76.6% of segments, 85th percentile operating speeds are above the Safe System threshold for that road context. The average operating gap on Critical segments is 38 km/h — a pedestrian struck at this speed faces near-certain fatality.</w:t>
       </w:r>
     </w:p>
     <w:p>
       <w:pPr>
-        <w:pStyle w:val="ListBullet"/>
+        <w:spacing w:after="60"/>
+        <w:ind w:left="360"/>
       </w:pPr>
       <w:r>
-        <w:t>Secondary urban roads are the most dangerous category. These roads (mixed-use with foot traffic and shops) have a Safe System limit of 30 km/h but carry posted limits of 50–60 km/h and actual speeds above 60 km/h.</w:t>
+        <w:t xml:space="preserve">3. </w:t>
+      </w:r>
+      <w:r>
+        <w:rPr>
+          <w:b/>
+        </w:rPr>
+        <w:t>Secondary urban roads are the most dangerous category.</w:t>
+      </w:r>
+      <w:r>
+        <w:t xml:space="preserve"> These roads (typically mixed-use with foot traffic, shops, and residential access) have a Safe System limit of 30 km/h but frequently carry posted limits of 50–60 km/h and actual speeds above 60 km/h.</w:t>
       </w:r>
     </w:p>
     <w:p>
       <w:pPr>
-        <w:pStyle w:val="ListBullet"/>
+        <w:spacing w:after="60"/>
+        <w:ind w:left="360"/>
       </w:pPr>
       <w:r>
-        <w:t>VRU exposure amplifies risk. 35% of segments have high VRU exposure scores (&gt;0.6), concentrated in urban areas near schools and markets.</w:t>
+        <w:t xml:space="preserve">4. </w:t>
+      </w:r>
+      <w:r>
+        <w:rPr>
+          <w:b/>
+        </w:rPr>
+        <w:t>VRU exposure amplifies risk.</w:t>
+      </w:r>
+      <w:r>
+        <w:t xml:space="preserve"> 35% of segments have high VRU exposure scores (&gt;0.6), concentrated in urban areas near schools, markets, and mixed land use. These segments receive double penalty — high operating speeds and high pedestrian presence.</w:t>
       </w:r>
     </w:p>
     <w:p>
       <w:pPr>
-        <w:pStyle w:val="Heading2"/>
+        <w:pStyle w:val="Heading3"/>
+        <w:keepNext/>
+        <w:spacing w:before="200" w:after="40"/>
       </w:pPr>
       <w:r>
+        <w:rPr>
+          <w:rFonts w:ascii="Calibri" w:hAnsi="Calibri"/>
+          <w:b/>
+          <w:color w:val="555555"/>
+          <w:sz w:val="24"/>
+        </w:rPr>
         <w:t>3.3 Regional Findings</w:t>
       </w:r>
     </w:p>
     <w:tbl>
       <w:tblPr>
-        <w:tblStyle w:val="LightShading-Accent1"/>
         <w:tblW w:type="auto" w:w="0"/>
+        <w:tblLayout w:type="autofit"/>
         <w:tblLook w:firstColumn="1" w:firstRow="1" w:lastColumn="0" w:lastRow="0" w:noHBand="0" w:noVBand="1" w:val="04A0"/>
+        <w:tblBorders>
+          <w:top w:val="single" w:sz="4" w:space="0" w:color="CCCCCC"/>
+          <w:bottom w:val="single" w:sz="4" w:space="0" w:color="CCCCCC"/>
+          <w:insideH w:val="single" w:sz="4" w:space="0" w:color="E0E0E0"/>
+          <w:left w:val="none"/>
+          <w:right w:val="none"/>
+          <w:insideV w:val="none"/>
+        </w:tblBorders>
       </w:tblPr>
       <w:tblGrid>
-        <w:gridCol w:w="2880"/>
-        <w:gridCol w:w="2880"/>
-        <w:gridCol w:w="2880"/>
+        <w:gridCol w:w="3120"/>
+        <w:gridCol w:w="3120"/>
+        <w:gridCol w:w="3120"/>
       </w:tblGrid>
       <w:tr>
         <w:tc>
           <w:tcPr>
-            <w:tcW w:type="dxa" w:w="2880"/>
+            <w:tcW w:type="dxa" w:w="3120"/>
+            <w:shd w:fill="1B365D"/>
+            <w:tcMar>
+              <w:top w:w="80" w:type="dxa"/>
+              <w:bottom w:w="80" w:type="dxa"/>
+              <w:left w:w="120" w:type="dxa"/>
+              <w:right w:w="120" w:type="dxa"/>
+            </w:tcMar>
           </w:tcPr>
           <w:p>
+            <w:pPr>
+              <w:spacing w:before="80" w:after="80"/>
+            </w:pPr>
+            <w:r/>
             <w:r>
               <w:rPr>
+                <w:rFonts w:ascii="Calibri" w:hAnsi="Calibri"/>
                 <w:b/>
+                <w:color w:val="FFFFFF"/>
+                <w:sz w:val="21"/>
               </w:rPr>
               <w:t>Metric</w:t>
             </w:r>
@@ -742,12 +1348,26 @@
         </w:tc>
         <w:tc>
           <w:tcPr>
-            <w:tcW w:type="dxa" w:w="2880"/>
+            <w:tcW w:type="dxa" w:w="3120"/>
+            <w:shd w:fill="1B365D"/>
+            <w:tcMar>
+              <w:top w:w="80" w:type="dxa"/>
+              <w:bottom w:w="80" w:type="dxa"/>
+              <w:left w:w="120" w:type="dxa"/>
+              <w:right w:w="120" w:type="dxa"/>
+            </w:tcMar>
           </w:tcPr>
           <w:p>
+            <w:pPr>
+              <w:spacing w:before="80" w:after="80"/>
+            </w:pPr>
+            <w:r/>
             <w:r>
               <w:rPr>
+                <w:rFonts w:ascii="Calibri" w:hAnsi="Calibri"/>
                 <w:b/>
+                <w:color w:val="FFFFFF"/>
+                <w:sz w:val="21"/>
               </w:rPr>
               <w:t>Thailand</w:t>
             </w:r>
@@ -755,12 +1375,26 @@
         </w:tc>
         <w:tc>
           <w:tcPr>
-            <w:tcW w:type="dxa" w:w="2880"/>
+            <w:tcW w:type="dxa" w:w="3120"/>
+            <w:shd w:fill="1B365D"/>
+            <w:tcMar>
+              <w:top w:w="80" w:type="dxa"/>
+              <w:bottom w:w="80" w:type="dxa"/>
+              <w:left w:w="120" w:type="dxa"/>
+              <w:right w:w="120" w:type="dxa"/>
+            </w:tcMar>
           </w:tcPr>
           <w:p>
+            <w:pPr>
+              <w:spacing w:before="80" w:after="80"/>
+            </w:pPr>
+            <w:r/>
             <w:r>
               <w:rPr>
+                <w:rFonts w:ascii="Calibri" w:hAnsi="Calibri"/>
                 <w:b/>
+                <w:color w:val="FFFFFF"/>
+                <w:sz w:val="21"/>
               </w:rPr>
               <w:t>Maharashtra</w:t>
             </w:r>
@@ -770,30 +1404,75 @@
       <w:tr>
         <w:tc>
           <w:tcPr>
-            <w:tcW w:type="dxa" w:w="2880"/>
+            <w:tcW w:type="dxa" w:w="3120"/>
+            <w:shd w:fill="F5F7FA"/>
+            <w:tcMar>
+              <w:top w:w="80" w:type="dxa"/>
+              <w:bottom w:w="80" w:type="dxa"/>
+              <w:left w:w="120" w:type="dxa"/>
+              <w:right w:w="120" w:type="dxa"/>
+            </w:tcMar>
           </w:tcPr>
           <w:p>
+            <w:pPr>
+              <w:spacing w:before="80" w:after="80"/>
+            </w:pPr>
+            <w:r/>
             <w:r>
+              <w:rPr>
+                <w:rFonts w:ascii="Calibri" w:hAnsi="Calibri"/>
+                <w:sz w:val="20"/>
+              </w:rPr>
               <w:t>Total segments analyzed</w:t>
             </w:r>
           </w:p>
         </w:tc>
         <w:tc>
           <w:tcPr>
-            <w:tcW w:type="dxa" w:w="2880"/>
+            <w:tcW w:type="dxa" w:w="3120"/>
+            <w:shd w:fill="F5F7FA"/>
+            <w:tcMar>
+              <w:top w:w="80" w:type="dxa"/>
+              <w:bottom w:w="80" w:type="dxa"/>
+              <w:left w:w="120" w:type="dxa"/>
+              <w:right w:w="120" w:type="dxa"/>
+            </w:tcMar>
           </w:tcPr>
           <w:p>
+            <w:pPr>
+              <w:spacing w:before="80" w:after="80"/>
+            </w:pPr>
+            <w:r/>
             <w:r>
+              <w:rPr>
+                <w:rFonts w:ascii="Calibri" w:hAnsi="Calibri"/>
+                <w:sz w:val="20"/>
+              </w:rPr>
               <w:t>9,732</w:t>
             </w:r>
           </w:p>
         </w:tc>
         <w:tc>
           <w:tcPr>
-            <w:tcW w:type="dxa" w:w="2880"/>
+            <w:tcW w:type="dxa" w:w="3120"/>
+            <w:shd w:fill="F5F7FA"/>
+            <w:tcMar>
+              <w:top w:w="80" w:type="dxa"/>
+              <w:bottom w:w="80" w:type="dxa"/>
+              <w:left w:w="120" w:type="dxa"/>
+              <w:right w:w="120" w:type="dxa"/>
+            </w:tcMar>
           </w:tcPr>
           <w:p>
+            <w:pPr>
+              <w:spacing w:before="80" w:after="80"/>
+            </w:pPr>
+            <w:r/>
             <w:r>
+              <w:rPr>
+                <w:rFonts w:ascii="Calibri" w:hAnsi="Calibri"/>
+                <w:sz w:val="20"/>
+              </w:rPr>
               <w:t>5,061</w:t>
             </w:r>
           </w:p>
@@ -802,143 +1481,299 @@
       <w:tr>
         <w:tc>
           <w:tcPr>
-            <w:tcW w:type="dxa" w:w="2880"/>
+            <w:tcW w:type="dxa" w:w="3120"/>
+            <w:tcMar>
+              <w:top w:w="80" w:type="dxa"/>
+              <w:bottom w:w="80" w:type="dxa"/>
+              <w:left w:w="120" w:type="dxa"/>
+              <w:right w:w="120" w:type="dxa"/>
+            </w:tcMar>
           </w:tcPr>
           <w:p>
+            <w:pPr>
+              <w:spacing w:before="80" w:after="80"/>
+            </w:pPr>
+            <w:r/>
             <w:r>
+              <w:rPr>
+                <w:rFonts w:ascii="Calibri" w:hAnsi="Calibri"/>
+                <w:sz w:val="20"/>
+              </w:rPr>
+              <w:t>Critical segments (%)</w:t>
+            </w:r>
+          </w:p>
+        </w:tc>
+        <w:tc>
+          <w:tcPr>
+            <w:tcW w:type="dxa" w:w="3120"/>
+            <w:tcMar>
+              <w:top w:w="80" w:type="dxa"/>
+              <w:bottom w:w="80" w:type="dxa"/>
+              <w:left w:w="120" w:type="dxa"/>
+              <w:right w:w="120" w:type="dxa"/>
+            </w:tcMar>
+          </w:tcPr>
+          <w:p>
+            <w:pPr>
+              <w:spacing w:before="80" w:after="80"/>
+            </w:pPr>
+            <w:r/>
+            <w:r>
+              <w:rPr>
+                <w:rFonts w:ascii="Calibri" w:hAnsi="Calibri"/>
+                <w:sz w:val="20"/>
+              </w:rPr>
+              <w:t>14.1%</w:t>
+            </w:r>
+          </w:p>
+        </w:tc>
+        <w:tc>
+          <w:tcPr>
+            <w:tcW w:type="dxa" w:w="3120"/>
+            <w:tcMar>
+              <w:top w:w="80" w:type="dxa"/>
+              <w:bottom w:w="80" w:type="dxa"/>
+              <w:left w:w="120" w:type="dxa"/>
+              <w:right w:w="120" w:type="dxa"/>
+            </w:tcMar>
+          </w:tcPr>
+          <w:p>
+            <w:pPr>
+              <w:spacing w:before="80" w:after="80"/>
+            </w:pPr>
+            <w:r/>
+            <w:r>
+              <w:rPr>
+                <w:rFonts w:ascii="Calibri" w:hAnsi="Calibri"/>
+                <w:sz w:val="20"/>
+              </w:rPr>
+              <w:t>9.8%</w:t>
+            </w:r>
+          </w:p>
+        </w:tc>
+      </w:tr>
+      <w:tr>
+        <w:tc>
+          <w:tcPr>
+            <w:tcW w:type="dxa" w:w="3120"/>
+            <w:shd w:fill="F5F7FA"/>
+            <w:tcMar>
+              <w:top w:w="80" w:type="dxa"/>
+              <w:bottom w:w="80" w:type="dxa"/>
+              <w:left w:w="120" w:type="dxa"/>
+              <w:right w:w="120" w:type="dxa"/>
+            </w:tcMar>
+          </w:tcPr>
+          <w:p>
+            <w:pPr>
+              <w:spacing w:before="80" w:after="80"/>
+            </w:pPr>
+            <w:r/>
+            <w:r>
+              <w:rPr>
+                <w:rFonts w:ascii="Calibri" w:hAnsi="Calibri"/>
+                <w:sz w:val="20"/>
+              </w:rPr>
               <w:t>Mean Speed Safety Score</w:t>
             </w:r>
           </w:p>
         </w:tc>
         <w:tc>
           <w:tcPr>
-            <w:tcW w:type="dxa" w:w="2880"/>
+            <w:tcW w:type="dxa" w:w="3120"/>
+            <w:shd w:fill="F5F7FA"/>
+            <w:tcMar>
+              <w:top w:w="80" w:type="dxa"/>
+              <w:bottom w:w="80" w:type="dxa"/>
+              <w:left w:w="120" w:type="dxa"/>
+              <w:right w:w="120" w:type="dxa"/>
+            </w:tcMar>
           </w:tcPr>
           <w:p>
+            <w:pPr>
+              <w:spacing w:before="80" w:after="80"/>
+            </w:pPr>
+            <w:r/>
             <w:r>
+              <w:rPr>
+                <w:rFonts w:ascii="Calibri" w:hAnsi="Calibri"/>
+                <w:sz w:val="20"/>
+              </w:rPr>
               <w:t>0.428</w:t>
             </w:r>
           </w:p>
         </w:tc>
         <w:tc>
           <w:tcPr>
-            <w:tcW w:type="dxa" w:w="2880"/>
+            <w:tcW w:type="dxa" w:w="3120"/>
+            <w:shd w:fill="F5F7FA"/>
+            <w:tcMar>
+              <w:top w:w="80" w:type="dxa"/>
+              <w:bottom w:w="80" w:type="dxa"/>
+              <w:left w:w="120" w:type="dxa"/>
+              <w:right w:w="120" w:type="dxa"/>
+            </w:tcMar>
           </w:tcPr>
           <w:p>
+            <w:pPr>
+              <w:spacing w:before="80" w:after="80"/>
+            </w:pPr>
+            <w:r/>
             <w:r>
+              <w:rPr>
+                <w:rFonts w:ascii="Calibri" w:hAnsi="Calibri"/>
+                <w:sz w:val="20"/>
+              </w:rPr>
               <w:t>0.395</w:t>
+            </w:r>
+          </w:p>
+        </w:tc>
+      </w:tr>
+      <w:tr>
+        <w:tc>
+          <w:tcPr>
+            <w:tcW w:type="dxa" w:w="3120"/>
+            <w:tcMar>
+              <w:top w:w="80" w:type="dxa"/>
+              <w:bottom w:w="80" w:type="dxa"/>
+              <w:left w:w="120" w:type="dxa"/>
+              <w:right w:w="120" w:type="dxa"/>
+            </w:tcMar>
+          </w:tcPr>
+          <w:p>
+            <w:pPr>
+              <w:spacing w:before="80" w:after="80"/>
+            </w:pPr>
+            <w:r/>
+            <w:r>
+              <w:rPr>
+                <w:rFonts w:ascii="Calibri" w:hAnsi="Calibri"/>
+                <w:sz w:val="20"/>
+              </w:rPr>
+              <w:t>Mean operating gap (km/h)</w:t>
+            </w:r>
+          </w:p>
+        </w:tc>
+        <w:tc>
+          <w:tcPr>
+            <w:tcW w:type="dxa" w:w="3120"/>
+            <w:tcMar>
+              <w:top w:w="80" w:type="dxa"/>
+              <w:bottom w:w="80" w:type="dxa"/>
+              <w:left w:w="120" w:type="dxa"/>
+              <w:right w:w="120" w:type="dxa"/>
+            </w:tcMar>
+          </w:tcPr>
+          <w:p>
+            <w:pPr>
+              <w:spacing w:before="80" w:after="80"/>
+            </w:pPr>
+            <w:r/>
+            <w:r>
+              <w:rPr>
+                <w:rFonts w:ascii="Calibri" w:hAnsi="Calibri"/>
+                <w:sz w:val="20"/>
+              </w:rPr>
+              <w:t>11.4</w:t>
+            </w:r>
+          </w:p>
+        </w:tc>
+        <w:tc>
+          <w:tcPr>
+            <w:tcW w:type="dxa" w:w="3120"/>
+            <w:tcMar>
+              <w:top w:w="80" w:type="dxa"/>
+              <w:bottom w:w="80" w:type="dxa"/>
+              <w:left w:w="120" w:type="dxa"/>
+              <w:right w:w="120" w:type="dxa"/>
+            </w:tcMar>
+          </w:tcPr>
+          <w:p>
+            <w:pPr>
+              <w:spacing w:before="80" w:after="80"/>
+            </w:pPr>
+            <w:r/>
+            <w:r>
+              <w:rPr>
+                <w:rFonts w:ascii="Calibri" w:hAnsi="Calibri"/>
+                <w:sz w:val="20"/>
+              </w:rPr>
+              <w:t>8.7</w:t>
             </w:r>
           </w:p>
         </w:tc>
       </w:tr>
     </w:tbl>
     <w:p>
+      <w:pPr>
+        <w:pStyle w:val="Heading3"/>
+        <w:keepNext/>
+        <w:spacing w:before="200" w:after="40"/>
+      </w:pPr>
       <w:r>
-        <w:br w:type="page"/>
+        <w:rPr>
+          <w:rFonts w:ascii="Calibri" w:hAnsi="Calibri"/>
+          <w:b/>
+          <w:color w:val="555555"/>
+          <w:sz w:val="24"/>
+        </w:rPr>
+        <w:t>3.4 RoadSense 3-Module Cross-Validation</w:t>
       </w:r>
     </w:p>
     <w:p>
       <w:pPr>
-        <w:pStyle w:val="Heading1"/>
+        <w:spacing w:after="120" w:line="276" w:lineRule="auto"/>
       </w:pPr>
       <w:r>
-        <w:t>4. Policy Recommendations</w:t>
-      </w:r>
-    </w:p>
-    <w:p>
-      <w:pPr>
-        <w:pStyle w:val="Heading2"/>
-      </w:pPr>
-      <w:r>
-        <w:t>4.1 Immediate Priorities (Critical Tier — 11,445 km)</w:t>
+        <w:t>The 3-module approach produces broadly consistent rankings (correlation &gt;0.85 with 4-component scores), with slightly lower overall scores (mean SSS: 0.450 vs 0.415). Module-level diagnostics reveal:</w:t>
       </w:r>
     </w:p>
     <w:p>
       <w:pPr>
         <w:pStyle w:val="ListBullet"/>
+        <w:spacing w:after="60"/>
       </w:pPr>
+      <w:r/>
       <w:r>
-        <w:t>Audit posted speed limits on all Critical segments. Many carry limits 20–40 km/h above Safe System recommendations. Lowering limits is the fastest, lowest-cost intervention.</w:t>
+        <w:rPr>
+          <w:b/>
+        </w:rPr>
+        <w:t>Module A</w:t>
+      </w:r>
+      <w:r>
+        <w:t xml:space="preserve"> (Speed Alignment) drives most Critical classifications — segments with high A scores almost always score Critical overall.</w:t>
       </w:r>
     </w:p>
     <w:p>
       <w:pPr>
         <w:pStyle w:val="ListBullet"/>
+        <w:spacing w:after="60"/>
       </w:pPr>
+      <w:r/>
       <w:r>
-        <w:t>Deploy traffic calming on secondary urban roads with operating speeds &gt;50 km/h. Speed humps, raised crossings, and lane narrowing reduce speeds by 10–15 km/h.</w:t>
+        <w:rPr>
+          <w:b/>
+        </w:rPr>
+        <w:t>Module B</w:t>
+      </w:r>
+      <w:r>
+        <w:t xml:space="preserve"> (VRU Exposure) is the most discriminating variable between urban and rural risk profiles.</w:t>
       </w:r>
     </w:p>
     <w:p>
       <w:pPr>
         <w:pStyle w:val="ListBullet"/>
+        <w:spacing w:after="60"/>
       </w:pPr>
+      <w:r/>
       <w:r>
-        <w:t>Prioritize pedestrian crossings at VRU-critical segments near schools and markets (marked crossings, pedestrian refuges, signalised crossings).</w:t>
+        <w:rPr>
+          <w:b/>
+        </w:rPr>
+        <w:t>Module C</w:t>
       </w:r>
-    </w:p>
-    <w:p>
-      <w:pPr>
-        <w:pStyle w:val="Heading2"/>
-      </w:pPr>
       <w:r>
-        <w:t>4.2 Medium-Term Actions (High Tier — 19,313 km)</w:t>
-      </w:r>
-    </w:p>
-    <w:p>
-      <w:pPr>
-        <w:pStyle w:val="ListBullet"/>
-      </w:pPr>
-      <w:r>
-        <w:t>Reclassify road hierarchies where the posted limit and road function are mismatched.</w:t>
-      </w:r>
-    </w:p>
-    <w:p>
-      <w:pPr>
-        <w:pStyle w:val="ListBullet"/>
-      </w:pPr>
-      <w:r>
-        <w:t>Strengthen enforcement with automated speed cameras where operating speeds exceed posted limits by &gt;15 km/h.</w:t>
-      </w:r>
-    </w:p>
-    <w:p>
-      <w:pPr>
-        <w:pStyle w:val="ListBullet"/>
-      </w:pPr>
-      <w:r>
-        <w:t>Integrate VRU risk into road design standards — high-VRU segments should trigger protected pedestrian infrastructure in any redesign.</w:t>
-      </w:r>
-    </w:p>
-    <w:p>
-      <w:pPr>
-        <w:pStyle w:val="Heading2"/>
-      </w:pPr>
-      <w:r>
-        <w:t>4.3 Systemic Changes</w:t>
-      </w:r>
-    </w:p>
-    <w:p>
-      <w:pPr>
-        <w:pStyle w:val="ListBullet"/>
-      </w:pPr>
-      <w:r>
-        <w:t>Adopt Safe System speed limits as the national default (e.g., all urban secondary roads default to 30 km/h).</w:t>
-      </w:r>
-    </w:p>
-    <w:p>
-      <w:pPr>
-        <w:pStyle w:val="ListBullet"/>
-      </w:pPr>
-      <w:r>
-        <w:t>Build a data-driven speed management program — run the RoadSense pipeline quarterly to track changes and evaluate interventions.</w:t>
-      </w:r>
-    </w:p>
-    <w:p>
-      <w:pPr>
-        <w:pStyle w:val="ListBullet"/>
-      </w:pPr>
-      <w:r>
-        <w:t>Expand data collection: pedestrian and cyclist counts at VRU-critical locations, street-level imagery collection, and crash data integration.</w:t>
+        <w:t xml:space="preserve"> (Road Environment) is the weakest signal due to reliance on static proxy values; future Mapillary/CLIP imagery integration would strengthen this module significantly.</w:t>
       </w:r>
     </w:p>
     <w:p>
@@ -948,37 +1783,301 @@
     </w:p>
     <w:p>
       <w:pPr>
-        <w:pStyle w:val="Heading1"/>
+        <w:pStyle w:val="Heading2"/>
+        <w:keepNext/>
+        <w:spacing w:before="280" w:after="80"/>
       </w:pPr>
       <w:r>
+        <w:rPr>
+          <w:rFonts w:ascii="Calibri" w:hAnsi="Calibri"/>
+          <w:b/>
+          <w:color w:val="2E5B88"/>
+          <w:sz w:val="28"/>
+        </w:rPr>
+        <w:t>4. Policy Recommendations</w:t>
+      </w:r>
+    </w:p>
+    <w:p>
+      <w:pPr>
+        <w:pStyle w:val="Heading3"/>
+        <w:keepNext/>
+        <w:spacing w:before="200" w:after="40"/>
+      </w:pPr>
+      <w:r>
+        <w:rPr>
+          <w:rFonts w:ascii="Calibri" w:hAnsi="Calibri"/>
+          <w:b/>
+          <w:color w:val="555555"/>
+          <w:sz w:val="24"/>
+        </w:rPr>
+        <w:t>4.1 Immediate Priorities (Critical Tier — 11,445 km)</w:t>
+      </w:r>
+    </w:p>
+    <w:p>
+      <w:pPr>
+        <w:spacing w:after="60"/>
+        <w:ind w:left="360"/>
+      </w:pPr>
+      <w:r>
+        <w:t xml:space="preserve">1. </w:t>
+      </w:r>
+      <w:r>
+        <w:rPr>
+          <w:b/>
+        </w:rPr>
+        <w:t>Audit Speed Limits:</w:t>
+      </w:r>
+      <w:r>
+        <w:t xml:space="preserve"> Lower posted limits on Critical segments to align with Safe System guidelines. Many current limits are 20–40 km/h too high.</w:t>
+      </w:r>
+    </w:p>
+    <w:p>
+      <w:pPr>
+        <w:spacing w:after="60"/>
+        <w:ind w:left="360"/>
+      </w:pPr>
+      <w:r>
+        <w:t xml:space="preserve">2. </w:t>
+      </w:r>
+      <w:r>
+        <w:rPr>
+          <w:b/>
+        </w:rPr>
+        <w:t>Deploy Traffic Calming:</w:t>
+      </w:r>
+      <w:r>
+        <w:t xml:space="preserve"> Install speed humps, raised crossings, and chicanes on secondary urban roads with speeds &gt;50 km/h.</w:t>
+      </w:r>
+    </w:p>
+    <w:p>
+      <w:pPr>
+        <w:spacing w:after="60"/>
+        <w:ind w:left="360"/>
+      </w:pPr>
+      <w:r>
+        <w:t xml:space="preserve">3. </w:t>
+      </w:r>
+      <w:r>
+        <w:rPr>
+          <w:b/>
+        </w:rPr>
+        <w:t>Enhance Pedestrian Infrastructure:</w:t>
+      </w:r>
+      <w:r>
+        <w:t xml:space="preserve"> Build marked crossings and pedestrian refuges on high-exposure segments near schools and markets.</w:t>
+      </w:r>
+    </w:p>
+    <w:p>
+      <w:pPr>
+        <w:pStyle w:val="Heading3"/>
+        <w:keepNext/>
+        <w:spacing w:before="200" w:after="40"/>
+      </w:pPr>
+      <w:r>
+        <w:rPr>
+          <w:rFonts w:ascii="Calibri" w:hAnsi="Calibri"/>
+          <w:b/>
+          <w:color w:val="555555"/>
+          <w:sz w:val="24"/>
+        </w:rPr>
+        <w:t>4.2 Medium-Term Actions (High Tier — 19,313 km)</w:t>
+      </w:r>
+    </w:p>
+    <w:p>
+      <w:pPr>
+        <w:spacing w:after="60"/>
+        <w:ind w:left="360"/>
+      </w:pPr>
+      <w:r>
+        <w:t xml:space="preserve">4. </w:t>
+      </w:r>
+      <w:r>
+        <w:rPr>
+          <w:b/>
+        </w:rPr>
+        <w:t>Reclassify Road Hierarchies:</w:t>
+      </w:r>
+      <w:r>
+        <w:t xml:space="preserve"> Re-align speed limits where road function (e.g., local access) conflicts with high classification limits.</w:t>
+      </w:r>
+    </w:p>
+    <w:p>
+      <w:pPr>
+        <w:spacing w:after="60"/>
+        <w:ind w:left="360"/>
+      </w:pPr>
+      <w:r>
+        <w:t xml:space="preserve">5. </w:t>
+      </w:r>
+      <w:r>
+        <w:rPr>
+          <w:b/>
+        </w:rPr>
+        <w:t>Target Enforcement:</w:t>
+      </w:r>
+      <w:r>
+        <w:t xml:space="preserve"> Deploy automated speed cameras at segments where operating speeds exceed limits by &gt;15 km/h.</w:t>
+      </w:r>
+    </w:p>
+    <w:p>
+      <w:pPr>
+        <w:spacing w:after="60"/>
+        <w:ind w:left="360"/>
+      </w:pPr>
+      <w:r>
+        <w:t xml:space="preserve">6. </w:t>
+      </w:r>
+      <w:r>
+        <w:rPr>
+          <w:b/>
+        </w:rPr>
+        <w:t>Update Design Standards:</w:t>
+      </w:r>
+      <w:r>
+        <w:t xml:space="preserve"> Mandate protected pedestrian walkways and bike lanes during reconstruction of high-VRU segments.</w:t>
+      </w:r>
+    </w:p>
+    <w:p>
+      <w:pPr>
+        <w:pStyle w:val="Heading3"/>
+        <w:keepNext/>
+        <w:spacing w:before="200" w:after="40"/>
+      </w:pPr>
+      <w:r>
+        <w:rPr>
+          <w:rFonts w:ascii="Calibri" w:hAnsi="Calibri"/>
+          <w:b/>
+          <w:color w:val="555555"/>
+          <w:sz w:val="24"/>
+        </w:rPr>
+        <w:t>4.3 Systemic Reforms</w:t>
+      </w:r>
+    </w:p>
+    <w:p>
+      <w:pPr>
+        <w:spacing w:after="60"/>
+        <w:ind w:left="360"/>
+      </w:pPr>
+      <w:r>
+        <w:t xml:space="preserve">7. </w:t>
+      </w:r>
+      <w:r>
+        <w:rPr>
+          <w:b/>
+        </w:rPr>
+        <w:t>Default Context Limits:</w:t>
+      </w:r>
+      <w:r>
+        <w:t xml:space="preserve"> Adopt Safe System speeds as national defaults (e.g., 30 km/h for urban secondary roads) to shift the burden of proof.</w:t>
+      </w:r>
+    </w:p>
+    <w:p>
+      <w:pPr>
+        <w:spacing w:after="60"/>
+        <w:ind w:left="360"/>
+      </w:pPr>
+      <w:r>
+        <w:t xml:space="preserve">8. </w:t>
+      </w:r>
+      <w:r>
+        <w:rPr>
+          <w:b/>
+        </w:rPr>
+        <w:t>Institutionalise Tracking:</w:t>
+      </w:r>
+      <w:r>
+        <w:t xml:space="preserve"> Run the RoadSense pipeline quarterly to track safety improvements and target resources.</w:t>
+      </w:r>
+    </w:p>
+    <w:p>
+      <w:pPr>
+        <w:spacing w:after="60"/>
+        <w:ind w:left="360"/>
+      </w:pPr>
+      <w:r>
+        <w:t xml:space="preserve">9. </w:t>
+      </w:r>
+      <w:r>
+        <w:rPr>
+          <w:b/>
+        </w:rPr>
+        <w:t>Expand Datasets:</w:t>
+      </w:r>
+      <w:r>
+        <w:t xml:space="preserve"> Gather crash records, pedestrian counts, and street imagery to validate and refine the scoring model.</w:t>
+      </w:r>
+    </w:p>
+    <w:p>
+      <w:r>
+        <w:br w:type="page"/>
+      </w:r>
+    </w:p>
+    <w:p>
+      <w:pPr>
+        <w:pStyle w:val="Heading2"/>
+        <w:keepNext/>
+        <w:spacing w:before="280" w:after="80"/>
+      </w:pPr>
+      <w:r>
+        <w:rPr>
+          <w:rFonts w:ascii="Calibri" w:hAnsi="Calibri"/>
+          <w:b/>
+          <w:color w:val="2E5B88"/>
+          <w:sz w:val="28"/>
+        </w:rPr>
         <w:t>5. Replication in Data-Scarce Countries</w:t>
       </w:r>
     </w:p>
     <w:p>
+      <w:pPr>
+        <w:spacing w:after="120" w:line="276" w:lineRule="auto"/>
+      </w:pPr>
       <w:r>
         <w:t>The RoadSense methodology is designed for replication across Asia-Pacific. Key adaptations:</w:t>
       </w:r>
     </w:p>
     <w:tbl>
       <w:tblPr>
-        <w:tblStyle w:val="LightShading-Accent1"/>
         <w:tblW w:type="auto" w:w="0"/>
+        <w:tblLayout w:type="autofit"/>
         <w:tblLook w:firstColumn="1" w:firstRow="1" w:lastColumn="0" w:lastRow="0" w:noHBand="0" w:noVBand="1" w:val="04A0"/>
+        <w:tblBorders>
+          <w:top w:val="single" w:sz="4" w:space="0" w:color="CCCCCC"/>
+          <w:bottom w:val="single" w:sz="4" w:space="0" w:color="CCCCCC"/>
+          <w:insideH w:val="single" w:sz="4" w:space="0" w:color="E0E0E0"/>
+          <w:left w:val="none"/>
+          <w:right w:val="none"/>
+          <w:insideV w:val="none"/>
+        </w:tblBorders>
       </w:tblPr>
       <w:tblGrid>
-        <w:gridCol w:w="2880"/>
-        <w:gridCol w:w="2880"/>
-        <w:gridCol w:w="2880"/>
+        <w:gridCol w:w="3120"/>
+        <w:gridCol w:w="3120"/>
+        <w:gridCol w:w="3120"/>
       </w:tblGrid>
       <w:tr>
         <w:tc>
           <w:tcPr>
-            <w:tcW w:type="dxa" w:w="2880"/>
+            <w:tcW w:type="dxa" w:w="3120"/>
+            <w:shd w:fill="1B365D"/>
+            <w:tcMar>
+              <w:top w:w="80" w:type="dxa"/>
+              <w:bottom w:w="80" w:type="dxa"/>
+              <w:left w:w="120" w:type="dxa"/>
+              <w:right w:w="120" w:type="dxa"/>
+            </w:tcMar>
           </w:tcPr>
           <w:p>
+            <w:pPr>
+              <w:spacing w:before="80" w:after="80"/>
+            </w:pPr>
+            <w:r/>
             <w:r>
               <w:rPr>
+                <w:rFonts w:ascii="Calibri" w:hAnsi="Calibri"/>
                 <w:b/>
+                <w:color w:val="FFFFFF"/>
+                <w:sz w:val="21"/>
               </w:rPr>
               <w:t>Data Source</w:t>
             </w:r>
@@ -986,25 +2085,53 @@
         </w:tc>
         <w:tc>
           <w:tcPr>
-            <w:tcW w:type="dxa" w:w="2880"/>
+            <w:tcW w:type="dxa" w:w="3120"/>
+            <w:shd w:fill="1B365D"/>
+            <w:tcMar>
+              <w:top w:w="80" w:type="dxa"/>
+              <w:bottom w:w="80" w:type="dxa"/>
+              <w:left w:w="120" w:type="dxa"/>
+              <w:right w:w="120" w:type="dxa"/>
+            </w:tcMar>
           </w:tcPr>
           <w:p>
+            <w:pPr>
+              <w:spacing w:before="80" w:after="80"/>
+            </w:pPr>
+            <w:r/>
             <w:r>
               <w:rPr>
+                <w:rFonts w:ascii="Calibri" w:hAnsi="Calibri"/>
                 <w:b/>
+                <w:color w:val="FFFFFF"/>
+                <w:sz w:val="21"/>
               </w:rPr>
-              <w:t>If Unavailable</w:t>
+              <w:t>If unavailable</w:t>
             </w:r>
           </w:p>
         </w:tc>
         <w:tc>
           <w:tcPr>
-            <w:tcW w:type="dxa" w:w="2880"/>
+            <w:tcW w:type="dxa" w:w="3120"/>
+            <w:shd w:fill="1B365D"/>
+            <w:tcMar>
+              <w:top w:w="80" w:type="dxa"/>
+              <w:bottom w:w="80" w:type="dxa"/>
+              <w:left w:w="120" w:type="dxa"/>
+              <w:right w:w="120" w:type="dxa"/>
+            </w:tcMar>
           </w:tcPr>
           <w:p>
+            <w:pPr>
+              <w:spacing w:before="80" w:after="80"/>
+            </w:pPr>
+            <w:r/>
             <w:r>
               <w:rPr>
+                <w:rFonts w:ascii="Calibri" w:hAnsi="Calibri"/>
                 <w:b/>
+                <w:color w:val="FFFFFF"/>
+                <w:sz w:val="21"/>
               </w:rPr>
               <w:t>Alternative</w:t>
             </w:r>
@@ -1014,31 +2141,76 @@
       <w:tr>
         <w:tc>
           <w:tcPr>
-            <w:tcW w:type="dxa" w:w="2880"/>
+            <w:tcW w:type="dxa" w:w="3120"/>
+            <w:shd w:fill="F5F7FA"/>
+            <w:tcMar>
+              <w:top w:w="80" w:type="dxa"/>
+              <w:bottom w:w="80" w:type="dxa"/>
+              <w:left w:w="120" w:type="dxa"/>
+              <w:right w:w="120" w:type="dxa"/>
+            </w:tcMar>
           </w:tcPr>
           <w:p>
+            <w:pPr>
+              <w:spacing w:before="80" w:after="80"/>
+            </w:pPr>
+            <w:r/>
             <w:r>
+              <w:rPr>
+                <w:rFonts w:ascii="Calibri" w:hAnsi="Calibri"/>
+                <w:sz w:val="20"/>
+              </w:rPr>
               <w:t>GPS probe data</w:t>
             </w:r>
           </w:p>
         </w:tc>
         <w:tc>
           <w:tcPr>
-            <w:tcW w:type="dxa" w:w="2880"/>
+            <w:tcW w:type="dxa" w:w="3120"/>
+            <w:shd w:fill="F5F7FA"/>
+            <w:tcMar>
+              <w:top w:w="80" w:type="dxa"/>
+              <w:bottom w:w="80" w:type="dxa"/>
+              <w:left w:w="120" w:type="dxa"/>
+              <w:right w:w="120" w:type="dxa"/>
+            </w:tcMar>
           </w:tcPr>
           <w:p>
+            <w:pPr>
+              <w:spacing w:before="80" w:after="80"/>
+            </w:pPr>
+            <w:r/>
             <w:r>
+              <w:rPr>
+                <w:rFonts w:ascii="Calibri" w:hAnsi="Calibri"/>
+                <w:sz w:val="20"/>
+              </w:rPr>
               <w:t>Many LMICs lack probe data</w:t>
             </w:r>
           </w:p>
         </w:tc>
         <w:tc>
           <w:tcPr>
-            <w:tcW w:type="dxa" w:w="2880"/>
+            <w:tcW w:type="dxa" w:w="3120"/>
+            <w:shd w:fill="F5F7FA"/>
+            <w:tcMar>
+              <w:top w:w="80" w:type="dxa"/>
+              <w:bottom w:w="80" w:type="dxa"/>
+              <w:left w:w="120" w:type="dxa"/>
+              <w:right w:w="120" w:type="dxa"/>
+            </w:tcMar>
           </w:tcPr>
           <w:p>
+            <w:pPr>
+              <w:spacing w:before="80" w:after="80"/>
+            </w:pPr>
+            <w:r/>
             <w:r>
-              <w:t>Use OSM road classification + design speed as proxy</w:t>
+              <w:rPr>
+                <w:rFonts w:ascii="Calibri" w:hAnsi="Calibri"/>
+                <w:sz w:val="20"/>
+              </w:rPr>
+              <w:t>Use OSM road classification + design speed as proxy for operating speed</w:t>
             </w:r>
           </w:p>
         </w:tc>
@@ -1046,31 +2218,73 @@
       <w:tr>
         <w:tc>
           <w:tcPr>
-            <w:tcW w:type="dxa" w:w="2880"/>
+            <w:tcW w:type="dxa" w:w="3120"/>
+            <w:tcMar>
+              <w:top w:w="80" w:type="dxa"/>
+              <w:bottom w:w="80" w:type="dxa"/>
+              <w:left w:w="120" w:type="dxa"/>
+              <w:right w:w="120" w:type="dxa"/>
+            </w:tcMar>
           </w:tcPr>
           <w:p>
+            <w:pPr>
+              <w:spacing w:before="80" w:after="80"/>
+            </w:pPr>
+            <w:r/>
             <w:r>
+              <w:rPr>
+                <w:rFonts w:ascii="Calibri" w:hAnsi="Calibri"/>
+                <w:sz w:val="20"/>
+              </w:rPr>
               <w:t>Mapillary imagery</w:t>
             </w:r>
           </w:p>
         </w:tc>
         <w:tc>
           <w:tcPr>
-            <w:tcW w:type="dxa" w:w="2880"/>
+            <w:tcW w:type="dxa" w:w="3120"/>
+            <w:tcMar>
+              <w:top w:w="80" w:type="dxa"/>
+              <w:bottom w:w="80" w:type="dxa"/>
+              <w:left w:w="120" w:type="dxa"/>
+              <w:right w:w="120" w:type="dxa"/>
+            </w:tcMar>
           </w:tcPr>
           <w:p>
+            <w:pPr>
+              <w:spacing w:before="80" w:after="80"/>
+            </w:pPr>
+            <w:r/>
             <w:r>
+              <w:rPr>
+                <w:rFonts w:ascii="Calibri" w:hAnsi="Calibri"/>
+                <w:sz w:val="20"/>
+              </w:rPr>
               <w:t>Limited coverage</w:t>
             </w:r>
           </w:p>
         </w:tc>
         <w:tc>
           <w:tcPr>
-            <w:tcW w:type="dxa" w:w="2880"/>
+            <w:tcW w:type="dxa" w:w="3120"/>
+            <w:tcMar>
+              <w:top w:w="80" w:type="dxa"/>
+              <w:bottom w:w="80" w:type="dxa"/>
+              <w:left w:w="120" w:type="dxa"/>
+              <w:right w:w="120" w:type="dxa"/>
+            </w:tcMar>
           </w:tcPr>
           <w:p>
+            <w:pPr>
+              <w:spacing w:before="80" w:after="80"/>
+            </w:pPr>
+            <w:r/>
             <w:r>
-              <w:t>CLIP zero-shot classification on available street photos</w:t>
+              <w:rPr>
+                <w:rFonts w:ascii="Calibri" w:hAnsi="Calibri"/>
+                <w:sz w:val="20"/>
+              </w:rPr>
+              <w:t>CLIP zero-shot classification on any available street photos, or skip Module C entirely</w:t>
             </w:r>
           </w:p>
         </w:tc>
@@ -1078,31 +2292,76 @@
       <w:tr>
         <w:tc>
           <w:tcPr>
-            <w:tcW w:type="dxa" w:w="2880"/>
+            <w:tcW w:type="dxa" w:w="3120"/>
+            <w:shd w:fill="F5F7FA"/>
+            <w:tcMar>
+              <w:top w:w="80" w:type="dxa"/>
+              <w:bottom w:w="80" w:type="dxa"/>
+              <w:left w:w="120" w:type="dxa"/>
+              <w:right w:w="120" w:type="dxa"/>
+            </w:tcMar>
           </w:tcPr>
           <w:p>
+            <w:pPr>
+              <w:spacing w:before="80" w:after="80"/>
+            </w:pPr>
+            <w:r/>
             <w:r>
+              <w:rPr>
+                <w:rFonts w:ascii="Calibri" w:hAnsi="Calibri"/>
+                <w:sz w:val="20"/>
+              </w:rPr>
               <w:t>Official speed limits</w:t>
             </w:r>
           </w:p>
         </w:tc>
         <w:tc>
           <w:tcPr>
-            <w:tcW w:type="dxa" w:w="2880"/>
+            <w:tcW w:type="dxa" w:w="3120"/>
+            <w:shd w:fill="F5F7FA"/>
+            <w:tcMar>
+              <w:top w:w="80" w:type="dxa"/>
+              <w:bottom w:w="80" w:type="dxa"/>
+              <w:left w:w="120" w:type="dxa"/>
+              <w:right w:w="120" w:type="dxa"/>
+            </w:tcMar>
           </w:tcPr>
           <w:p>
+            <w:pPr>
+              <w:spacing w:before="80" w:after="80"/>
+            </w:pPr>
+            <w:r/>
             <w:r>
+              <w:rPr>
+                <w:rFonts w:ascii="Calibri" w:hAnsi="Calibri"/>
+                <w:sz w:val="20"/>
+              </w:rPr>
               <w:t>Not digitised</w:t>
             </w:r>
           </w:p>
         </w:tc>
         <w:tc>
           <w:tcPr>
-            <w:tcW w:type="dxa" w:w="2880"/>
+            <w:tcW w:type="dxa" w:w="3120"/>
+            <w:shd w:fill="F5F7FA"/>
+            <w:tcMar>
+              <w:top w:w="80" w:type="dxa"/>
+              <w:bottom w:w="80" w:type="dxa"/>
+              <w:left w:w="120" w:type="dxa"/>
+              <w:right w:w="120" w:type="dxa"/>
+            </w:tcMar>
           </w:tcPr>
           <w:p>
+            <w:pPr>
+              <w:spacing w:before="80" w:after="80"/>
+            </w:pPr>
+            <w:r/>
             <w:r>
-              <w:t>Extract from OSM maxspeed tags (~40% coverage in most countries)</w:t>
+              <w:rPr>
+                <w:rFonts w:ascii="Calibri" w:hAnsi="Calibri"/>
+                <w:sz w:val="20"/>
+              </w:rPr>
+              <w:t>Extract from OSM `maxspeed` tags (available for ~40% of roads in most countries)</w:t>
             </w:r>
           </w:p>
         </w:tc>
@@ -1110,30 +2369,72 @@
       <w:tr>
         <w:tc>
           <w:tcPr>
-            <w:tcW w:type="dxa" w:w="2880"/>
+            <w:tcW w:type="dxa" w:w="3120"/>
+            <w:tcMar>
+              <w:top w:w="80" w:type="dxa"/>
+              <w:bottom w:w="80" w:type="dxa"/>
+              <w:left w:w="120" w:type="dxa"/>
+              <w:right w:w="120" w:type="dxa"/>
+            </w:tcMar>
           </w:tcPr>
           <w:p>
+            <w:pPr>
+              <w:spacing w:before="80" w:after="80"/>
+            </w:pPr>
+            <w:r/>
             <w:r>
-              <w:t>POIs (schools, markets)</w:t>
+              <w:rPr>
+                <w:rFonts w:ascii="Calibri" w:hAnsi="Calibri"/>
+                <w:sz w:val="20"/>
+              </w:rPr>
+              <w:t>Schools / POIs</w:t>
             </w:r>
           </w:p>
         </w:tc>
         <w:tc>
           <w:tcPr>
-            <w:tcW w:type="dxa" w:w="2880"/>
+            <w:tcW w:type="dxa" w:w="3120"/>
+            <w:tcMar>
+              <w:top w:w="80" w:type="dxa"/>
+              <w:bottom w:w="80" w:type="dxa"/>
+              <w:left w:w="120" w:type="dxa"/>
+              <w:right w:w="120" w:type="dxa"/>
+            </w:tcMar>
           </w:tcPr>
           <w:p>
+            <w:pPr>
+              <w:spacing w:before="80" w:after="80"/>
+            </w:pPr>
+            <w:r/>
             <w:r>
+              <w:rPr>
+                <w:rFonts w:ascii="Calibri" w:hAnsi="Calibri"/>
+                <w:sz w:val="20"/>
+              </w:rPr>
               <w:t>Always available via OSM</w:t>
             </w:r>
           </w:p>
         </w:tc>
         <w:tc>
           <w:tcPr>
-            <w:tcW w:type="dxa" w:w="2880"/>
+            <w:tcW w:type="dxa" w:w="3120"/>
+            <w:tcMar>
+              <w:top w:w="80" w:type="dxa"/>
+              <w:bottom w:w="80" w:type="dxa"/>
+              <w:left w:w="120" w:type="dxa"/>
+              <w:right w:w="120" w:type="dxa"/>
+            </w:tcMar>
           </w:tcPr>
           <w:p>
+            <w:pPr>
+              <w:spacing w:before="80" w:after="80"/>
+            </w:pPr>
+            <w:r/>
             <w:r>
+              <w:rPr>
+                <w:rFonts w:ascii="Calibri" w:hAnsi="Calibri"/>
+                <w:sz w:val="20"/>
+              </w:rPr>
               <w:t>Overpass API provides global coverage at no cost</w:t>
             </w:r>
           </w:p>
@@ -1142,165 +2443,367 @@
       <w:tr>
         <w:tc>
           <w:tcPr>
-            <w:tcW w:type="dxa" w:w="2880"/>
+            <w:tcW w:type="dxa" w:w="3120"/>
+            <w:shd w:fill="F5F7FA"/>
+            <w:tcMar>
+              <w:top w:w="80" w:type="dxa"/>
+              <w:bottom w:w="80" w:type="dxa"/>
+              <w:left w:w="120" w:type="dxa"/>
+              <w:right w:w="120" w:type="dxa"/>
+            </w:tcMar>
           </w:tcPr>
           <w:p>
+            <w:pPr>
+              <w:spacing w:before="80" w:after="80"/>
+            </w:pPr>
+            <w:r/>
             <w:r>
+              <w:rPr>
+                <w:rFonts w:ascii="Calibri" w:hAnsi="Calibri"/>
+                <w:sz w:val="20"/>
+              </w:rPr>
               <w:t>Traffic volume data</w:t>
             </w:r>
           </w:p>
         </w:tc>
         <w:tc>
           <w:tcPr>
-            <w:tcW w:type="dxa" w:w="2880"/>
+            <w:tcW w:type="dxa" w:w="3120"/>
+            <w:shd w:fill="F5F7FA"/>
+            <w:tcMar>
+              <w:top w:w="80" w:type="dxa"/>
+              <w:bottom w:w="80" w:type="dxa"/>
+              <w:left w:w="120" w:type="dxa"/>
+              <w:right w:w="120" w:type="dxa"/>
+            </w:tcMar>
           </w:tcPr>
           <w:p>
+            <w:pPr>
+              <w:spacing w:before="80" w:after="80"/>
+            </w:pPr>
+            <w:r/>
             <w:r>
+              <w:rPr>
+                <w:rFonts w:ascii="Calibri" w:hAnsi="Calibri"/>
+                <w:sz w:val="20"/>
+              </w:rPr>
               <w:t>No volume data</w:t>
             </w:r>
           </w:p>
         </w:tc>
         <w:tc>
           <w:tcPr>
-            <w:tcW w:type="dxa" w:w="2880"/>
+            <w:tcW w:type="dxa" w:w="3120"/>
+            <w:shd w:fill="F5F7FA"/>
+            <w:tcMar>
+              <w:top w:w="80" w:type="dxa"/>
+              <w:bottom w:w="80" w:type="dxa"/>
+              <w:left w:w="120" w:type="dxa"/>
+              <w:right w:w="120" w:type="dxa"/>
+            </w:tcMar>
           </w:tcPr>
           <w:p>
+            <w:pPr>
+              <w:spacing w:before="80" w:after="80"/>
+            </w:pPr>
+            <w:r/>
             <w:r>
-              <w:t>Remove Volume component; redistribute weight to other factors</w:t>
+              <w:rPr>
+                <w:rFonts w:ascii="Calibri" w:hAnsi="Calibri"/>
+                <w:sz w:val="20"/>
+              </w:rPr>
+              <w:t>Remove Volume component from 4-component score (weight redistributed to other factors)</w:t>
             </w:r>
           </w:p>
         </w:tc>
       </w:tr>
     </w:tbl>
-    <w:p/>
     <w:p>
+      <w:pPr>
+        <w:spacing w:after="120" w:line="276" w:lineRule="auto"/>
+      </w:pPr>
       <w:r>
-        <w:t>Minimal viable deployment requires only: OSM road network, OSM speed limit tags, OSM points of interest, and any available speed data (even 50 spot speed measurements can calibrate the model).</w:t>
+        <w:t>A minimal viable deployment requires only:</w:t>
       </w:r>
     </w:p>
     <w:p>
       <w:pPr>
-        <w:pStyle w:val="Heading1"/>
+        <w:spacing w:after="60"/>
+        <w:ind w:left="360"/>
       </w:pPr>
       <w:r>
+        <w:t>1. OSM road network</w:t>
+      </w:r>
+    </w:p>
+    <w:p>
+      <w:pPr>
+        <w:spacing w:after="60"/>
+        <w:ind w:left="360"/>
+      </w:pPr>
+      <w:r>
+        <w:t>2. OSM speed limit tags</w:t>
+      </w:r>
+    </w:p>
+    <w:p>
+      <w:pPr>
+        <w:spacing w:after="60"/>
+        <w:ind w:left="360"/>
+      </w:pPr>
+      <w:r>
+        <w:t>3. OSM points of interest (schools, markets)</w:t>
+      </w:r>
+    </w:p>
+    <w:p>
+      <w:pPr>
+        <w:spacing w:after="60"/>
+        <w:ind w:left="360"/>
+      </w:pPr>
+      <w:r>
+        <w:t>4. Any available speed data (even spot speed measurements at 50 locations can calibrate the model)</w:t>
+      </w:r>
+    </w:p>
+    <w:p>
+      <w:r>
+        <w:br w:type="page"/>
+      </w:r>
+    </w:p>
+    <w:p>
+      <w:pPr>
+        <w:pStyle w:val="Heading2"/>
+        <w:keepNext/>
+        <w:spacing w:before="280" w:after="80"/>
+      </w:pPr>
+      <w:r>
+        <w:rPr>
+          <w:rFonts w:ascii="Calibri" w:hAnsi="Calibri"/>
+          <w:b/>
+          <w:color w:val="2E5B88"/>
+          <w:sz w:val="28"/>
+        </w:rPr>
         <w:t>6. Validation &amp; Limitations</w:t>
       </w:r>
     </w:p>
     <w:p>
       <w:pPr>
-        <w:pStyle w:val="Heading2"/>
+        <w:pStyle w:val="Heading3"/>
+        <w:keepNext/>
+        <w:spacing w:before="200" w:after="40"/>
       </w:pPr>
       <w:r>
+        <w:rPr>
+          <w:rFonts w:ascii="Calibri" w:hAnsi="Calibri"/>
+          <w:b/>
+          <w:color w:val="555555"/>
+          <w:sz w:val="24"/>
+        </w:rPr>
         <w:t>Validation</w:t>
       </w:r>
     </w:p>
     <w:p>
       <w:pPr>
         <w:pStyle w:val="ListBullet"/>
+        <w:spacing w:after="60"/>
       </w:pPr>
+      <w:r/>
       <w:r>
-        <w:t>Internal consistency: Both scoring approaches produce correlated rankings (r &gt; 0.85), confirming robustness to weighting choices.</w:t>
+        <w:rPr>
+          <w:b/>
+        </w:rPr>
+        <w:t>Internal consistency:</w:t>
+      </w:r>
+      <w:r>
+        <w:t xml:space="preserve"> Both scoring approaches produce correlated rankings (r &gt; 0.85), confirming the methodology is robust to weighting choices.</w:t>
       </w:r>
     </w:p>
     <w:p>
       <w:pPr>
         <w:pStyle w:val="ListBullet"/>
+        <w:spacing w:after="60"/>
       </w:pPr>
+      <w:r/>
       <w:r>
-        <w:t>Spatial autocorrelation: Moran's I confirms high-risk segments cluster spatially (p &lt; 0.01), validating the score captures genuine geographic patterns.</w:t>
+        <w:rPr>
+          <w:b/>
+        </w:rPr>
+        <w:t>Spatial autocorrelation:</w:t>
+      </w:r>
+      <w:r>
+        <w:t xml:space="preserve"> Moran's I analysis confirms that high-risk segments cluster spatially (p &lt; 0.01), validating that the score captures genuine geographic patterns rather than noise.</w:t>
       </w:r>
     </w:p>
     <w:p>
       <w:pPr>
         <w:pStyle w:val="ListBullet"/>
+        <w:spacing w:after="60"/>
+      </w:pPr>
+      <w:r/>
+      <w:r>
+        <w:rPr>
+          <w:b/>
+        </w:rPr>
+        <w:t>Sensitivity analysis:</w:t>
+      </w:r>
+      <w:r>
+        <w:t xml:space="preserve"> Varying component weights by ±10% changes absolute scores but preserves &gt;95% of tier classifications, showing the tier system is stable.</w:t>
+      </w:r>
+    </w:p>
+    <w:p>
+      <w:pPr>
+        <w:pStyle w:val="Heading3"/>
+        <w:keepNext/>
+        <w:spacing w:before="200" w:after="40"/>
       </w:pPr>
       <w:r>
-        <w:t>Sensitivity analysis: Varying component weights by ±10% preserves &gt;95% of tier classifications.</w:t>
+        <w:rPr>
+          <w:rFonts w:ascii="Calibri" w:hAnsi="Calibri"/>
+          <w:b/>
+          <w:color w:val="555555"/>
+          <w:sz w:val="24"/>
+        </w:rPr>
+        <w:t>Limitations</w:t>
+      </w:r>
+    </w:p>
+    <w:p>
+      <w:pPr>
+        <w:spacing w:after="60"/>
+        <w:ind w:left="360"/>
+      </w:pPr>
+      <w:r>
+        <w:t xml:space="preserve">1. </w:t>
+      </w:r>
+      <w:r>
+        <w:rPr>
+          <w:b/>
+        </w:rPr>
+        <w:t>No crash data validation.</w:t>
+      </w:r>
+      <w:r>
+        <w:t xml:space="preserve"> The ADB challenge dataset does not include crash records. The score measures *risk factors* (speed, exposure, infrastructure proxies) rather than *observed crashes*. This is a deliberate Safe System design choice — we measure what makes roads dangerous, not what has already killed people.</w:t>
+      </w:r>
+    </w:p>
+    <w:p>
+      <w:pPr>
+        <w:spacing w:after="60"/>
+        <w:ind w:left="360"/>
+      </w:pPr>
+      <w:r>
+        <w:t xml:space="preserve">2. </w:t>
+      </w:r>
+      <w:r>
+        <w:rPr>
+          <w:b/>
+        </w:rPr>
+        <w:t>Imagery coverage gaps.</w:t>
+      </w:r>
+      <w:r>
+        <w:t xml:space="preserve"> Module C relies on infrastructure proxies (road class + land use lookups) rather than actual infrastructure detection. Full Mapillary/CLIP integration would improve Module C accuracy.</w:t>
+      </w:r>
+    </w:p>
+    <w:p>
+      <w:pPr>
+        <w:spacing w:after="60"/>
+        <w:ind w:left="360"/>
+      </w:pPr>
+      <w:r>
+        <w:t xml:space="preserve">3. </w:t>
+      </w:r>
+      <w:r>
+        <w:rPr>
+          <w:b/>
+        </w:rPr>
+        <w:t>Sample size bias.</w:t>
+      </w:r>
+      <w:r>
+        <w:t xml:space="preserve"> Segments with small sample sizes (&lt;500 observations) are excluded. This may bias results toward higher-volume roads.</w:t>
+      </w:r>
+    </w:p>
+    <w:p>
+      <w:pPr>
+        <w:spacing w:after="60"/>
+        <w:ind w:left="360"/>
+      </w:pPr>
+      <w:r>
+        <w:t xml:space="preserve">4. </w:t>
+      </w:r>
+      <w:r>
+        <w:rPr>
+          <w:b/>
+        </w:rPr>
+        <w:t>Single time period.</w:t>
+      </w:r>
+      <w:r>
+        <w:t xml:space="preserve"> The data represents one observation period. Seasonal and temporal variations in speed and volume are not captured.</w:t>
+      </w:r>
+    </w:p>
+    <w:p>
+      <w:r>
+        <w:br w:type="page"/>
       </w:r>
     </w:p>
     <w:p>
       <w:pPr>
         <w:pStyle w:val="Heading2"/>
+        <w:keepNext/>
+        <w:spacing w:before="280" w:after="80"/>
       </w:pPr>
       <w:r>
-        <w:t>Limitations</w:t>
+        <w:rPr>
+          <w:rFonts w:ascii="Calibri" w:hAnsi="Calibri"/>
+          <w:b/>
+          <w:color w:val="2E5B88"/>
+          <w:sz w:val="28"/>
+        </w:rPr>
+        <w:t>References</w:t>
       </w:r>
     </w:p>
     <w:p>
       <w:pPr>
         <w:pStyle w:val="ListBullet"/>
+        <w:spacing w:after="60"/>
       </w:pPr>
       <w:r>
-        <w:t>No crash data validation. The score measures risk factors (speed, exposure, infrastructure proxies) rather than observed crashes — a deliberate Safe System design choice.</w:t>
+        <w:t>World Health Organization. (2021). *Global Plan for the Decade of Action for Road Safety 2021–2030*. Geneva: WHO.</w:t>
       </w:r>
     </w:p>
     <w:p>
       <w:pPr>
         <w:pStyle w:val="ListBullet"/>
+        <w:spacing w:after="60"/>
       </w:pPr>
       <w:r>
-        <w:t>Imagery coverage gaps. Module C relies on infrastructure proxies rather than actual infrastructure detection. Full Mapillary/CLIP integration would improve accuracy.</w:t>
+        <w:t>ITF/OECD. (2018). *Speed and Crash Risk*. International Transport Forum Research Report. Paris: OECD Publishing.</w:t>
       </w:r>
     </w:p>
     <w:p>
       <w:pPr>
         <w:pStyle w:val="ListBullet"/>
+        <w:spacing w:after="60"/>
       </w:pPr>
       <w:r>
-        <w:t>Sample size bias. Segments with &lt;500 observations are excluded, potentially biasing toward higher-volume roads.</w:t>
+        <w:t>Asian Development Bank. (2026). *AI for Safer Roads 2026 — Speed and Volume Data for Thailand and Maharashtra*. ADB Challenge Dataset.</w:t>
       </w:r>
     </w:p>
     <w:p>
       <w:pPr>
         <w:pStyle w:val="ListBullet"/>
-      </w:pPr>
-      <w:r>
-        <w:t>Single time period. Seasonal and temporal speed/volume variations are not captured.</w:t>
-      </w:r>
-    </w:p>
-    <w:p>
-      <w:pPr>
-        <w:pStyle w:val="Heading1"/>
-      </w:pPr>
-      <w:r>
-        <w:t>References</w:t>
-      </w:r>
-    </w:p>
-    <w:p>
-      <w:pPr>
-        <w:pStyle w:val="ListNumber"/>
-      </w:pPr>
-      <w:r>
-        <w:t>World Health Organization. (2021). Global Plan for the Decade of Action for Road Safety 2021–2030. Geneva: WHO.</w:t>
-      </w:r>
-    </w:p>
-    <w:p>
-      <w:pPr>
-        <w:pStyle w:val="ListNumber"/>
-      </w:pPr>
-      <w:r>
-        <w:t>ITF/OECD. (2018). Speed and Crash Risk. International Transport Forum Research Report. Paris: OECD Publishing.</w:t>
-      </w:r>
-    </w:p>
-    <w:p>
-      <w:pPr>
-        <w:pStyle w:val="ListNumber"/>
-      </w:pPr>
-      <w:r>
-        <w:t>Asian Development Bank. (2026). AI for Safer Roads 2026 — Speed and Volume Data for Thailand and Maharashtra.</w:t>
-      </w:r>
-    </w:p>
-    <w:p>
-      <w:pPr>
-        <w:pStyle w:val="ListNumber"/>
+        <w:spacing w:after="60"/>
       </w:pPr>
       <w:r>
         <w:t>OpenStreetMap contributors. (2026). Planet dump. https://planet.openstreetmap.org</w:t>
       </w:r>
     </w:p>
+    <w:p>
+      <w:pPr>
+        <w:pStyle w:val="ListBullet"/>
+        <w:spacing w:after="60"/>
+      </w:pPr>
+      <w:r>
+        <w:t>Mapillary. (2026). Mapillary street-level imagery and computer vision detections. https://www.mapillary.com</w:t>
+      </w:r>
+    </w:p>
     <w:sectPr>
       <w:pgSz w:w="12240" w:h="15840"/>
-      <w:pgMar w:top="1440" w:right="1800" w:bottom="1440" w:left="1800" w:header="720" w:footer="720" w:gutter="0"/>
+      <w:pgMar w:top="1440" w:right="1440" w:bottom="1440" w:left="1440" w:header="720" w:footer="720" w:gutter="0"/>
       <w:cols w:space="720"/>
       <w:docGrid w:linePitch="360"/>
     </w:sectPr>
@@ -1673,6 +3176,7 @@
     <w:rsid w:val="00FC693F"/>
     <w:rPr>
       <w:rFonts w:ascii="Calibri" w:hAnsi="Calibri"/>
+      <w:color w:val="333333"/>
       <w:sz w:val="22"/>
     </w:rPr>
   </w:style>

</xml_diff>

<commit_message>
fix: shrink DOCX to 4 pages, gitignore + untrack Archive xlsx
</commit_message>
<xml_diff>
--- a/docs/findings_summary.docx
+++ b/docs/findings_summary.docx
@@ -6,14 +6,14 @@
       <w:pPr>
         <w:pStyle w:val="Heading1"/>
         <w:keepNext/>
-        <w:spacing w:before="360" w:after="120"/>
+        <w:spacing w:before="200" w:after="60"/>
       </w:pPr>
       <w:r>
         <w:rPr>
           <w:rFonts w:ascii="Calibri" w:hAnsi="Calibri"/>
           <w:b/>
           <w:color w:val="1B365D"/>
-          <w:sz w:val="36"/>
+          <w:sz w:val="30"/>
         </w:rPr>
         <w:t>RoadSense: Speed Safety Score for Safer Roads</w:t>
       </w:r>
@@ -22,21 +22,21 @@
       <w:pPr>
         <w:pStyle w:val="Heading2"/>
         <w:keepNext/>
-        <w:spacing w:before="280" w:after="80"/>
+        <w:spacing w:before="160" w:after="40"/>
       </w:pPr>
       <w:r>
         <w:rPr>
           <w:rFonts w:ascii="Calibri" w:hAnsi="Calibri"/>
           <w:b/>
           <w:color w:val="2E5B88"/>
-          <w:sz w:val="28"/>
+          <w:sz w:val="24"/>
         </w:rPr>
         <w:t>Findings Summary</w:t>
       </w:r>
     </w:p>
     <w:p>
       <w:pPr>
-        <w:spacing w:after="120" w:line="276" w:lineRule="auto"/>
+        <w:spacing w:after="60" w:line="240" w:lineRule="auto"/>
       </w:pPr>
       <w:r/>
       <w:r>
@@ -51,7 +51,7 @@
     </w:p>
     <w:p>
       <w:pPr>
-        <w:spacing w:after="120" w:line="276" w:lineRule="auto"/>
+        <w:spacing w:after="60" w:line="240" w:lineRule="auto"/>
       </w:pPr>
       <w:r/>
       <w:r>
@@ -66,7 +66,7 @@
     </w:p>
     <w:p>
       <w:pPr>
-        <w:spacing w:after="120" w:line="276" w:lineRule="auto"/>
+        <w:spacing w:after="60" w:line="240" w:lineRule="auto"/>
       </w:pPr>
       <w:r/>
       <w:r>
@@ -81,8 +81,8 @@
     </w:p>
     <w:p>
       <w:pPr>
-        <w:spacing w:before="120" w:after="120"/>
-        <w:ind w:left="576"/>
+        <w:spacing w:before="60" w:after="60"/>
+        <w:ind w:left="432"/>
       </w:pPr>
       <w:r>
         <w:rPr>
@@ -93,29 +93,32 @@
       </w:r>
     </w:p>
     <w:p>
-      <w:r>
-        <w:br w:type="page"/>
-      </w:r>
+      <w:pPr>
+        <w:spacing w:before="80" w:after="80"/>
+        <w:pBdr>
+          <w:bottom w:val="single" w:sz="6" w:space="1" w:color="CCCCCC"/>
+        </w:pBdr>
+      </w:pPr>
     </w:p>
     <w:p>
       <w:pPr>
         <w:pStyle w:val="Heading2"/>
         <w:keepNext/>
-        <w:spacing w:before="280" w:after="80"/>
+        <w:spacing w:before="160" w:after="40"/>
       </w:pPr>
       <w:r>
         <w:rPr>
           <w:rFonts w:ascii="Calibri" w:hAnsi="Calibri"/>
           <w:b/>
           <w:color w:val="2E5B88"/>
-          <w:sz w:val="28"/>
+          <w:sz w:val="24"/>
         </w:rPr>
         <w:t>1. Executive Summary</w:t>
       </w:r>
     </w:p>
     <w:p>
       <w:pPr>
-        <w:spacing w:after="120" w:line="276" w:lineRule="auto"/>
+        <w:spacing w:after="60" w:line="240" w:lineRule="auto"/>
       </w:pPr>
       <w:r>
         <w:t>RoadSense analyzes 14,793 road segments across Thailand and Maharashtra using GPS probe data, road network geometry, and street-level imagery to produce a Speed Safety Score (0–1) for every segment. The score measures how well posted speed limits align with the Safe System approach — the principle that human bodies can only withstand impact speeds of 30–50 km/h depending on road context.</w:t>
@@ -123,7 +126,7 @@
     </w:p>
     <w:p>
       <w:pPr>
-        <w:spacing w:after="120" w:line="276" w:lineRule="auto"/>
+        <w:spacing w:after="60" w:line="240" w:lineRule="auto"/>
       </w:pPr>
       <w:r/>
       <w:r>
@@ -137,29 +140,32 @@
       </w:r>
     </w:p>
     <w:p>
-      <w:r>
-        <w:br w:type="page"/>
-      </w:r>
+      <w:pPr>
+        <w:spacing w:before="80" w:after="80"/>
+        <w:pBdr>
+          <w:bottom w:val="single" w:sz="6" w:space="1" w:color="CCCCCC"/>
+        </w:pBdr>
+      </w:pPr>
     </w:p>
     <w:p>
       <w:pPr>
         <w:pStyle w:val="Heading2"/>
         <w:keepNext/>
-        <w:spacing w:before="280" w:after="80"/>
+        <w:spacing w:before="160" w:after="40"/>
       </w:pPr>
       <w:r>
         <w:rPr>
           <w:rFonts w:ascii="Calibri" w:hAnsi="Calibri"/>
           <w:b/>
           <w:color w:val="2E5B88"/>
-          <w:sz w:val="28"/>
+          <w:sz w:val="24"/>
         </w:rPr>
         <w:t>2. Methodology Overview</w:t>
       </w:r>
     </w:p>
     <w:p>
       <w:pPr>
-        <w:spacing w:after="120" w:line="276" w:lineRule="auto"/>
+        <w:spacing w:after="60" w:line="240" w:lineRule="auto"/>
       </w:pPr>
       <w:r>
         <w:t>RoadSense evaluates speed safety using two complementary approaches:</w:t>
@@ -169,21 +175,21 @@
       <w:pPr>
         <w:pStyle w:val="Heading3"/>
         <w:keepNext/>
-        <w:spacing w:before="200" w:after="40"/>
+        <w:spacing w:before="120" w:after="20"/>
       </w:pPr>
       <w:r>
         <w:rPr>
           <w:rFonts w:ascii="Calibri" w:hAnsi="Calibri"/>
           <w:b/>
           <w:color w:val="555555"/>
-          <w:sz w:val="24"/>
+          <w:sz w:val="22"/>
         </w:rPr>
         <w:t>4-Component Composite Score</w:t>
       </w:r>
     </w:p>
     <w:p>
       <w:pPr>
-        <w:spacing w:after="120" w:line="276" w:lineRule="auto"/>
+        <w:spacing w:after="60" w:line="240" w:lineRule="auto"/>
       </w:pPr>
       <w:r>
         <w:t>Computes a weighted average of four risk factors:</w:t>
@@ -192,7 +198,7 @@
     <w:p>
       <w:pPr>
         <w:pStyle w:val="ListBullet"/>
-        <w:spacing w:after="60"/>
+        <w:spacing w:after="20"/>
       </w:pPr>
       <w:r/>
       <w:r>
@@ -208,7 +214,7 @@
     <w:p>
       <w:pPr>
         <w:pStyle w:val="ListBullet"/>
-        <w:spacing w:after="60"/>
+        <w:spacing w:after="20"/>
       </w:pPr>
       <w:r/>
       <w:r>
@@ -224,7 +230,7 @@
     <w:p>
       <w:pPr>
         <w:pStyle w:val="ListBullet"/>
-        <w:spacing w:after="60"/>
+        <w:spacing w:after="20"/>
       </w:pPr>
       <w:r/>
       <w:r>
@@ -240,7 +246,7 @@
     <w:p>
       <w:pPr>
         <w:pStyle w:val="ListBullet"/>
-        <w:spacing w:after="60"/>
+        <w:spacing w:after="20"/>
       </w:pPr>
       <w:r/>
       <w:r>
@@ -257,21 +263,21 @@
       <w:pPr>
         <w:pStyle w:val="Heading3"/>
         <w:keepNext/>
-        <w:spacing w:before="200" w:after="40"/>
+        <w:spacing w:before="120" w:after="20"/>
       </w:pPr>
       <w:r>
         <w:rPr>
           <w:rFonts w:ascii="Calibri" w:hAnsi="Calibri"/>
           <w:b/>
           <w:color w:val="555555"/>
-          <w:sz w:val="24"/>
+          <w:sz w:val="22"/>
         </w:rPr>
         <w:t>3-Module RoadSense Score</w:t>
       </w:r>
     </w:p>
     <w:p>
       <w:pPr>
-        <w:spacing w:after="120" w:line="276" w:lineRule="auto"/>
+        <w:spacing w:after="60" w:line="240" w:lineRule="auto"/>
       </w:pPr>
       <w:r>
         <w:t>A modular index grouping risk by context:</w:t>
@@ -280,7 +286,7 @@
     <w:p>
       <w:pPr>
         <w:pStyle w:val="ListBullet"/>
-        <w:spacing w:after="60"/>
+        <w:spacing w:after="20"/>
       </w:pPr>
       <w:r/>
       <w:r>
@@ -296,7 +302,7 @@
     <w:p>
       <w:pPr>
         <w:pStyle w:val="ListBullet"/>
-        <w:spacing w:after="60"/>
+        <w:spacing w:after="20"/>
       </w:pPr>
       <w:r/>
       <w:r>
@@ -312,7 +318,7 @@
     <w:p>
       <w:pPr>
         <w:pStyle w:val="ListBullet"/>
-        <w:spacing w:after="60"/>
+        <w:spacing w:after="20"/>
       </w:pPr>
       <w:r/>
       <w:r>
@@ -327,7 +333,7 @@
     </w:p>
     <w:p>
       <w:pPr>
-        <w:spacing w:after="120" w:line="276" w:lineRule="auto"/>
+        <w:spacing w:after="60" w:line="240" w:lineRule="auto"/>
       </w:pPr>
       <w:r>
         <w:t>Both approaches produce scores in [0, 1] classified into four tiers:</w:t>
@@ -348,25 +354,25 @@
         </w:tblBorders>
       </w:tblPr>
       <w:tblGrid>
-        <w:gridCol w:w="3120"/>
-        <w:gridCol w:w="3120"/>
-        <w:gridCol w:w="3120"/>
+        <w:gridCol w:w="3360"/>
+        <w:gridCol w:w="3360"/>
+        <w:gridCol w:w="3360"/>
       </w:tblGrid>
       <w:tr>
         <w:tc>
           <w:tcPr>
-            <w:tcW w:type="dxa" w:w="3120"/>
+            <w:tcW w:type="dxa" w:w="3360"/>
             <w:shd w:fill="1B365D"/>
             <w:tcMar>
-              <w:top w:w="80" w:type="dxa"/>
-              <w:bottom w:w="80" w:type="dxa"/>
-              <w:left w:w="120" w:type="dxa"/>
-              <w:right w:w="120" w:type="dxa"/>
+              <w:top w:w="30" w:type="dxa"/>
+              <w:bottom w:w="30" w:type="dxa"/>
+              <w:left w:w="60" w:type="dxa"/>
+              <w:right w:w="60" w:type="dxa"/>
             </w:tcMar>
           </w:tcPr>
           <w:p>
             <w:pPr>
-              <w:spacing w:before="80" w:after="80"/>
+              <w:spacing w:before="20" w:after="20"/>
             </w:pPr>
             <w:r/>
             <w:r>
@@ -374,7 +380,7 @@
                 <w:rFonts w:ascii="Calibri" w:hAnsi="Calibri"/>
                 <w:b/>
                 <w:color w:val="FFFFFF"/>
-                <w:sz w:val="21"/>
+                <w:sz w:val="18"/>
               </w:rPr>
               <w:t>Tier</w:t>
             </w:r>
@@ -382,18 +388,18 @@
         </w:tc>
         <w:tc>
           <w:tcPr>
-            <w:tcW w:type="dxa" w:w="3120"/>
+            <w:tcW w:type="dxa" w:w="3360"/>
             <w:shd w:fill="1B365D"/>
             <w:tcMar>
-              <w:top w:w="80" w:type="dxa"/>
-              <w:bottom w:w="80" w:type="dxa"/>
-              <w:left w:w="120" w:type="dxa"/>
-              <w:right w:w="120" w:type="dxa"/>
+              <w:top w:w="30" w:type="dxa"/>
+              <w:bottom w:w="30" w:type="dxa"/>
+              <w:left w:w="60" w:type="dxa"/>
+              <w:right w:w="60" w:type="dxa"/>
             </w:tcMar>
           </w:tcPr>
           <w:p>
             <w:pPr>
-              <w:spacing w:before="80" w:after="80"/>
+              <w:spacing w:before="20" w:after="20"/>
             </w:pPr>
             <w:r/>
             <w:r>
@@ -401,7 +407,7 @@
                 <w:rFonts w:ascii="Calibri" w:hAnsi="Calibri"/>
                 <w:b/>
                 <w:color w:val="FFFFFF"/>
-                <w:sz w:val="21"/>
+                <w:sz w:val="18"/>
               </w:rPr>
               <w:t>Score Range</w:t>
             </w:r>
@@ -409,18 +415,18 @@
         </w:tc>
         <w:tc>
           <w:tcPr>
-            <w:tcW w:type="dxa" w:w="3120"/>
+            <w:tcW w:type="dxa" w:w="3360"/>
             <w:shd w:fill="1B365D"/>
             <w:tcMar>
-              <w:top w:w="80" w:type="dxa"/>
-              <w:bottom w:w="80" w:type="dxa"/>
-              <w:left w:w="120" w:type="dxa"/>
-              <w:right w:w="120" w:type="dxa"/>
+              <w:top w:w="30" w:type="dxa"/>
+              <w:bottom w:w="30" w:type="dxa"/>
+              <w:left w:w="60" w:type="dxa"/>
+              <w:right w:w="60" w:type="dxa"/>
             </w:tcMar>
           </w:tcPr>
           <w:p>
             <w:pPr>
-              <w:spacing w:before="80" w:after="80"/>
+              <w:spacing w:before="20" w:after="20"/>
             </w:pPr>
             <w:r/>
             <w:r>
@@ -428,7 +434,7 @@
                 <w:rFonts w:ascii="Calibri" w:hAnsi="Calibri"/>
                 <w:b/>
                 <w:color w:val="FFFFFF"/>
-                <w:sz w:val="21"/>
+                <w:sz w:val="18"/>
               </w:rPr>
               <w:t>Action Required</w:t>
             </w:r>
@@ -438,24 +444,24 @@
       <w:tr>
         <w:tc>
           <w:tcPr>
-            <w:tcW w:type="dxa" w:w="3120"/>
+            <w:tcW w:type="dxa" w:w="3360"/>
             <w:shd w:fill="F5F7FA"/>
             <w:tcMar>
-              <w:top w:w="80" w:type="dxa"/>
-              <w:bottom w:w="80" w:type="dxa"/>
-              <w:left w:w="120" w:type="dxa"/>
-              <w:right w:w="120" w:type="dxa"/>
+              <w:top w:w="30" w:type="dxa"/>
+              <w:bottom w:w="30" w:type="dxa"/>
+              <w:left w:w="60" w:type="dxa"/>
+              <w:right w:w="60" w:type="dxa"/>
             </w:tcMar>
           </w:tcPr>
           <w:p>
             <w:pPr>
-              <w:spacing w:before="80" w:after="80"/>
+              <w:spacing w:before="20" w:after="20"/>
             </w:pPr>
             <w:r/>
             <w:r>
               <w:rPr>
                 <w:rFonts w:ascii="Calibri" w:hAnsi="Calibri"/>
-                <w:sz w:val="20"/>
+                <w:sz w:val="17"/>
               </w:rPr>
               <w:t>Critical</w:t>
             </w:r>
@@ -463,24 +469,24 @@
         </w:tc>
         <w:tc>
           <w:tcPr>
-            <w:tcW w:type="dxa" w:w="3120"/>
+            <w:tcW w:type="dxa" w:w="3360"/>
             <w:shd w:fill="F5F7FA"/>
             <w:tcMar>
-              <w:top w:w="80" w:type="dxa"/>
-              <w:bottom w:w="80" w:type="dxa"/>
-              <w:left w:w="120" w:type="dxa"/>
-              <w:right w:w="120" w:type="dxa"/>
+              <w:top w:w="30" w:type="dxa"/>
+              <w:bottom w:w="30" w:type="dxa"/>
+              <w:left w:w="60" w:type="dxa"/>
+              <w:right w:w="60" w:type="dxa"/>
             </w:tcMar>
           </w:tcPr>
           <w:p>
             <w:pPr>
-              <w:spacing w:before="80" w:after="80"/>
+              <w:spacing w:before="20" w:after="20"/>
             </w:pPr>
             <w:r/>
             <w:r>
               <w:rPr>
                 <w:rFonts w:ascii="Calibri" w:hAnsi="Calibri"/>
-                <w:sz w:val="20"/>
+                <w:sz w:val="17"/>
               </w:rPr>
               <w:t>≥ 0.65</w:t>
             </w:r>
@@ -488,24 +494,24 @@
         </w:tc>
         <w:tc>
           <w:tcPr>
-            <w:tcW w:type="dxa" w:w="3120"/>
+            <w:tcW w:type="dxa" w:w="3360"/>
             <w:shd w:fill="F5F7FA"/>
             <w:tcMar>
-              <w:top w:w="80" w:type="dxa"/>
-              <w:bottom w:w="80" w:type="dxa"/>
-              <w:left w:w="120" w:type="dxa"/>
-              <w:right w:w="120" w:type="dxa"/>
+              <w:top w:w="30" w:type="dxa"/>
+              <w:bottom w:w="30" w:type="dxa"/>
+              <w:left w:w="60" w:type="dxa"/>
+              <w:right w:w="60" w:type="dxa"/>
             </w:tcMar>
           </w:tcPr>
           <w:p>
             <w:pPr>
-              <w:spacing w:before="80" w:after="80"/>
+              <w:spacing w:before="20" w:after="20"/>
             </w:pPr>
             <w:r/>
             <w:r>
               <w:rPr>
                 <w:rFonts w:ascii="Calibri" w:hAnsi="Calibri"/>
-                <w:sz w:val="20"/>
+                <w:sz w:val="17"/>
               </w:rPr>
               <w:t>Immediate Safe System intervention</w:t>
             </w:r>
@@ -515,23 +521,23 @@
       <w:tr>
         <w:tc>
           <w:tcPr>
-            <w:tcW w:type="dxa" w:w="3120"/>
+            <w:tcW w:type="dxa" w:w="3360"/>
             <w:tcMar>
-              <w:top w:w="80" w:type="dxa"/>
-              <w:bottom w:w="80" w:type="dxa"/>
-              <w:left w:w="120" w:type="dxa"/>
-              <w:right w:w="120" w:type="dxa"/>
+              <w:top w:w="30" w:type="dxa"/>
+              <w:bottom w:w="30" w:type="dxa"/>
+              <w:left w:w="60" w:type="dxa"/>
+              <w:right w:w="60" w:type="dxa"/>
             </w:tcMar>
           </w:tcPr>
           <w:p>
             <w:pPr>
-              <w:spacing w:before="80" w:after="80"/>
+              <w:spacing w:before="20" w:after="20"/>
             </w:pPr>
             <w:r/>
             <w:r>
               <w:rPr>
                 <w:rFonts w:ascii="Calibri" w:hAnsi="Calibri"/>
-                <w:sz w:val="20"/>
+                <w:sz w:val="17"/>
               </w:rPr>
               <w:t>High</w:t>
             </w:r>
@@ -539,23 +545,23 @@
         </w:tc>
         <w:tc>
           <w:tcPr>
-            <w:tcW w:type="dxa" w:w="3120"/>
+            <w:tcW w:type="dxa" w:w="3360"/>
             <w:tcMar>
-              <w:top w:w="80" w:type="dxa"/>
-              <w:bottom w:w="80" w:type="dxa"/>
-              <w:left w:w="120" w:type="dxa"/>
-              <w:right w:w="120" w:type="dxa"/>
+              <w:top w:w="30" w:type="dxa"/>
+              <w:bottom w:w="30" w:type="dxa"/>
+              <w:left w:w="60" w:type="dxa"/>
+              <w:right w:w="60" w:type="dxa"/>
             </w:tcMar>
           </w:tcPr>
           <w:p>
             <w:pPr>
-              <w:spacing w:before="80" w:after="80"/>
+              <w:spacing w:before="20" w:after="20"/>
             </w:pPr>
             <w:r/>
             <w:r>
               <w:rPr>
                 <w:rFonts w:ascii="Calibri" w:hAnsi="Calibri"/>
-                <w:sz w:val="20"/>
+                <w:sz w:val="17"/>
               </w:rPr>
               <w:t>0.45 – 0.65</w:t>
             </w:r>
@@ -563,23 +569,23 @@
         </w:tc>
         <w:tc>
           <w:tcPr>
-            <w:tcW w:type="dxa" w:w="3120"/>
+            <w:tcW w:type="dxa" w:w="3360"/>
             <w:tcMar>
-              <w:top w:w="80" w:type="dxa"/>
-              <w:bottom w:w="80" w:type="dxa"/>
-              <w:left w:w="120" w:type="dxa"/>
-              <w:right w:w="120" w:type="dxa"/>
+              <w:top w:w="30" w:type="dxa"/>
+              <w:bottom w:w="30" w:type="dxa"/>
+              <w:left w:w="60" w:type="dxa"/>
+              <w:right w:w="60" w:type="dxa"/>
             </w:tcMar>
           </w:tcPr>
           <w:p>
             <w:pPr>
-              <w:spacing w:before="80" w:after="80"/>
+              <w:spacing w:before="20" w:after="20"/>
             </w:pPr>
             <w:r/>
             <w:r>
               <w:rPr>
                 <w:rFonts w:ascii="Calibri" w:hAnsi="Calibri"/>
-                <w:sz w:val="20"/>
+                <w:sz w:val="17"/>
               </w:rPr>
               <w:t>Priority review and countermeasure design</w:t>
             </w:r>
@@ -589,24 +595,24 @@
       <w:tr>
         <w:tc>
           <w:tcPr>
-            <w:tcW w:type="dxa" w:w="3120"/>
+            <w:tcW w:type="dxa" w:w="3360"/>
             <w:shd w:fill="F5F7FA"/>
             <w:tcMar>
-              <w:top w:w="80" w:type="dxa"/>
-              <w:bottom w:w="80" w:type="dxa"/>
-              <w:left w:w="120" w:type="dxa"/>
-              <w:right w:w="120" w:type="dxa"/>
+              <w:top w:w="30" w:type="dxa"/>
+              <w:bottom w:w="30" w:type="dxa"/>
+              <w:left w:w="60" w:type="dxa"/>
+              <w:right w:w="60" w:type="dxa"/>
             </w:tcMar>
           </w:tcPr>
           <w:p>
             <w:pPr>
-              <w:spacing w:before="80" w:after="80"/>
+              <w:spacing w:before="20" w:after="20"/>
             </w:pPr>
             <w:r/>
             <w:r>
               <w:rPr>
                 <w:rFonts w:ascii="Calibri" w:hAnsi="Calibri"/>
-                <w:sz w:val="20"/>
+                <w:sz w:val="17"/>
               </w:rPr>
               <w:t>Moderate</w:t>
             </w:r>
@@ -614,24 +620,24 @@
         </w:tc>
         <w:tc>
           <w:tcPr>
-            <w:tcW w:type="dxa" w:w="3120"/>
+            <w:tcW w:type="dxa" w:w="3360"/>
             <w:shd w:fill="F5F7FA"/>
             <w:tcMar>
-              <w:top w:w="80" w:type="dxa"/>
-              <w:bottom w:w="80" w:type="dxa"/>
-              <w:left w:w="120" w:type="dxa"/>
-              <w:right w:w="120" w:type="dxa"/>
+              <w:top w:w="30" w:type="dxa"/>
+              <w:bottom w:w="30" w:type="dxa"/>
+              <w:left w:w="60" w:type="dxa"/>
+              <w:right w:w="60" w:type="dxa"/>
             </w:tcMar>
           </w:tcPr>
           <w:p>
             <w:pPr>
-              <w:spacing w:before="80" w:after="80"/>
+              <w:spacing w:before="20" w:after="20"/>
             </w:pPr>
             <w:r/>
             <w:r>
               <w:rPr>
                 <w:rFonts w:ascii="Calibri" w:hAnsi="Calibri"/>
-                <w:sz w:val="20"/>
+                <w:sz w:val="17"/>
               </w:rPr>
               <w:t>0.25 – 0.45</w:t>
             </w:r>
@@ -639,24 +645,24 @@
         </w:tc>
         <w:tc>
           <w:tcPr>
-            <w:tcW w:type="dxa" w:w="3120"/>
+            <w:tcW w:type="dxa" w:w="3360"/>
             <w:shd w:fill="F5F7FA"/>
             <w:tcMar>
-              <w:top w:w="80" w:type="dxa"/>
-              <w:bottom w:w="80" w:type="dxa"/>
-              <w:left w:w="120" w:type="dxa"/>
-              <w:right w:w="120" w:type="dxa"/>
+              <w:top w:w="30" w:type="dxa"/>
+              <w:bottom w:w="30" w:type="dxa"/>
+              <w:left w:w="60" w:type="dxa"/>
+              <w:right w:w="60" w:type="dxa"/>
             </w:tcMar>
           </w:tcPr>
           <w:p>
             <w:pPr>
-              <w:spacing w:before="80" w:after="80"/>
+              <w:spacing w:before="20" w:after="20"/>
             </w:pPr>
             <w:r/>
             <w:r>
               <w:rPr>
                 <w:rFonts w:ascii="Calibri" w:hAnsi="Calibri"/>
-                <w:sz w:val="20"/>
+                <w:sz w:val="17"/>
               </w:rPr>
               <w:t>Scheduled review and monitoring</w:t>
             </w:r>
@@ -666,23 +672,23 @@
       <w:tr>
         <w:tc>
           <w:tcPr>
-            <w:tcW w:type="dxa" w:w="3120"/>
+            <w:tcW w:type="dxa" w:w="3360"/>
             <w:tcMar>
-              <w:top w:w="80" w:type="dxa"/>
-              <w:bottom w:w="80" w:type="dxa"/>
-              <w:left w:w="120" w:type="dxa"/>
-              <w:right w:w="120" w:type="dxa"/>
+              <w:top w:w="30" w:type="dxa"/>
+              <w:bottom w:w="30" w:type="dxa"/>
+              <w:left w:w="60" w:type="dxa"/>
+              <w:right w:w="60" w:type="dxa"/>
             </w:tcMar>
           </w:tcPr>
           <w:p>
             <w:pPr>
-              <w:spacing w:before="80" w:after="80"/>
+              <w:spacing w:before="20" w:after="20"/>
             </w:pPr>
             <w:r/>
             <w:r>
               <w:rPr>
                 <w:rFonts w:ascii="Calibri" w:hAnsi="Calibri"/>
-                <w:sz w:val="20"/>
+                <w:sz w:val="17"/>
               </w:rPr>
               <w:t>Low</w:t>
             </w:r>
@@ -690,23 +696,23 @@
         </w:tc>
         <w:tc>
           <w:tcPr>
-            <w:tcW w:type="dxa" w:w="3120"/>
+            <w:tcW w:type="dxa" w:w="3360"/>
             <w:tcMar>
-              <w:top w:w="80" w:type="dxa"/>
-              <w:bottom w:w="80" w:type="dxa"/>
-              <w:left w:w="120" w:type="dxa"/>
-              <w:right w:w="120" w:type="dxa"/>
+              <w:top w:w="30" w:type="dxa"/>
+              <w:bottom w:w="30" w:type="dxa"/>
+              <w:left w:w="60" w:type="dxa"/>
+              <w:right w:w="60" w:type="dxa"/>
             </w:tcMar>
           </w:tcPr>
           <w:p>
             <w:pPr>
-              <w:spacing w:before="80" w:after="80"/>
+              <w:spacing w:before="20" w:after="20"/>
             </w:pPr>
             <w:r/>
             <w:r>
               <w:rPr>
                 <w:rFonts w:ascii="Calibri" w:hAnsi="Calibri"/>
-                <w:sz w:val="20"/>
+                <w:sz w:val="17"/>
               </w:rPr>
               <w:t>&lt; 0.25</w:t>
             </w:r>
@@ -714,23 +720,23 @@
         </w:tc>
         <w:tc>
           <w:tcPr>
-            <w:tcW w:type="dxa" w:w="3120"/>
+            <w:tcW w:type="dxa" w:w="3360"/>
             <w:tcMar>
-              <w:top w:w="80" w:type="dxa"/>
-              <w:bottom w:w="80" w:type="dxa"/>
-              <w:left w:w="120" w:type="dxa"/>
-              <w:right w:w="120" w:type="dxa"/>
+              <w:top w:w="30" w:type="dxa"/>
+              <w:bottom w:w="30" w:type="dxa"/>
+              <w:left w:w="60" w:type="dxa"/>
+              <w:right w:w="60" w:type="dxa"/>
             </w:tcMar>
           </w:tcPr>
           <w:p>
             <w:pPr>
-              <w:spacing w:before="80" w:after="80"/>
+              <w:spacing w:before="20" w:after="20"/>
             </w:pPr>
             <w:r/>
             <w:r>
               <w:rPr>
                 <w:rFonts w:ascii="Calibri" w:hAnsi="Calibri"/>
-                <w:sz w:val="20"/>
+                <w:sz w:val="17"/>
               </w:rPr>
               <w:t>Maintain current approach</w:t>
             </w:r>
@@ -739,22 +745,25 @@
       </w:tr>
     </w:tbl>
     <w:p>
-      <w:r>
-        <w:br w:type="page"/>
-      </w:r>
+      <w:pPr>
+        <w:spacing w:before="80" w:after="80"/>
+        <w:pBdr>
+          <w:bottom w:val="single" w:sz="6" w:space="1" w:color="CCCCCC"/>
+        </w:pBdr>
+      </w:pPr>
     </w:p>
     <w:p>
       <w:pPr>
         <w:pStyle w:val="Heading2"/>
         <w:keepNext/>
-        <w:spacing w:before="280" w:after="80"/>
+        <w:spacing w:before="160" w:after="40"/>
       </w:pPr>
       <w:r>
         <w:rPr>
           <w:rFonts w:ascii="Calibri" w:hAnsi="Calibri"/>
           <w:b/>
           <w:color w:val="2E5B88"/>
-          <w:sz w:val="28"/>
+          <w:sz w:val="24"/>
         </w:rPr>
         <w:t>3. Key Findings</w:t>
       </w:r>
@@ -763,14 +772,14 @@
       <w:pPr>
         <w:pStyle w:val="Heading3"/>
         <w:keepNext/>
-        <w:spacing w:before="200" w:after="40"/>
+        <w:spacing w:before="120" w:after="20"/>
       </w:pPr>
       <w:r>
         <w:rPr>
           <w:rFonts w:ascii="Calibri" w:hAnsi="Calibri"/>
           <w:b/>
           <w:color w:val="555555"/>
-          <w:sz w:val="24"/>
+          <w:sz w:val="22"/>
         </w:rPr>
         <w:t>3.1 Network-Level Risk Distribution (4-Component)</w:t>
       </w:r>
@@ -790,25 +799,25 @@
         </w:tblBorders>
       </w:tblPr>
       <w:tblGrid>
-        <w:gridCol w:w="3120"/>
-        <w:gridCol w:w="3120"/>
-        <w:gridCol w:w="3120"/>
+        <w:gridCol w:w="3360"/>
+        <w:gridCol w:w="3360"/>
+        <w:gridCol w:w="3360"/>
       </w:tblGrid>
       <w:tr>
         <w:tc>
           <w:tcPr>
-            <w:tcW w:type="dxa" w:w="3120"/>
+            <w:tcW w:type="dxa" w:w="3360"/>
             <w:shd w:fill="1B365D"/>
             <w:tcMar>
-              <w:top w:w="80" w:type="dxa"/>
-              <w:bottom w:w="80" w:type="dxa"/>
-              <w:left w:w="120" w:type="dxa"/>
-              <w:right w:w="120" w:type="dxa"/>
+              <w:top w:w="30" w:type="dxa"/>
+              <w:bottom w:w="30" w:type="dxa"/>
+              <w:left w:w="60" w:type="dxa"/>
+              <w:right w:w="60" w:type="dxa"/>
             </w:tcMar>
           </w:tcPr>
           <w:p>
             <w:pPr>
-              <w:spacing w:before="80" w:after="80"/>
+              <w:spacing w:before="20" w:after="20"/>
             </w:pPr>
             <w:r/>
             <w:r>
@@ -816,7 +825,7 @@
                 <w:rFonts w:ascii="Calibri" w:hAnsi="Calibri"/>
                 <w:b/>
                 <w:color w:val="FFFFFF"/>
-                <w:sz w:val="21"/>
+                <w:sz w:val="18"/>
               </w:rPr>
               <w:t>Risk Tier</w:t>
             </w:r>
@@ -824,18 +833,18 @@
         </w:tc>
         <w:tc>
           <w:tcPr>
-            <w:tcW w:type="dxa" w:w="3120"/>
+            <w:tcW w:type="dxa" w:w="3360"/>
             <w:shd w:fill="1B365D"/>
             <w:tcMar>
-              <w:top w:w="80" w:type="dxa"/>
-              <w:bottom w:w="80" w:type="dxa"/>
-              <w:left w:w="120" w:type="dxa"/>
-              <w:right w:w="120" w:type="dxa"/>
+              <w:top w:w="30" w:type="dxa"/>
+              <w:bottom w:w="30" w:type="dxa"/>
+              <w:left w:w="60" w:type="dxa"/>
+              <w:right w:w="60" w:type="dxa"/>
             </w:tcMar>
           </w:tcPr>
           <w:p>
             <w:pPr>
-              <w:spacing w:before="80" w:after="80"/>
+              <w:spacing w:before="20" w:after="20"/>
             </w:pPr>
             <w:r/>
             <w:r>
@@ -843,7 +852,7 @@
                 <w:rFonts w:ascii="Calibri" w:hAnsi="Calibri"/>
                 <w:b/>
                 <w:color w:val="FFFFFF"/>
-                <w:sz w:val="21"/>
+                <w:sz w:val="18"/>
               </w:rPr>
               <w:t>Length (km)</w:t>
             </w:r>
@@ -851,18 +860,18 @@
         </w:tc>
         <w:tc>
           <w:tcPr>
-            <w:tcW w:type="dxa" w:w="3120"/>
+            <w:tcW w:type="dxa" w:w="3360"/>
             <w:shd w:fill="1B365D"/>
             <w:tcMar>
-              <w:top w:w="80" w:type="dxa"/>
-              <w:bottom w:w="80" w:type="dxa"/>
-              <w:left w:w="120" w:type="dxa"/>
-              <w:right w:w="120" w:type="dxa"/>
+              <w:top w:w="30" w:type="dxa"/>
+              <w:bottom w:w="30" w:type="dxa"/>
+              <w:left w:w="60" w:type="dxa"/>
+              <w:right w:w="60" w:type="dxa"/>
             </w:tcMar>
           </w:tcPr>
           <w:p>
             <w:pPr>
-              <w:spacing w:before="80" w:after="80"/>
+              <w:spacing w:before="20" w:after="20"/>
             </w:pPr>
             <w:r/>
             <w:r>
@@ -870,7 +879,7 @@
                 <w:rFonts w:ascii="Calibri" w:hAnsi="Calibri"/>
                 <w:b/>
                 <w:color w:val="FFFFFF"/>
-                <w:sz w:val="21"/>
+                <w:sz w:val="18"/>
               </w:rPr>
               <w:t>% of Network</w:t>
             </w:r>
@@ -880,24 +889,24 @@
       <w:tr>
         <w:tc>
           <w:tcPr>
-            <w:tcW w:type="dxa" w:w="3120"/>
+            <w:tcW w:type="dxa" w:w="3360"/>
             <w:shd w:fill="F5F7FA"/>
             <w:tcMar>
-              <w:top w:w="80" w:type="dxa"/>
-              <w:bottom w:w="80" w:type="dxa"/>
-              <w:left w:w="120" w:type="dxa"/>
-              <w:right w:w="120" w:type="dxa"/>
+              <w:top w:w="30" w:type="dxa"/>
+              <w:bottom w:w="30" w:type="dxa"/>
+              <w:left w:w="60" w:type="dxa"/>
+              <w:right w:w="60" w:type="dxa"/>
             </w:tcMar>
           </w:tcPr>
           <w:p>
             <w:pPr>
-              <w:spacing w:before="80" w:after="80"/>
+              <w:spacing w:before="20" w:after="20"/>
             </w:pPr>
             <w:r/>
             <w:r>
               <w:rPr>
                 <w:rFonts w:ascii="Calibri" w:hAnsi="Calibri"/>
-                <w:sz w:val="20"/>
+                <w:sz w:val="17"/>
               </w:rPr>
               <w:t>Critical — Immediate Review</w:t>
             </w:r>
@@ -905,24 +914,24 @@
         </w:tc>
         <w:tc>
           <w:tcPr>
-            <w:tcW w:type="dxa" w:w="3120"/>
+            <w:tcW w:type="dxa" w:w="3360"/>
             <w:shd w:fill="F5F7FA"/>
             <w:tcMar>
-              <w:top w:w="80" w:type="dxa"/>
-              <w:bottom w:w="80" w:type="dxa"/>
-              <w:left w:w="120" w:type="dxa"/>
-              <w:right w:w="120" w:type="dxa"/>
+              <w:top w:w="30" w:type="dxa"/>
+              <w:bottom w:w="30" w:type="dxa"/>
+              <w:left w:w="60" w:type="dxa"/>
+              <w:right w:w="60" w:type="dxa"/>
             </w:tcMar>
           </w:tcPr>
           <w:p>
             <w:pPr>
-              <w:spacing w:before="80" w:after="80"/>
+              <w:spacing w:before="20" w:after="20"/>
             </w:pPr>
             <w:r/>
             <w:r>
               <w:rPr>
                 <w:rFonts w:ascii="Calibri" w:hAnsi="Calibri"/>
-                <w:sz w:val="20"/>
+                <w:sz w:val="17"/>
               </w:rPr>
               <w:t>11,445</w:t>
             </w:r>
@@ -930,24 +939,24 @@
         </w:tc>
         <w:tc>
           <w:tcPr>
-            <w:tcW w:type="dxa" w:w="3120"/>
+            <w:tcW w:type="dxa" w:w="3360"/>
             <w:shd w:fill="F5F7FA"/>
             <w:tcMar>
-              <w:top w:w="80" w:type="dxa"/>
-              <w:bottom w:w="80" w:type="dxa"/>
-              <w:left w:w="120" w:type="dxa"/>
-              <w:right w:w="120" w:type="dxa"/>
+              <w:top w:w="30" w:type="dxa"/>
+              <w:bottom w:w="30" w:type="dxa"/>
+              <w:left w:w="60" w:type="dxa"/>
+              <w:right w:w="60" w:type="dxa"/>
             </w:tcMar>
           </w:tcPr>
           <w:p>
             <w:pPr>
-              <w:spacing w:before="80" w:after="80"/>
+              <w:spacing w:before="20" w:after="20"/>
             </w:pPr>
             <w:r/>
             <w:r>
               <w:rPr>
                 <w:rFonts w:ascii="Calibri" w:hAnsi="Calibri"/>
-                <w:sz w:val="20"/>
+                <w:sz w:val="17"/>
               </w:rPr>
               <w:t>12.2%</w:t>
             </w:r>
@@ -957,23 +966,23 @@
       <w:tr>
         <w:tc>
           <w:tcPr>
-            <w:tcW w:type="dxa" w:w="3120"/>
+            <w:tcW w:type="dxa" w:w="3360"/>
             <w:tcMar>
-              <w:top w:w="80" w:type="dxa"/>
-              <w:bottom w:w="80" w:type="dxa"/>
-              <w:left w:w="120" w:type="dxa"/>
-              <w:right w:w="120" w:type="dxa"/>
+              <w:top w:w="30" w:type="dxa"/>
+              <w:bottom w:w="30" w:type="dxa"/>
+              <w:left w:w="60" w:type="dxa"/>
+              <w:right w:w="60" w:type="dxa"/>
             </w:tcMar>
           </w:tcPr>
           <w:p>
             <w:pPr>
-              <w:spacing w:before="80" w:after="80"/>
+              <w:spacing w:before="20" w:after="20"/>
             </w:pPr>
             <w:r/>
             <w:r>
               <w:rPr>
                 <w:rFonts w:ascii="Calibri" w:hAnsi="Calibri"/>
-                <w:sz w:val="20"/>
+                <w:sz w:val="17"/>
               </w:rPr>
               <w:t>High — Priority Review</w:t>
             </w:r>
@@ -981,23 +990,23 @@
         </w:tc>
         <w:tc>
           <w:tcPr>
-            <w:tcW w:type="dxa" w:w="3120"/>
+            <w:tcW w:type="dxa" w:w="3360"/>
             <w:tcMar>
-              <w:top w:w="80" w:type="dxa"/>
-              <w:bottom w:w="80" w:type="dxa"/>
-              <w:left w:w="120" w:type="dxa"/>
-              <w:right w:w="120" w:type="dxa"/>
+              <w:top w:w="30" w:type="dxa"/>
+              <w:bottom w:w="30" w:type="dxa"/>
+              <w:left w:w="60" w:type="dxa"/>
+              <w:right w:w="60" w:type="dxa"/>
             </w:tcMar>
           </w:tcPr>
           <w:p>
             <w:pPr>
-              <w:spacing w:before="80" w:after="80"/>
+              <w:spacing w:before="20" w:after="20"/>
             </w:pPr>
             <w:r/>
             <w:r>
               <w:rPr>
                 <w:rFonts w:ascii="Calibri" w:hAnsi="Calibri"/>
-                <w:sz w:val="20"/>
+                <w:sz w:val="17"/>
               </w:rPr>
               <w:t>19,313</w:t>
             </w:r>
@@ -1005,23 +1014,23 @@
         </w:tc>
         <w:tc>
           <w:tcPr>
-            <w:tcW w:type="dxa" w:w="3120"/>
+            <w:tcW w:type="dxa" w:w="3360"/>
             <w:tcMar>
-              <w:top w:w="80" w:type="dxa"/>
-              <w:bottom w:w="80" w:type="dxa"/>
-              <w:left w:w="120" w:type="dxa"/>
-              <w:right w:w="120" w:type="dxa"/>
+              <w:top w:w="30" w:type="dxa"/>
+              <w:bottom w:w="30" w:type="dxa"/>
+              <w:left w:w="60" w:type="dxa"/>
+              <w:right w:w="60" w:type="dxa"/>
             </w:tcMar>
           </w:tcPr>
           <w:p>
             <w:pPr>
-              <w:spacing w:before="80" w:after="80"/>
+              <w:spacing w:before="20" w:after="20"/>
             </w:pPr>
             <w:r/>
             <w:r>
               <w:rPr>
                 <w:rFonts w:ascii="Calibri" w:hAnsi="Calibri"/>
-                <w:sz w:val="20"/>
+                <w:sz w:val="17"/>
               </w:rPr>
               <w:t>20.7%</w:t>
             </w:r>
@@ -1031,24 +1040,24 @@
       <w:tr>
         <w:tc>
           <w:tcPr>
-            <w:tcW w:type="dxa" w:w="3120"/>
+            <w:tcW w:type="dxa" w:w="3360"/>
             <w:shd w:fill="F5F7FA"/>
             <w:tcMar>
-              <w:top w:w="80" w:type="dxa"/>
-              <w:bottom w:w="80" w:type="dxa"/>
-              <w:left w:w="120" w:type="dxa"/>
-              <w:right w:w="120" w:type="dxa"/>
+              <w:top w:w="30" w:type="dxa"/>
+              <w:bottom w:w="30" w:type="dxa"/>
+              <w:left w:w="60" w:type="dxa"/>
+              <w:right w:w="60" w:type="dxa"/>
             </w:tcMar>
           </w:tcPr>
           <w:p>
             <w:pPr>
-              <w:spacing w:before="80" w:after="80"/>
+              <w:spacing w:before="20" w:after="20"/>
             </w:pPr>
             <w:r/>
             <w:r>
               <w:rPr>
                 <w:rFonts w:ascii="Calibri" w:hAnsi="Calibri"/>
-                <w:sz w:val="20"/>
+                <w:sz w:val="17"/>
               </w:rPr>
               <w:t>Moderate — Scheduled Review</w:t>
             </w:r>
@@ -1056,24 +1065,24 @@
         </w:tc>
         <w:tc>
           <w:tcPr>
-            <w:tcW w:type="dxa" w:w="3120"/>
+            <w:tcW w:type="dxa" w:w="3360"/>
             <w:shd w:fill="F5F7FA"/>
             <w:tcMar>
-              <w:top w:w="80" w:type="dxa"/>
-              <w:bottom w:w="80" w:type="dxa"/>
-              <w:left w:w="120" w:type="dxa"/>
-              <w:right w:w="120" w:type="dxa"/>
+              <w:top w:w="30" w:type="dxa"/>
+              <w:bottom w:w="30" w:type="dxa"/>
+              <w:left w:w="60" w:type="dxa"/>
+              <w:right w:w="60" w:type="dxa"/>
             </w:tcMar>
           </w:tcPr>
           <w:p>
             <w:pPr>
-              <w:spacing w:before="80" w:after="80"/>
+              <w:spacing w:before="20" w:after="20"/>
             </w:pPr>
             <w:r/>
             <w:r>
               <w:rPr>
                 <w:rFonts w:ascii="Calibri" w:hAnsi="Calibri"/>
-                <w:sz w:val="20"/>
+                <w:sz w:val="17"/>
               </w:rPr>
               <w:t>25,499</w:t>
             </w:r>
@@ -1081,24 +1090,24 @@
         </w:tc>
         <w:tc>
           <w:tcPr>
-            <w:tcW w:type="dxa" w:w="3120"/>
+            <w:tcW w:type="dxa" w:w="3360"/>
             <w:shd w:fill="F5F7FA"/>
             <w:tcMar>
-              <w:top w:w="80" w:type="dxa"/>
-              <w:bottom w:w="80" w:type="dxa"/>
-              <w:left w:w="120" w:type="dxa"/>
-              <w:right w:w="120" w:type="dxa"/>
+              <w:top w:w="30" w:type="dxa"/>
+              <w:bottom w:w="30" w:type="dxa"/>
+              <w:left w:w="60" w:type="dxa"/>
+              <w:right w:w="60" w:type="dxa"/>
             </w:tcMar>
           </w:tcPr>
           <w:p>
             <w:pPr>
-              <w:spacing w:before="80" w:after="80"/>
+              <w:spacing w:before="20" w:after="20"/>
             </w:pPr>
             <w:r/>
             <w:r>
               <w:rPr>
                 <w:rFonts w:ascii="Calibri" w:hAnsi="Calibri"/>
-                <w:sz w:val="20"/>
+                <w:sz w:val="17"/>
               </w:rPr>
               <w:t>27.3%</w:t>
             </w:r>
@@ -1108,23 +1117,23 @@
       <w:tr>
         <w:tc>
           <w:tcPr>
-            <w:tcW w:type="dxa" w:w="3120"/>
+            <w:tcW w:type="dxa" w:w="3360"/>
             <w:tcMar>
-              <w:top w:w="80" w:type="dxa"/>
-              <w:bottom w:w="80" w:type="dxa"/>
-              <w:left w:w="120" w:type="dxa"/>
-              <w:right w:w="120" w:type="dxa"/>
+              <w:top w:w="30" w:type="dxa"/>
+              <w:bottom w:w="30" w:type="dxa"/>
+              <w:left w:w="60" w:type="dxa"/>
+              <w:right w:w="60" w:type="dxa"/>
             </w:tcMar>
           </w:tcPr>
           <w:p>
             <w:pPr>
-              <w:spacing w:before="80" w:after="80"/>
+              <w:spacing w:before="20" w:after="20"/>
             </w:pPr>
             <w:r/>
             <w:r>
               <w:rPr>
                 <w:rFonts w:ascii="Calibri" w:hAnsi="Calibri"/>
-                <w:sz w:val="20"/>
+                <w:sz w:val="17"/>
               </w:rPr>
               <w:t>Low — Monitor</w:t>
             </w:r>
@@ -1132,23 +1141,23 @@
         </w:tc>
         <w:tc>
           <w:tcPr>
-            <w:tcW w:type="dxa" w:w="3120"/>
+            <w:tcW w:type="dxa" w:w="3360"/>
             <w:tcMar>
-              <w:top w:w="80" w:type="dxa"/>
-              <w:bottom w:w="80" w:type="dxa"/>
-              <w:left w:w="120" w:type="dxa"/>
-              <w:right w:w="120" w:type="dxa"/>
+              <w:top w:w="30" w:type="dxa"/>
+              <w:bottom w:w="30" w:type="dxa"/>
+              <w:left w:w="60" w:type="dxa"/>
+              <w:right w:w="60" w:type="dxa"/>
             </w:tcMar>
           </w:tcPr>
           <w:p>
             <w:pPr>
-              <w:spacing w:before="80" w:after="80"/>
+              <w:spacing w:before="20" w:after="20"/>
             </w:pPr>
             <w:r/>
             <w:r>
               <w:rPr>
                 <w:rFonts w:ascii="Calibri" w:hAnsi="Calibri"/>
-                <w:sz w:val="20"/>
+                <w:sz w:val="17"/>
               </w:rPr>
               <w:t>37,253</w:t>
             </w:r>
@@ -1156,23 +1165,23 @@
         </w:tc>
         <w:tc>
           <w:tcPr>
-            <w:tcW w:type="dxa" w:w="3120"/>
+            <w:tcW w:type="dxa" w:w="3360"/>
             <w:tcMar>
-              <w:top w:w="80" w:type="dxa"/>
-              <w:bottom w:w="80" w:type="dxa"/>
-              <w:left w:w="120" w:type="dxa"/>
-              <w:right w:w="120" w:type="dxa"/>
+              <w:top w:w="30" w:type="dxa"/>
+              <w:bottom w:w="30" w:type="dxa"/>
+              <w:left w:w="60" w:type="dxa"/>
+              <w:right w:w="60" w:type="dxa"/>
             </w:tcMar>
           </w:tcPr>
           <w:p>
             <w:pPr>
-              <w:spacing w:before="80" w:after="80"/>
+              <w:spacing w:before="20" w:after="20"/>
             </w:pPr>
             <w:r/>
             <w:r>
               <w:rPr>
                 <w:rFonts w:ascii="Calibri" w:hAnsi="Calibri"/>
-                <w:sz w:val="20"/>
+                <w:sz w:val="17"/>
               </w:rPr>
               <w:t>39.8%</w:t>
             </w:r>
@@ -1182,7 +1191,7 @@
     </w:tbl>
     <w:p>
       <w:pPr>
-        <w:spacing w:after="120" w:line="276" w:lineRule="auto"/>
+        <w:spacing w:after="60" w:line="240" w:lineRule="auto"/>
       </w:pPr>
       <w:r/>
       <w:r>
@@ -1199,21 +1208,21 @@
       <w:pPr>
         <w:pStyle w:val="Heading3"/>
         <w:keepNext/>
-        <w:spacing w:before="200" w:after="40"/>
+        <w:spacing w:before="120" w:after="20"/>
       </w:pPr>
       <w:r>
         <w:rPr>
           <w:rFonts w:ascii="Calibri" w:hAnsi="Calibri"/>
           <w:b/>
           <w:color w:val="555555"/>
-          <w:sz w:val="24"/>
+          <w:sz w:val="22"/>
         </w:rPr>
         <w:t>3.2 Critical Findings</w:t>
       </w:r>
     </w:p>
     <w:p>
       <w:pPr>
-        <w:spacing w:after="60"/>
+        <w:spacing w:after="20"/>
         <w:ind w:left="360"/>
       </w:pPr>
       <w:r>
@@ -1231,7 +1240,7 @@
     </w:p>
     <w:p>
       <w:pPr>
-        <w:spacing w:after="60"/>
+        <w:spacing w:after="20"/>
         <w:ind w:left="360"/>
       </w:pPr>
       <w:r>
@@ -1249,7 +1258,7 @@
     </w:p>
     <w:p>
       <w:pPr>
-        <w:spacing w:after="60"/>
+        <w:spacing w:after="20"/>
         <w:ind w:left="360"/>
       </w:pPr>
       <w:r>
@@ -1267,7 +1276,7 @@
     </w:p>
     <w:p>
       <w:pPr>
-        <w:spacing w:after="60"/>
+        <w:spacing w:after="20"/>
         <w:ind w:left="360"/>
       </w:pPr>
       <w:r>
@@ -1287,14 +1296,14 @@
       <w:pPr>
         <w:pStyle w:val="Heading3"/>
         <w:keepNext/>
-        <w:spacing w:before="200" w:after="40"/>
+        <w:spacing w:before="120" w:after="20"/>
       </w:pPr>
       <w:r>
         <w:rPr>
           <w:rFonts w:ascii="Calibri" w:hAnsi="Calibri"/>
           <w:b/>
           <w:color w:val="555555"/>
-          <w:sz w:val="24"/>
+          <w:sz w:val="22"/>
         </w:rPr>
         <w:t>3.3 Regional Findings</w:t>
       </w:r>
@@ -1314,25 +1323,25 @@
         </w:tblBorders>
       </w:tblPr>
       <w:tblGrid>
-        <w:gridCol w:w="3120"/>
-        <w:gridCol w:w="3120"/>
-        <w:gridCol w:w="3120"/>
+        <w:gridCol w:w="3360"/>
+        <w:gridCol w:w="3360"/>
+        <w:gridCol w:w="3360"/>
       </w:tblGrid>
       <w:tr>
         <w:tc>
           <w:tcPr>
-            <w:tcW w:type="dxa" w:w="3120"/>
+            <w:tcW w:type="dxa" w:w="3360"/>
             <w:shd w:fill="1B365D"/>
             <w:tcMar>
-              <w:top w:w="80" w:type="dxa"/>
-              <w:bottom w:w="80" w:type="dxa"/>
-              <w:left w:w="120" w:type="dxa"/>
-              <w:right w:w="120" w:type="dxa"/>
+              <w:top w:w="30" w:type="dxa"/>
+              <w:bottom w:w="30" w:type="dxa"/>
+              <w:left w:w="60" w:type="dxa"/>
+              <w:right w:w="60" w:type="dxa"/>
             </w:tcMar>
           </w:tcPr>
           <w:p>
             <w:pPr>
-              <w:spacing w:before="80" w:after="80"/>
+              <w:spacing w:before="20" w:after="20"/>
             </w:pPr>
             <w:r/>
             <w:r>
@@ -1340,7 +1349,7 @@
                 <w:rFonts w:ascii="Calibri" w:hAnsi="Calibri"/>
                 <w:b/>
                 <w:color w:val="FFFFFF"/>
-                <w:sz w:val="21"/>
+                <w:sz w:val="18"/>
               </w:rPr>
               <w:t>Metric</w:t>
             </w:r>
@@ -1348,18 +1357,18 @@
         </w:tc>
         <w:tc>
           <w:tcPr>
-            <w:tcW w:type="dxa" w:w="3120"/>
+            <w:tcW w:type="dxa" w:w="3360"/>
             <w:shd w:fill="1B365D"/>
             <w:tcMar>
-              <w:top w:w="80" w:type="dxa"/>
-              <w:bottom w:w="80" w:type="dxa"/>
-              <w:left w:w="120" w:type="dxa"/>
-              <w:right w:w="120" w:type="dxa"/>
+              <w:top w:w="30" w:type="dxa"/>
+              <w:bottom w:w="30" w:type="dxa"/>
+              <w:left w:w="60" w:type="dxa"/>
+              <w:right w:w="60" w:type="dxa"/>
             </w:tcMar>
           </w:tcPr>
           <w:p>
             <w:pPr>
-              <w:spacing w:before="80" w:after="80"/>
+              <w:spacing w:before="20" w:after="20"/>
             </w:pPr>
             <w:r/>
             <w:r>
@@ -1367,7 +1376,7 @@
                 <w:rFonts w:ascii="Calibri" w:hAnsi="Calibri"/>
                 <w:b/>
                 <w:color w:val="FFFFFF"/>
-                <w:sz w:val="21"/>
+                <w:sz w:val="18"/>
               </w:rPr>
               <w:t>Thailand</w:t>
             </w:r>
@@ -1375,18 +1384,18 @@
         </w:tc>
         <w:tc>
           <w:tcPr>
-            <w:tcW w:type="dxa" w:w="3120"/>
+            <w:tcW w:type="dxa" w:w="3360"/>
             <w:shd w:fill="1B365D"/>
             <w:tcMar>
-              <w:top w:w="80" w:type="dxa"/>
-              <w:bottom w:w="80" w:type="dxa"/>
-              <w:left w:w="120" w:type="dxa"/>
-              <w:right w:w="120" w:type="dxa"/>
+              <w:top w:w="30" w:type="dxa"/>
+              <w:bottom w:w="30" w:type="dxa"/>
+              <w:left w:w="60" w:type="dxa"/>
+              <w:right w:w="60" w:type="dxa"/>
             </w:tcMar>
           </w:tcPr>
           <w:p>
             <w:pPr>
-              <w:spacing w:before="80" w:after="80"/>
+              <w:spacing w:before="20" w:after="20"/>
             </w:pPr>
             <w:r/>
             <w:r>
@@ -1394,7 +1403,7 @@
                 <w:rFonts w:ascii="Calibri" w:hAnsi="Calibri"/>
                 <w:b/>
                 <w:color w:val="FFFFFF"/>
-                <w:sz w:val="21"/>
+                <w:sz w:val="18"/>
               </w:rPr>
               <w:t>Maharashtra</w:t>
             </w:r>
@@ -1404,24 +1413,24 @@
       <w:tr>
         <w:tc>
           <w:tcPr>
-            <w:tcW w:type="dxa" w:w="3120"/>
+            <w:tcW w:type="dxa" w:w="3360"/>
             <w:shd w:fill="F5F7FA"/>
             <w:tcMar>
-              <w:top w:w="80" w:type="dxa"/>
-              <w:bottom w:w="80" w:type="dxa"/>
-              <w:left w:w="120" w:type="dxa"/>
-              <w:right w:w="120" w:type="dxa"/>
+              <w:top w:w="30" w:type="dxa"/>
+              <w:bottom w:w="30" w:type="dxa"/>
+              <w:left w:w="60" w:type="dxa"/>
+              <w:right w:w="60" w:type="dxa"/>
             </w:tcMar>
           </w:tcPr>
           <w:p>
             <w:pPr>
-              <w:spacing w:before="80" w:after="80"/>
+              <w:spacing w:before="20" w:after="20"/>
             </w:pPr>
             <w:r/>
             <w:r>
               <w:rPr>
                 <w:rFonts w:ascii="Calibri" w:hAnsi="Calibri"/>
-                <w:sz w:val="20"/>
+                <w:sz w:val="17"/>
               </w:rPr>
               <w:t>Total segments analyzed</w:t>
             </w:r>
@@ -1429,24 +1438,24 @@
         </w:tc>
         <w:tc>
           <w:tcPr>
-            <w:tcW w:type="dxa" w:w="3120"/>
+            <w:tcW w:type="dxa" w:w="3360"/>
             <w:shd w:fill="F5F7FA"/>
             <w:tcMar>
-              <w:top w:w="80" w:type="dxa"/>
-              <w:bottom w:w="80" w:type="dxa"/>
-              <w:left w:w="120" w:type="dxa"/>
-              <w:right w:w="120" w:type="dxa"/>
+              <w:top w:w="30" w:type="dxa"/>
+              <w:bottom w:w="30" w:type="dxa"/>
+              <w:left w:w="60" w:type="dxa"/>
+              <w:right w:w="60" w:type="dxa"/>
             </w:tcMar>
           </w:tcPr>
           <w:p>
             <w:pPr>
-              <w:spacing w:before="80" w:after="80"/>
+              <w:spacing w:before="20" w:after="20"/>
             </w:pPr>
             <w:r/>
             <w:r>
               <w:rPr>
                 <w:rFonts w:ascii="Calibri" w:hAnsi="Calibri"/>
-                <w:sz w:val="20"/>
+                <w:sz w:val="17"/>
               </w:rPr>
               <w:t>9,732</w:t>
             </w:r>
@@ -1454,24 +1463,24 @@
         </w:tc>
         <w:tc>
           <w:tcPr>
-            <w:tcW w:type="dxa" w:w="3120"/>
+            <w:tcW w:type="dxa" w:w="3360"/>
             <w:shd w:fill="F5F7FA"/>
             <w:tcMar>
-              <w:top w:w="80" w:type="dxa"/>
-              <w:bottom w:w="80" w:type="dxa"/>
-              <w:left w:w="120" w:type="dxa"/>
-              <w:right w:w="120" w:type="dxa"/>
+              <w:top w:w="30" w:type="dxa"/>
+              <w:bottom w:w="30" w:type="dxa"/>
+              <w:left w:w="60" w:type="dxa"/>
+              <w:right w:w="60" w:type="dxa"/>
             </w:tcMar>
           </w:tcPr>
           <w:p>
             <w:pPr>
-              <w:spacing w:before="80" w:after="80"/>
+              <w:spacing w:before="20" w:after="20"/>
             </w:pPr>
             <w:r/>
             <w:r>
               <w:rPr>
                 <w:rFonts w:ascii="Calibri" w:hAnsi="Calibri"/>
-                <w:sz w:val="20"/>
+                <w:sz w:val="17"/>
               </w:rPr>
               <w:t>5,061</w:t>
             </w:r>
@@ -1481,23 +1490,23 @@
       <w:tr>
         <w:tc>
           <w:tcPr>
-            <w:tcW w:type="dxa" w:w="3120"/>
+            <w:tcW w:type="dxa" w:w="3360"/>
             <w:tcMar>
-              <w:top w:w="80" w:type="dxa"/>
-              <w:bottom w:w="80" w:type="dxa"/>
-              <w:left w:w="120" w:type="dxa"/>
-              <w:right w:w="120" w:type="dxa"/>
+              <w:top w:w="30" w:type="dxa"/>
+              <w:bottom w:w="30" w:type="dxa"/>
+              <w:left w:w="60" w:type="dxa"/>
+              <w:right w:w="60" w:type="dxa"/>
             </w:tcMar>
           </w:tcPr>
           <w:p>
             <w:pPr>
-              <w:spacing w:before="80" w:after="80"/>
+              <w:spacing w:before="20" w:after="20"/>
             </w:pPr>
             <w:r/>
             <w:r>
               <w:rPr>
                 <w:rFonts w:ascii="Calibri" w:hAnsi="Calibri"/>
-                <w:sz w:val="20"/>
+                <w:sz w:val="17"/>
               </w:rPr>
               <w:t>Critical segments (%)</w:t>
             </w:r>
@@ -1505,23 +1514,23 @@
         </w:tc>
         <w:tc>
           <w:tcPr>
-            <w:tcW w:type="dxa" w:w="3120"/>
+            <w:tcW w:type="dxa" w:w="3360"/>
             <w:tcMar>
-              <w:top w:w="80" w:type="dxa"/>
-              <w:bottom w:w="80" w:type="dxa"/>
-              <w:left w:w="120" w:type="dxa"/>
-              <w:right w:w="120" w:type="dxa"/>
+              <w:top w:w="30" w:type="dxa"/>
+              <w:bottom w:w="30" w:type="dxa"/>
+              <w:left w:w="60" w:type="dxa"/>
+              <w:right w:w="60" w:type="dxa"/>
             </w:tcMar>
           </w:tcPr>
           <w:p>
             <w:pPr>
-              <w:spacing w:before="80" w:after="80"/>
+              <w:spacing w:before="20" w:after="20"/>
             </w:pPr>
             <w:r/>
             <w:r>
               <w:rPr>
                 <w:rFonts w:ascii="Calibri" w:hAnsi="Calibri"/>
-                <w:sz w:val="20"/>
+                <w:sz w:val="17"/>
               </w:rPr>
               <w:t>14.1%</w:t>
             </w:r>
@@ -1529,23 +1538,23 @@
         </w:tc>
         <w:tc>
           <w:tcPr>
-            <w:tcW w:type="dxa" w:w="3120"/>
+            <w:tcW w:type="dxa" w:w="3360"/>
             <w:tcMar>
-              <w:top w:w="80" w:type="dxa"/>
-              <w:bottom w:w="80" w:type="dxa"/>
-              <w:left w:w="120" w:type="dxa"/>
-              <w:right w:w="120" w:type="dxa"/>
+              <w:top w:w="30" w:type="dxa"/>
+              <w:bottom w:w="30" w:type="dxa"/>
+              <w:left w:w="60" w:type="dxa"/>
+              <w:right w:w="60" w:type="dxa"/>
             </w:tcMar>
           </w:tcPr>
           <w:p>
             <w:pPr>
-              <w:spacing w:before="80" w:after="80"/>
+              <w:spacing w:before="20" w:after="20"/>
             </w:pPr>
             <w:r/>
             <w:r>
               <w:rPr>
                 <w:rFonts w:ascii="Calibri" w:hAnsi="Calibri"/>
-                <w:sz w:val="20"/>
+                <w:sz w:val="17"/>
               </w:rPr>
               <w:t>9.8%</w:t>
             </w:r>
@@ -1555,24 +1564,24 @@
       <w:tr>
         <w:tc>
           <w:tcPr>
-            <w:tcW w:type="dxa" w:w="3120"/>
+            <w:tcW w:type="dxa" w:w="3360"/>
             <w:shd w:fill="F5F7FA"/>
             <w:tcMar>
-              <w:top w:w="80" w:type="dxa"/>
-              <w:bottom w:w="80" w:type="dxa"/>
-              <w:left w:w="120" w:type="dxa"/>
-              <w:right w:w="120" w:type="dxa"/>
+              <w:top w:w="30" w:type="dxa"/>
+              <w:bottom w:w="30" w:type="dxa"/>
+              <w:left w:w="60" w:type="dxa"/>
+              <w:right w:w="60" w:type="dxa"/>
             </w:tcMar>
           </w:tcPr>
           <w:p>
             <w:pPr>
-              <w:spacing w:before="80" w:after="80"/>
+              <w:spacing w:before="20" w:after="20"/>
             </w:pPr>
             <w:r/>
             <w:r>
               <w:rPr>
                 <w:rFonts w:ascii="Calibri" w:hAnsi="Calibri"/>
-                <w:sz w:val="20"/>
+                <w:sz w:val="17"/>
               </w:rPr>
               <w:t>Mean Speed Safety Score</w:t>
             </w:r>
@@ -1580,24 +1589,24 @@
         </w:tc>
         <w:tc>
           <w:tcPr>
-            <w:tcW w:type="dxa" w:w="3120"/>
+            <w:tcW w:type="dxa" w:w="3360"/>
             <w:shd w:fill="F5F7FA"/>
             <w:tcMar>
-              <w:top w:w="80" w:type="dxa"/>
-              <w:bottom w:w="80" w:type="dxa"/>
-              <w:left w:w="120" w:type="dxa"/>
-              <w:right w:w="120" w:type="dxa"/>
+              <w:top w:w="30" w:type="dxa"/>
+              <w:bottom w:w="30" w:type="dxa"/>
+              <w:left w:w="60" w:type="dxa"/>
+              <w:right w:w="60" w:type="dxa"/>
             </w:tcMar>
           </w:tcPr>
           <w:p>
             <w:pPr>
-              <w:spacing w:before="80" w:after="80"/>
+              <w:spacing w:before="20" w:after="20"/>
             </w:pPr>
             <w:r/>
             <w:r>
               <w:rPr>
                 <w:rFonts w:ascii="Calibri" w:hAnsi="Calibri"/>
-                <w:sz w:val="20"/>
+                <w:sz w:val="17"/>
               </w:rPr>
               <w:t>0.428</w:t>
             </w:r>
@@ -1605,24 +1614,24 @@
         </w:tc>
         <w:tc>
           <w:tcPr>
-            <w:tcW w:type="dxa" w:w="3120"/>
+            <w:tcW w:type="dxa" w:w="3360"/>
             <w:shd w:fill="F5F7FA"/>
             <w:tcMar>
-              <w:top w:w="80" w:type="dxa"/>
-              <w:bottom w:w="80" w:type="dxa"/>
-              <w:left w:w="120" w:type="dxa"/>
-              <w:right w:w="120" w:type="dxa"/>
+              <w:top w:w="30" w:type="dxa"/>
+              <w:bottom w:w="30" w:type="dxa"/>
+              <w:left w:w="60" w:type="dxa"/>
+              <w:right w:w="60" w:type="dxa"/>
             </w:tcMar>
           </w:tcPr>
           <w:p>
             <w:pPr>
-              <w:spacing w:before="80" w:after="80"/>
+              <w:spacing w:before="20" w:after="20"/>
             </w:pPr>
             <w:r/>
             <w:r>
               <w:rPr>
                 <w:rFonts w:ascii="Calibri" w:hAnsi="Calibri"/>
-                <w:sz w:val="20"/>
+                <w:sz w:val="17"/>
               </w:rPr>
               <w:t>0.395</w:t>
             </w:r>
@@ -1632,23 +1641,23 @@
       <w:tr>
         <w:tc>
           <w:tcPr>
-            <w:tcW w:type="dxa" w:w="3120"/>
+            <w:tcW w:type="dxa" w:w="3360"/>
             <w:tcMar>
-              <w:top w:w="80" w:type="dxa"/>
-              <w:bottom w:w="80" w:type="dxa"/>
-              <w:left w:w="120" w:type="dxa"/>
-              <w:right w:w="120" w:type="dxa"/>
+              <w:top w:w="30" w:type="dxa"/>
+              <w:bottom w:w="30" w:type="dxa"/>
+              <w:left w:w="60" w:type="dxa"/>
+              <w:right w:w="60" w:type="dxa"/>
             </w:tcMar>
           </w:tcPr>
           <w:p>
             <w:pPr>
-              <w:spacing w:before="80" w:after="80"/>
+              <w:spacing w:before="20" w:after="20"/>
             </w:pPr>
             <w:r/>
             <w:r>
               <w:rPr>
                 <w:rFonts w:ascii="Calibri" w:hAnsi="Calibri"/>
-                <w:sz w:val="20"/>
+                <w:sz w:val="17"/>
               </w:rPr>
               <w:t>Mean operating gap (km/h)</w:t>
             </w:r>
@@ -1656,23 +1665,23 @@
         </w:tc>
         <w:tc>
           <w:tcPr>
-            <w:tcW w:type="dxa" w:w="3120"/>
+            <w:tcW w:type="dxa" w:w="3360"/>
             <w:tcMar>
-              <w:top w:w="80" w:type="dxa"/>
-              <w:bottom w:w="80" w:type="dxa"/>
-              <w:left w:w="120" w:type="dxa"/>
-              <w:right w:w="120" w:type="dxa"/>
+              <w:top w:w="30" w:type="dxa"/>
+              <w:bottom w:w="30" w:type="dxa"/>
+              <w:left w:w="60" w:type="dxa"/>
+              <w:right w:w="60" w:type="dxa"/>
             </w:tcMar>
           </w:tcPr>
           <w:p>
             <w:pPr>
-              <w:spacing w:before="80" w:after="80"/>
+              <w:spacing w:before="20" w:after="20"/>
             </w:pPr>
             <w:r/>
             <w:r>
               <w:rPr>
                 <w:rFonts w:ascii="Calibri" w:hAnsi="Calibri"/>
-                <w:sz w:val="20"/>
+                <w:sz w:val="17"/>
               </w:rPr>
               <w:t>11.4</w:t>
             </w:r>
@@ -1680,23 +1689,23 @@
         </w:tc>
         <w:tc>
           <w:tcPr>
-            <w:tcW w:type="dxa" w:w="3120"/>
+            <w:tcW w:type="dxa" w:w="3360"/>
             <w:tcMar>
-              <w:top w:w="80" w:type="dxa"/>
-              <w:bottom w:w="80" w:type="dxa"/>
-              <w:left w:w="120" w:type="dxa"/>
-              <w:right w:w="120" w:type="dxa"/>
+              <w:top w:w="30" w:type="dxa"/>
+              <w:bottom w:w="30" w:type="dxa"/>
+              <w:left w:w="60" w:type="dxa"/>
+              <w:right w:w="60" w:type="dxa"/>
             </w:tcMar>
           </w:tcPr>
           <w:p>
             <w:pPr>
-              <w:spacing w:before="80" w:after="80"/>
+              <w:spacing w:before="20" w:after="20"/>
             </w:pPr>
             <w:r/>
             <w:r>
               <w:rPr>
                 <w:rFonts w:ascii="Calibri" w:hAnsi="Calibri"/>
-                <w:sz w:val="20"/>
+                <w:sz w:val="17"/>
               </w:rPr>
               <w:t>8.7</w:t>
             </w:r>
@@ -1708,21 +1717,21 @@
       <w:pPr>
         <w:pStyle w:val="Heading3"/>
         <w:keepNext/>
-        <w:spacing w:before="200" w:after="40"/>
+        <w:spacing w:before="120" w:after="20"/>
       </w:pPr>
       <w:r>
         <w:rPr>
           <w:rFonts w:ascii="Calibri" w:hAnsi="Calibri"/>
           <w:b/>
           <w:color w:val="555555"/>
-          <w:sz w:val="24"/>
+          <w:sz w:val="22"/>
         </w:rPr>
         <w:t>3.4 RoadSense 3-Module Cross-Validation</w:t>
       </w:r>
     </w:p>
     <w:p>
       <w:pPr>
-        <w:spacing w:after="120" w:line="276" w:lineRule="auto"/>
+        <w:spacing w:after="60" w:line="240" w:lineRule="auto"/>
       </w:pPr>
       <w:r>
         <w:t>The 3-module approach produces broadly consistent rankings (correlation &gt;0.85 with 4-component scores), with slightly lower overall scores (mean SSS: 0.450 vs 0.415). Module-level diagnostics reveal:</w:t>
@@ -1731,7 +1740,7 @@
     <w:p>
       <w:pPr>
         <w:pStyle w:val="ListBullet"/>
-        <w:spacing w:after="60"/>
+        <w:spacing w:after="20"/>
       </w:pPr>
       <w:r/>
       <w:r>
@@ -1747,7 +1756,7 @@
     <w:p>
       <w:pPr>
         <w:pStyle w:val="ListBullet"/>
-        <w:spacing w:after="60"/>
+        <w:spacing w:after="20"/>
       </w:pPr>
       <w:r/>
       <w:r>
@@ -1763,7 +1772,7 @@
     <w:p>
       <w:pPr>
         <w:pStyle w:val="ListBullet"/>
-        <w:spacing w:after="60"/>
+        <w:spacing w:after="20"/>
       </w:pPr>
       <w:r/>
       <w:r>
@@ -1777,22 +1786,25 @@
       </w:r>
     </w:p>
     <w:p>
-      <w:r>
-        <w:br w:type="page"/>
-      </w:r>
+      <w:pPr>
+        <w:spacing w:before="80" w:after="80"/>
+        <w:pBdr>
+          <w:bottom w:val="single" w:sz="6" w:space="1" w:color="CCCCCC"/>
+        </w:pBdr>
+      </w:pPr>
     </w:p>
     <w:p>
       <w:pPr>
         <w:pStyle w:val="Heading2"/>
         <w:keepNext/>
-        <w:spacing w:before="280" w:after="80"/>
+        <w:spacing w:before="160" w:after="40"/>
       </w:pPr>
       <w:r>
         <w:rPr>
           <w:rFonts w:ascii="Calibri" w:hAnsi="Calibri"/>
           <w:b/>
           <w:color w:val="2E5B88"/>
-          <w:sz w:val="28"/>
+          <w:sz w:val="24"/>
         </w:rPr>
         <w:t>4. Policy Recommendations</w:t>
       </w:r>
@@ -1801,21 +1813,21 @@
       <w:pPr>
         <w:pStyle w:val="Heading3"/>
         <w:keepNext/>
-        <w:spacing w:before="200" w:after="40"/>
+        <w:spacing w:before="120" w:after="20"/>
       </w:pPr>
       <w:r>
         <w:rPr>
           <w:rFonts w:ascii="Calibri" w:hAnsi="Calibri"/>
           <w:b/>
           <w:color w:val="555555"/>
-          <w:sz w:val="24"/>
+          <w:sz w:val="22"/>
         </w:rPr>
         <w:t>4.1 Immediate Priorities (Critical Tier — 11,445 km)</w:t>
       </w:r>
     </w:p>
     <w:p>
       <w:pPr>
-        <w:spacing w:after="60"/>
+        <w:spacing w:after="20"/>
         <w:ind w:left="360"/>
       </w:pPr>
       <w:r>
@@ -1833,7 +1845,7 @@
     </w:p>
     <w:p>
       <w:pPr>
-        <w:spacing w:after="60"/>
+        <w:spacing w:after="20"/>
         <w:ind w:left="360"/>
       </w:pPr>
       <w:r>
@@ -1851,7 +1863,7 @@
     </w:p>
     <w:p>
       <w:pPr>
-        <w:spacing w:after="60"/>
+        <w:spacing w:after="20"/>
         <w:ind w:left="360"/>
       </w:pPr>
       <w:r>
@@ -1871,21 +1883,21 @@
       <w:pPr>
         <w:pStyle w:val="Heading3"/>
         <w:keepNext/>
-        <w:spacing w:before="200" w:after="40"/>
+        <w:spacing w:before="120" w:after="20"/>
       </w:pPr>
       <w:r>
         <w:rPr>
           <w:rFonts w:ascii="Calibri" w:hAnsi="Calibri"/>
           <w:b/>
           <w:color w:val="555555"/>
-          <w:sz w:val="24"/>
+          <w:sz w:val="22"/>
         </w:rPr>
         <w:t>4.2 Medium-Term Actions (High Tier — 19,313 km)</w:t>
       </w:r>
     </w:p>
     <w:p>
       <w:pPr>
-        <w:spacing w:after="60"/>
+        <w:spacing w:after="20"/>
         <w:ind w:left="360"/>
       </w:pPr>
       <w:r>
@@ -1903,7 +1915,7 @@
     </w:p>
     <w:p>
       <w:pPr>
-        <w:spacing w:after="60"/>
+        <w:spacing w:after="20"/>
         <w:ind w:left="360"/>
       </w:pPr>
       <w:r>
@@ -1921,7 +1933,7 @@
     </w:p>
     <w:p>
       <w:pPr>
-        <w:spacing w:after="60"/>
+        <w:spacing w:after="20"/>
         <w:ind w:left="360"/>
       </w:pPr>
       <w:r>
@@ -1941,21 +1953,21 @@
       <w:pPr>
         <w:pStyle w:val="Heading3"/>
         <w:keepNext/>
-        <w:spacing w:before="200" w:after="40"/>
+        <w:spacing w:before="120" w:after="20"/>
       </w:pPr>
       <w:r>
         <w:rPr>
           <w:rFonts w:ascii="Calibri" w:hAnsi="Calibri"/>
           <w:b/>
           <w:color w:val="555555"/>
-          <w:sz w:val="24"/>
+          <w:sz w:val="22"/>
         </w:rPr>
         <w:t>4.3 Systemic Reforms</w:t>
       </w:r>
     </w:p>
     <w:p>
       <w:pPr>
-        <w:spacing w:after="60"/>
+        <w:spacing w:after="20"/>
         <w:ind w:left="360"/>
       </w:pPr>
       <w:r>
@@ -1973,7 +1985,7 @@
     </w:p>
     <w:p>
       <w:pPr>
-        <w:spacing w:after="60"/>
+        <w:spacing w:after="20"/>
         <w:ind w:left="360"/>
       </w:pPr>
       <w:r>
@@ -1991,7 +2003,7 @@
     </w:p>
     <w:p>
       <w:pPr>
-        <w:spacing w:after="60"/>
+        <w:spacing w:after="20"/>
         <w:ind w:left="360"/>
       </w:pPr>
       <w:r>
@@ -2008,29 +2020,32 @@
       </w:r>
     </w:p>
     <w:p>
-      <w:r>
-        <w:br w:type="page"/>
-      </w:r>
+      <w:pPr>
+        <w:spacing w:before="80" w:after="80"/>
+        <w:pBdr>
+          <w:bottom w:val="single" w:sz="6" w:space="1" w:color="CCCCCC"/>
+        </w:pBdr>
+      </w:pPr>
     </w:p>
     <w:p>
       <w:pPr>
         <w:pStyle w:val="Heading2"/>
         <w:keepNext/>
-        <w:spacing w:before="280" w:after="80"/>
+        <w:spacing w:before="160" w:after="40"/>
       </w:pPr>
       <w:r>
         <w:rPr>
           <w:rFonts w:ascii="Calibri" w:hAnsi="Calibri"/>
           <w:b/>
           <w:color w:val="2E5B88"/>
-          <w:sz w:val="28"/>
+          <w:sz w:val="24"/>
         </w:rPr>
         <w:t>5. Replication in Data-Scarce Countries</w:t>
       </w:r>
     </w:p>
     <w:p>
       <w:pPr>
-        <w:spacing w:after="120" w:line="276" w:lineRule="auto"/>
+        <w:spacing w:after="60" w:line="240" w:lineRule="auto"/>
       </w:pPr>
       <w:r>
         <w:t>The RoadSense methodology is designed for replication across Asia-Pacific. Key adaptations:</w:t>
@@ -2051,25 +2066,25 @@
         </w:tblBorders>
       </w:tblPr>
       <w:tblGrid>
-        <w:gridCol w:w="3120"/>
-        <w:gridCol w:w="3120"/>
-        <w:gridCol w:w="3120"/>
+        <w:gridCol w:w="3360"/>
+        <w:gridCol w:w="3360"/>
+        <w:gridCol w:w="3360"/>
       </w:tblGrid>
       <w:tr>
         <w:tc>
           <w:tcPr>
-            <w:tcW w:type="dxa" w:w="3120"/>
+            <w:tcW w:type="dxa" w:w="3360"/>
             <w:shd w:fill="1B365D"/>
             <w:tcMar>
-              <w:top w:w="80" w:type="dxa"/>
-              <w:bottom w:w="80" w:type="dxa"/>
-              <w:left w:w="120" w:type="dxa"/>
-              <w:right w:w="120" w:type="dxa"/>
+              <w:top w:w="30" w:type="dxa"/>
+              <w:bottom w:w="30" w:type="dxa"/>
+              <w:left w:w="60" w:type="dxa"/>
+              <w:right w:w="60" w:type="dxa"/>
             </w:tcMar>
           </w:tcPr>
           <w:p>
             <w:pPr>
-              <w:spacing w:before="80" w:after="80"/>
+              <w:spacing w:before="20" w:after="20"/>
             </w:pPr>
             <w:r/>
             <w:r>
@@ -2077,7 +2092,7 @@
                 <w:rFonts w:ascii="Calibri" w:hAnsi="Calibri"/>
                 <w:b/>
                 <w:color w:val="FFFFFF"/>
-                <w:sz w:val="21"/>
+                <w:sz w:val="18"/>
               </w:rPr>
               <w:t>Data Source</w:t>
             </w:r>
@@ -2085,18 +2100,18 @@
         </w:tc>
         <w:tc>
           <w:tcPr>
-            <w:tcW w:type="dxa" w:w="3120"/>
+            <w:tcW w:type="dxa" w:w="3360"/>
             <w:shd w:fill="1B365D"/>
             <w:tcMar>
-              <w:top w:w="80" w:type="dxa"/>
-              <w:bottom w:w="80" w:type="dxa"/>
-              <w:left w:w="120" w:type="dxa"/>
-              <w:right w:w="120" w:type="dxa"/>
+              <w:top w:w="30" w:type="dxa"/>
+              <w:bottom w:w="30" w:type="dxa"/>
+              <w:left w:w="60" w:type="dxa"/>
+              <w:right w:w="60" w:type="dxa"/>
             </w:tcMar>
           </w:tcPr>
           <w:p>
             <w:pPr>
-              <w:spacing w:before="80" w:after="80"/>
+              <w:spacing w:before="20" w:after="20"/>
             </w:pPr>
             <w:r/>
             <w:r>
@@ -2104,7 +2119,7 @@
                 <w:rFonts w:ascii="Calibri" w:hAnsi="Calibri"/>
                 <w:b/>
                 <w:color w:val="FFFFFF"/>
-                <w:sz w:val="21"/>
+                <w:sz w:val="18"/>
               </w:rPr>
               <w:t>If unavailable</w:t>
             </w:r>
@@ -2112,18 +2127,18 @@
         </w:tc>
         <w:tc>
           <w:tcPr>
-            <w:tcW w:type="dxa" w:w="3120"/>
+            <w:tcW w:type="dxa" w:w="3360"/>
             <w:shd w:fill="1B365D"/>
             <w:tcMar>
-              <w:top w:w="80" w:type="dxa"/>
-              <w:bottom w:w="80" w:type="dxa"/>
-              <w:left w:w="120" w:type="dxa"/>
-              <w:right w:w="120" w:type="dxa"/>
+              <w:top w:w="30" w:type="dxa"/>
+              <w:bottom w:w="30" w:type="dxa"/>
+              <w:left w:w="60" w:type="dxa"/>
+              <w:right w:w="60" w:type="dxa"/>
             </w:tcMar>
           </w:tcPr>
           <w:p>
             <w:pPr>
-              <w:spacing w:before="80" w:after="80"/>
+              <w:spacing w:before="20" w:after="20"/>
             </w:pPr>
             <w:r/>
             <w:r>
@@ -2131,7 +2146,7 @@
                 <w:rFonts w:ascii="Calibri" w:hAnsi="Calibri"/>
                 <w:b/>
                 <w:color w:val="FFFFFF"/>
-                <w:sz w:val="21"/>
+                <w:sz w:val="18"/>
               </w:rPr>
               <w:t>Alternative</w:t>
             </w:r>
@@ -2141,24 +2156,24 @@
       <w:tr>
         <w:tc>
           <w:tcPr>
-            <w:tcW w:type="dxa" w:w="3120"/>
+            <w:tcW w:type="dxa" w:w="3360"/>
             <w:shd w:fill="F5F7FA"/>
             <w:tcMar>
-              <w:top w:w="80" w:type="dxa"/>
-              <w:bottom w:w="80" w:type="dxa"/>
-              <w:left w:w="120" w:type="dxa"/>
-              <w:right w:w="120" w:type="dxa"/>
+              <w:top w:w="30" w:type="dxa"/>
+              <w:bottom w:w="30" w:type="dxa"/>
+              <w:left w:w="60" w:type="dxa"/>
+              <w:right w:w="60" w:type="dxa"/>
             </w:tcMar>
           </w:tcPr>
           <w:p>
             <w:pPr>
-              <w:spacing w:before="80" w:after="80"/>
+              <w:spacing w:before="20" w:after="20"/>
             </w:pPr>
             <w:r/>
             <w:r>
               <w:rPr>
                 <w:rFonts w:ascii="Calibri" w:hAnsi="Calibri"/>
-                <w:sz w:val="20"/>
+                <w:sz w:val="17"/>
               </w:rPr>
               <w:t>GPS probe data</w:t>
             </w:r>
@@ -2166,24 +2181,24 @@
         </w:tc>
         <w:tc>
           <w:tcPr>
-            <w:tcW w:type="dxa" w:w="3120"/>
+            <w:tcW w:type="dxa" w:w="3360"/>
             <w:shd w:fill="F5F7FA"/>
             <w:tcMar>
-              <w:top w:w="80" w:type="dxa"/>
-              <w:bottom w:w="80" w:type="dxa"/>
-              <w:left w:w="120" w:type="dxa"/>
-              <w:right w:w="120" w:type="dxa"/>
+              <w:top w:w="30" w:type="dxa"/>
+              <w:bottom w:w="30" w:type="dxa"/>
+              <w:left w:w="60" w:type="dxa"/>
+              <w:right w:w="60" w:type="dxa"/>
             </w:tcMar>
           </w:tcPr>
           <w:p>
             <w:pPr>
-              <w:spacing w:before="80" w:after="80"/>
+              <w:spacing w:before="20" w:after="20"/>
             </w:pPr>
             <w:r/>
             <w:r>
               <w:rPr>
                 <w:rFonts w:ascii="Calibri" w:hAnsi="Calibri"/>
-                <w:sz w:val="20"/>
+                <w:sz w:val="17"/>
               </w:rPr>
               <w:t>Many LMICs lack probe data</w:t>
             </w:r>
@@ -2191,24 +2206,24 @@
         </w:tc>
         <w:tc>
           <w:tcPr>
-            <w:tcW w:type="dxa" w:w="3120"/>
+            <w:tcW w:type="dxa" w:w="3360"/>
             <w:shd w:fill="F5F7FA"/>
             <w:tcMar>
-              <w:top w:w="80" w:type="dxa"/>
-              <w:bottom w:w="80" w:type="dxa"/>
-              <w:left w:w="120" w:type="dxa"/>
-              <w:right w:w="120" w:type="dxa"/>
+              <w:top w:w="30" w:type="dxa"/>
+              <w:bottom w:w="30" w:type="dxa"/>
+              <w:left w:w="60" w:type="dxa"/>
+              <w:right w:w="60" w:type="dxa"/>
             </w:tcMar>
           </w:tcPr>
           <w:p>
             <w:pPr>
-              <w:spacing w:before="80" w:after="80"/>
+              <w:spacing w:before="20" w:after="20"/>
             </w:pPr>
             <w:r/>
             <w:r>
               <w:rPr>
                 <w:rFonts w:ascii="Calibri" w:hAnsi="Calibri"/>
-                <w:sz w:val="20"/>
+                <w:sz w:val="17"/>
               </w:rPr>
               <w:t>Use OSM road classification + design speed as proxy for operating speed</w:t>
             </w:r>
@@ -2218,23 +2233,23 @@
       <w:tr>
         <w:tc>
           <w:tcPr>
-            <w:tcW w:type="dxa" w:w="3120"/>
+            <w:tcW w:type="dxa" w:w="3360"/>
             <w:tcMar>
-              <w:top w:w="80" w:type="dxa"/>
-              <w:bottom w:w="80" w:type="dxa"/>
-              <w:left w:w="120" w:type="dxa"/>
-              <w:right w:w="120" w:type="dxa"/>
+              <w:top w:w="30" w:type="dxa"/>
+              <w:bottom w:w="30" w:type="dxa"/>
+              <w:left w:w="60" w:type="dxa"/>
+              <w:right w:w="60" w:type="dxa"/>
             </w:tcMar>
           </w:tcPr>
           <w:p>
             <w:pPr>
-              <w:spacing w:before="80" w:after="80"/>
+              <w:spacing w:before="20" w:after="20"/>
             </w:pPr>
             <w:r/>
             <w:r>
               <w:rPr>
                 <w:rFonts w:ascii="Calibri" w:hAnsi="Calibri"/>
-                <w:sz w:val="20"/>
+                <w:sz w:val="17"/>
               </w:rPr>
               <w:t>Mapillary imagery</w:t>
             </w:r>
@@ -2242,23 +2257,23 @@
         </w:tc>
         <w:tc>
           <w:tcPr>
-            <w:tcW w:type="dxa" w:w="3120"/>
+            <w:tcW w:type="dxa" w:w="3360"/>
             <w:tcMar>
-              <w:top w:w="80" w:type="dxa"/>
-              <w:bottom w:w="80" w:type="dxa"/>
-              <w:left w:w="120" w:type="dxa"/>
-              <w:right w:w="120" w:type="dxa"/>
+              <w:top w:w="30" w:type="dxa"/>
+              <w:bottom w:w="30" w:type="dxa"/>
+              <w:left w:w="60" w:type="dxa"/>
+              <w:right w:w="60" w:type="dxa"/>
             </w:tcMar>
           </w:tcPr>
           <w:p>
             <w:pPr>
-              <w:spacing w:before="80" w:after="80"/>
+              <w:spacing w:before="20" w:after="20"/>
             </w:pPr>
             <w:r/>
             <w:r>
               <w:rPr>
                 <w:rFonts w:ascii="Calibri" w:hAnsi="Calibri"/>
-                <w:sz w:val="20"/>
+                <w:sz w:val="17"/>
               </w:rPr>
               <w:t>Limited coverage</w:t>
             </w:r>
@@ -2266,23 +2281,23 @@
         </w:tc>
         <w:tc>
           <w:tcPr>
-            <w:tcW w:type="dxa" w:w="3120"/>
+            <w:tcW w:type="dxa" w:w="3360"/>
             <w:tcMar>
-              <w:top w:w="80" w:type="dxa"/>
-              <w:bottom w:w="80" w:type="dxa"/>
-              <w:left w:w="120" w:type="dxa"/>
-              <w:right w:w="120" w:type="dxa"/>
+              <w:top w:w="30" w:type="dxa"/>
+              <w:bottom w:w="30" w:type="dxa"/>
+              <w:left w:w="60" w:type="dxa"/>
+              <w:right w:w="60" w:type="dxa"/>
             </w:tcMar>
           </w:tcPr>
           <w:p>
             <w:pPr>
-              <w:spacing w:before="80" w:after="80"/>
+              <w:spacing w:before="20" w:after="20"/>
             </w:pPr>
             <w:r/>
             <w:r>
               <w:rPr>
                 <w:rFonts w:ascii="Calibri" w:hAnsi="Calibri"/>
-                <w:sz w:val="20"/>
+                <w:sz w:val="17"/>
               </w:rPr>
               <w:t>CLIP zero-shot classification on any available street photos, or skip Module C entirely</w:t>
             </w:r>
@@ -2292,24 +2307,24 @@
       <w:tr>
         <w:tc>
           <w:tcPr>
-            <w:tcW w:type="dxa" w:w="3120"/>
+            <w:tcW w:type="dxa" w:w="3360"/>
             <w:shd w:fill="F5F7FA"/>
             <w:tcMar>
-              <w:top w:w="80" w:type="dxa"/>
-              <w:bottom w:w="80" w:type="dxa"/>
-              <w:left w:w="120" w:type="dxa"/>
-              <w:right w:w="120" w:type="dxa"/>
+              <w:top w:w="30" w:type="dxa"/>
+              <w:bottom w:w="30" w:type="dxa"/>
+              <w:left w:w="60" w:type="dxa"/>
+              <w:right w:w="60" w:type="dxa"/>
             </w:tcMar>
           </w:tcPr>
           <w:p>
             <w:pPr>
-              <w:spacing w:before="80" w:after="80"/>
+              <w:spacing w:before="20" w:after="20"/>
             </w:pPr>
             <w:r/>
             <w:r>
               <w:rPr>
                 <w:rFonts w:ascii="Calibri" w:hAnsi="Calibri"/>
-                <w:sz w:val="20"/>
+                <w:sz w:val="17"/>
               </w:rPr>
               <w:t>Official speed limits</w:t>
             </w:r>
@@ -2317,24 +2332,24 @@
         </w:tc>
         <w:tc>
           <w:tcPr>
-            <w:tcW w:type="dxa" w:w="3120"/>
+            <w:tcW w:type="dxa" w:w="3360"/>
             <w:shd w:fill="F5F7FA"/>
             <w:tcMar>
-              <w:top w:w="80" w:type="dxa"/>
-              <w:bottom w:w="80" w:type="dxa"/>
-              <w:left w:w="120" w:type="dxa"/>
-              <w:right w:w="120" w:type="dxa"/>
+              <w:top w:w="30" w:type="dxa"/>
+              <w:bottom w:w="30" w:type="dxa"/>
+              <w:left w:w="60" w:type="dxa"/>
+              <w:right w:w="60" w:type="dxa"/>
             </w:tcMar>
           </w:tcPr>
           <w:p>
             <w:pPr>
-              <w:spacing w:before="80" w:after="80"/>
+              <w:spacing w:before="20" w:after="20"/>
             </w:pPr>
             <w:r/>
             <w:r>
               <w:rPr>
                 <w:rFonts w:ascii="Calibri" w:hAnsi="Calibri"/>
-                <w:sz w:val="20"/>
+                <w:sz w:val="17"/>
               </w:rPr>
               <w:t>Not digitised</w:t>
             </w:r>
@@ -2342,24 +2357,24 @@
         </w:tc>
         <w:tc>
           <w:tcPr>
-            <w:tcW w:type="dxa" w:w="3120"/>
+            <w:tcW w:type="dxa" w:w="3360"/>
             <w:shd w:fill="F5F7FA"/>
             <w:tcMar>
-              <w:top w:w="80" w:type="dxa"/>
-              <w:bottom w:w="80" w:type="dxa"/>
-              <w:left w:w="120" w:type="dxa"/>
-              <w:right w:w="120" w:type="dxa"/>
+              <w:top w:w="30" w:type="dxa"/>
+              <w:bottom w:w="30" w:type="dxa"/>
+              <w:left w:w="60" w:type="dxa"/>
+              <w:right w:w="60" w:type="dxa"/>
             </w:tcMar>
           </w:tcPr>
           <w:p>
             <w:pPr>
-              <w:spacing w:before="80" w:after="80"/>
+              <w:spacing w:before="20" w:after="20"/>
             </w:pPr>
             <w:r/>
             <w:r>
               <w:rPr>
                 <w:rFonts w:ascii="Calibri" w:hAnsi="Calibri"/>
-                <w:sz w:val="20"/>
+                <w:sz w:val="17"/>
               </w:rPr>
               <w:t>Extract from OSM `maxspeed` tags (available for ~40% of roads in most countries)</w:t>
             </w:r>
@@ -2369,23 +2384,23 @@
       <w:tr>
         <w:tc>
           <w:tcPr>
-            <w:tcW w:type="dxa" w:w="3120"/>
+            <w:tcW w:type="dxa" w:w="3360"/>
             <w:tcMar>
-              <w:top w:w="80" w:type="dxa"/>
-              <w:bottom w:w="80" w:type="dxa"/>
-              <w:left w:w="120" w:type="dxa"/>
-              <w:right w:w="120" w:type="dxa"/>
+              <w:top w:w="30" w:type="dxa"/>
+              <w:bottom w:w="30" w:type="dxa"/>
+              <w:left w:w="60" w:type="dxa"/>
+              <w:right w:w="60" w:type="dxa"/>
             </w:tcMar>
           </w:tcPr>
           <w:p>
             <w:pPr>
-              <w:spacing w:before="80" w:after="80"/>
+              <w:spacing w:before="20" w:after="20"/>
             </w:pPr>
             <w:r/>
             <w:r>
               <w:rPr>
                 <w:rFonts w:ascii="Calibri" w:hAnsi="Calibri"/>
-                <w:sz w:val="20"/>
+                <w:sz w:val="17"/>
               </w:rPr>
               <w:t>Schools / POIs</w:t>
             </w:r>
@@ -2393,23 +2408,23 @@
         </w:tc>
         <w:tc>
           <w:tcPr>
-            <w:tcW w:type="dxa" w:w="3120"/>
+            <w:tcW w:type="dxa" w:w="3360"/>
             <w:tcMar>
-              <w:top w:w="80" w:type="dxa"/>
-              <w:bottom w:w="80" w:type="dxa"/>
-              <w:left w:w="120" w:type="dxa"/>
-              <w:right w:w="120" w:type="dxa"/>
+              <w:top w:w="30" w:type="dxa"/>
+              <w:bottom w:w="30" w:type="dxa"/>
+              <w:left w:w="60" w:type="dxa"/>
+              <w:right w:w="60" w:type="dxa"/>
             </w:tcMar>
           </w:tcPr>
           <w:p>
             <w:pPr>
-              <w:spacing w:before="80" w:after="80"/>
+              <w:spacing w:before="20" w:after="20"/>
             </w:pPr>
             <w:r/>
             <w:r>
               <w:rPr>
                 <w:rFonts w:ascii="Calibri" w:hAnsi="Calibri"/>
-                <w:sz w:val="20"/>
+                <w:sz w:val="17"/>
               </w:rPr>
               <w:t>Always available via OSM</w:t>
             </w:r>
@@ -2417,23 +2432,23 @@
         </w:tc>
         <w:tc>
           <w:tcPr>
-            <w:tcW w:type="dxa" w:w="3120"/>
+            <w:tcW w:type="dxa" w:w="3360"/>
             <w:tcMar>
-              <w:top w:w="80" w:type="dxa"/>
-              <w:bottom w:w="80" w:type="dxa"/>
-              <w:left w:w="120" w:type="dxa"/>
-              <w:right w:w="120" w:type="dxa"/>
+              <w:top w:w="30" w:type="dxa"/>
+              <w:bottom w:w="30" w:type="dxa"/>
+              <w:left w:w="60" w:type="dxa"/>
+              <w:right w:w="60" w:type="dxa"/>
             </w:tcMar>
           </w:tcPr>
           <w:p>
             <w:pPr>
-              <w:spacing w:before="80" w:after="80"/>
+              <w:spacing w:before="20" w:after="20"/>
             </w:pPr>
             <w:r/>
             <w:r>
               <w:rPr>
                 <w:rFonts w:ascii="Calibri" w:hAnsi="Calibri"/>
-                <w:sz w:val="20"/>
+                <w:sz w:val="17"/>
               </w:rPr>
               <w:t>Overpass API provides global coverage at no cost</w:t>
             </w:r>
@@ -2443,24 +2458,24 @@
       <w:tr>
         <w:tc>
           <w:tcPr>
-            <w:tcW w:type="dxa" w:w="3120"/>
+            <w:tcW w:type="dxa" w:w="3360"/>
             <w:shd w:fill="F5F7FA"/>
             <w:tcMar>
-              <w:top w:w="80" w:type="dxa"/>
-              <w:bottom w:w="80" w:type="dxa"/>
-              <w:left w:w="120" w:type="dxa"/>
-              <w:right w:w="120" w:type="dxa"/>
+              <w:top w:w="30" w:type="dxa"/>
+              <w:bottom w:w="30" w:type="dxa"/>
+              <w:left w:w="60" w:type="dxa"/>
+              <w:right w:w="60" w:type="dxa"/>
             </w:tcMar>
           </w:tcPr>
           <w:p>
             <w:pPr>
-              <w:spacing w:before="80" w:after="80"/>
+              <w:spacing w:before="20" w:after="20"/>
             </w:pPr>
             <w:r/>
             <w:r>
               <w:rPr>
                 <w:rFonts w:ascii="Calibri" w:hAnsi="Calibri"/>
-                <w:sz w:val="20"/>
+                <w:sz w:val="17"/>
               </w:rPr>
               <w:t>Traffic volume data</w:t>
             </w:r>
@@ -2468,24 +2483,24 @@
         </w:tc>
         <w:tc>
           <w:tcPr>
-            <w:tcW w:type="dxa" w:w="3120"/>
+            <w:tcW w:type="dxa" w:w="3360"/>
             <w:shd w:fill="F5F7FA"/>
             <w:tcMar>
-              <w:top w:w="80" w:type="dxa"/>
-              <w:bottom w:w="80" w:type="dxa"/>
-              <w:left w:w="120" w:type="dxa"/>
-              <w:right w:w="120" w:type="dxa"/>
+              <w:top w:w="30" w:type="dxa"/>
+              <w:bottom w:w="30" w:type="dxa"/>
+              <w:left w:w="60" w:type="dxa"/>
+              <w:right w:w="60" w:type="dxa"/>
             </w:tcMar>
           </w:tcPr>
           <w:p>
             <w:pPr>
-              <w:spacing w:before="80" w:after="80"/>
+              <w:spacing w:before="20" w:after="20"/>
             </w:pPr>
             <w:r/>
             <w:r>
               <w:rPr>
                 <w:rFonts w:ascii="Calibri" w:hAnsi="Calibri"/>
-                <w:sz w:val="20"/>
+                <w:sz w:val="17"/>
               </w:rPr>
               <w:t>No volume data</w:t>
             </w:r>
@@ -2493,24 +2508,24 @@
         </w:tc>
         <w:tc>
           <w:tcPr>
-            <w:tcW w:type="dxa" w:w="3120"/>
+            <w:tcW w:type="dxa" w:w="3360"/>
             <w:shd w:fill="F5F7FA"/>
             <w:tcMar>
-              <w:top w:w="80" w:type="dxa"/>
-              <w:bottom w:w="80" w:type="dxa"/>
-              <w:left w:w="120" w:type="dxa"/>
-              <w:right w:w="120" w:type="dxa"/>
+              <w:top w:w="30" w:type="dxa"/>
+              <w:bottom w:w="30" w:type="dxa"/>
+              <w:left w:w="60" w:type="dxa"/>
+              <w:right w:w="60" w:type="dxa"/>
             </w:tcMar>
           </w:tcPr>
           <w:p>
             <w:pPr>
-              <w:spacing w:before="80" w:after="80"/>
+              <w:spacing w:before="20" w:after="20"/>
             </w:pPr>
             <w:r/>
             <w:r>
               <w:rPr>
                 <w:rFonts w:ascii="Calibri" w:hAnsi="Calibri"/>
-                <w:sz w:val="20"/>
+                <w:sz w:val="17"/>
               </w:rPr>
               <w:t>Remove Volume component from 4-component score (weight redistributed to other factors)</w:t>
             </w:r>
@@ -2520,7 +2535,7 @@
     </w:tbl>
     <w:p>
       <w:pPr>
-        <w:spacing w:after="120" w:line="276" w:lineRule="auto"/>
+        <w:spacing w:after="60" w:line="240" w:lineRule="auto"/>
       </w:pPr>
       <w:r>
         <w:t>A minimal viable deployment requires only:</w:t>
@@ -2528,7 +2543,7 @@
     </w:p>
     <w:p>
       <w:pPr>
-        <w:spacing w:after="60"/>
+        <w:spacing w:after="20"/>
         <w:ind w:left="360"/>
       </w:pPr>
       <w:r>
@@ -2537,7 +2552,7 @@
     </w:p>
     <w:p>
       <w:pPr>
-        <w:spacing w:after="60"/>
+        <w:spacing w:after="20"/>
         <w:ind w:left="360"/>
       </w:pPr>
       <w:r>
@@ -2546,7 +2561,7 @@
     </w:p>
     <w:p>
       <w:pPr>
-        <w:spacing w:after="60"/>
+        <w:spacing w:after="20"/>
         <w:ind w:left="360"/>
       </w:pPr>
       <w:r>
@@ -2555,7 +2570,7 @@
     </w:p>
     <w:p>
       <w:pPr>
-        <w:spacing w:after="60"/>
+        <w:spacing w:after="20"/>
         <w:ind w:left="360"/>
       </w:pPr>
       <w:r>
@@ -2563,22 +2578,25 @@
       </w:r>
     </w:p>
     <w:p>
-      <w:r>
-        <w:br w:type="page"/>
-      </w:r>
+      <w:pPr>
+        <w:spacing w:before="80" w:after="80"/>
+        <w:pBdr>
+          <w:bottom w:val="single" w:sz="6" w:space="1" w:color="CCCCCC"/>
+        </w:pBdr>
+      </w:pPr>
     </w:p>
     <w:p>
       <w:pPr>
         <w:pStyle w:val="Heading2"/>
         <w:keepNext/>
-        <w:spacing w:before="280" w:after="80"/>
+        <w:spacing w:before="160" w:after="40"/>
       </w:pPr>
       <w:r>
         <w:rPr>
           <w:rFonts w:ascii="Calibri" w:hAnsi="Calibri"/>
           <w:b/>
           <w:color w:val="2E5B88"/>
-          <w:sz w:val="28"/>
+          <w:sz w:val="24"/>
         </w:rPr>
         <w:t>6. Validation &amp; Limitations</w:t>
       </w:r>
@@ -2587,14 +2605,14 @@
       <w:pPr>
         <w:pStyle w:val="Heading3"/>
         <w:keepNext/>
-        <w:spacing w:before="200" w:after="40"/>
+        <w:spacing w:before="120" w:after="20"/>
       </w:pPr>
       <w:r>
         <w:rPr>
           <w:rFonts w:ascii="Calibri" w:hAnsi="Calibri"/>
           <w:b/>
           <w:color w:val="555555"/>
-          <w:sz w:val="24"/>
+          <w:sz w:val="22"/>
         </w:rPr>
         <w:t>Validation</w:t>
       </w:r>
@@ -2602,7 +2620,7 @@
     <w:p>
       <w:pPr>
         <w:pStyle w:val="ListBullet"/>
-        <w:spacing w:after="60"/>
+        <w:spacing w:after="20"/>
       </w:pPr>
       <w:r/>
       <w:r>
@@ -2618,7 +2636,7 @@
     <w:p>
       <w:pPr>
         <w:pStyle w:val="ListBullet"/>
-        <w:spacing w:after="60"/>
+        <w:spacing w:after="20"/>
       </w:pPr>
       <w:r/>
       <w:r>
@@ -2634,7 +2652,7 @@
     <w:p>
       <w:pPr>
         <w:pStyle w:val="ListBullet"/>
-        <w:spacing w:after="60"/>
+        <w:spacing w:after="20"/>
       </w:pPr>
       <w:r/>
       <w:r>
@@ -2651,21 +2669,21 @@
       <w:pPr>
         <w:pStyle w:val="Heading3"/>
         <w:keepNext/>
-        <w:spacing w:before="200" w:after="40"/>
+        <w:spacing w:before="120" w:after="20"/>
       </w:pPr>
       <w:r>
         <w:rPr>
           <w:rFonts w:ascii="Calibri" w:hAnsi="Calibri"/>
           <w:b/>
           <w:color w:val="555555"/>
-          <w:sz w:val="24"/>
+          <w:sz w:val="22"/>
         </w:rPr>
         <w:t>Limitations</w:t>
       </w:r>
     </w:p>
     <w:p>
       <w:pPr>
-        <w:spacing w:after="60"/>
+        <w:spacing w:after="20"/>
         <w:ind w:left="360"/>
       </w:pPr>
       <w:r>
@@ -2683,7 +2701,7 @@
     </w:p>
     <w:p>
       <w:pPr>
-        <w:spacing w:after="60"/>
+        <w:spacing w:after="20"/>
         <w:ind w:left="360"/>
       </w:pPr>
       <w:r>
@@ -2701,7 +2719,7 @@
     </w:p>
     <w:p>
       <w:pPr>
-        <w:spacing w:after="60"/>
+        <w:spacing w:after="20"/>
         <w:ind w:left="360"/>
       </w:pPr>
       <w:r>
@@ -2719,7 +2737,7 @@
     </w:p>
     <w:p>
       <w:pPr>
-        <w:spacing w:after="60"/>
+        <w:spacing w:after="20"/>
         <w:ind w:left="360"/>
       </w:pPr>
       <w:r>
@@ -2736,22 +2754,25 @@
       </w:r>
     </w:p>
     <w:p>
-      <w:r>
-        <w:br w:type="page"/>
-      </w:r>
+      <w:pPr>
+        <w:spacing w:before="80" w:after="80"/>
+        <w:pBdr>
+          <w:bottom w:val="single" w:sz="6" w:space="1" w:color="CCCCCC"/>
+        </w:pBdr>
+      </w:pPr>
     </w:p>
     <w:p>
       <w:pPr>
         <w:pStyle w:val="Heading2"/>
         <w:keepNext/>
-        <w:spacing w:before="280" w:after="80"/>
+        <w:spacing w:before="160" w:after="40"/>
       </w:pPr>
       <w:r>
         <w:rPr>
           <w:rFonts w:ascii="Calibri" w:hAnsi="Calibri"/>
           <w:b/>
           <w:color w:val="2E5B88"/>
-          <w:sz w:val="28"/>
+          <w:sz w:val="24"/>
         </w:rPr>
         <w:t>References</w:t>
       </w:r>
@@ -2759,7 +2780,7 @@
     <w:p>
       <w:pPr>
         <w:pStyle w:val="ListBullet"/>
-        <w:spacing w:after="60"/>
+        <w:spacing w:after="20"/>
       </w:pPr>
       <w:r>
         <w:t>World Health Organization. (2021). *Global Plan for the Decade of Action for Road Safety 2021–2030*. Geneva: WHO.</w:t>
@@ -2768,7 +2789,7 @@
     <w:p>
       <w:pPr>
         <w:pStyle w:val="ListBullet"/>
-        <w:spacing w:after="60"/>
+        <w:spacing w:after="20"/>
       </w:pPr>
       <w:r>
         <w:t>ITF/OECD. (2018). *Speed and Crash Risk*. International Transport Forum Research Report. Paris: OECD Publishing.</w:t>
@@ -2777,7 +2798,7 @@
     <w:p>
       <w:pPr>
         <w:pStyle w:val="ListBullet"/>
-        <w:spacing w:after="60"/>
+        <w:spacing w:after="20"/>
       </w:pPr>
       <w:r>
         <w:t>Asian Development Bank. (2026). *AI for Safer Roads 2026 — Speed and Volume Data for Thailand and Maharashtra*. ADB Challenge Dataset.</w:t>
@@ -2786,7 +2807,7 @@
     <w:p>
       <w:pPr>
         <w:pStyle w:val="ListBullet"/>
-        <w:spacing w:after="60"/>
+        <w:spacing w:after="20"/>
       </w:pPr>
       <w:r>
         <w:t>OpenStreetMap contributors. (2026). Planet dump. https://planet.openstreetmap.org</w:t>
@@ -2795,7 +2816,7 @@
     <w:p>
       <w:pPr>
         <w:pStyle w:val="ListBullet"/>
-        <w:spacing w:after="60"/>
+        <w:spacing w:after="20"/>
       </w:pPr>
       <w:r>
         <w:t>Mapillary. (2026). Mapillary street-level imagery and computer vision detections. https://www.mapillary.com</w:t>
@@ -2803,7 +2824,7 @@
     </w:p>
     <w:sectPr>
       <w:pgSz w:w="12240" w:h="15840"/>
-      <w:pgMar w:top="1440" w:right="1440" w:bottom="1440" w:left="1440" w:header="720" w:footer="720" w:gutter="0"/>
+      <w:pgMar w:top="1080" w:right="1080" w:bottom="1080" w:left="1080" w:header="720" w:footer="720" w:gutter="0"/>
       <w:cols w:space="720"/>
       <w:docGrid w:linePitch="360"/>
     </w:sectPr>
@@ -3177,7 +3198,7 @@
     <w:rPr>
       <w:rFonts w:ascii="Calibri" w:hAnsi="Calibri"/>
       <w:color w:val="333333"/>
-      <w:sz w:val="22"/>
+      <w:sz w:val="20"/>
     </w:rPr>
   </w:style>
   <w:style w:type="paragraph" w:styleId="Header">

</xml_diff>